<commit_message>
docs: add Ding acceleration appendix and benchmark assets
</commit_message>
<xml_diff>
--- a/docs/scientific_appendix/appendix_acceleration_ding.docx
+++ b/docs/scientific_appendix/appendix_acceleration_ding.docx
@@ -46,7 +46,7 @@
         <w:spacing w:after="120" w:line="269" w:lineRule="auto"/>
       </w:pPr>
       <w:r>
-        <w:t>The historical reference attributed to Kevin is commit e9a211ed2eb1af30683a324159a6fcd6e899fc05, dated 21 November 2025. It already includes RHO NMPC with primal warm start, IPOPT with MA57 on Linux, degree-3 Radau collocation, a fatigable Ding model, and force-length, force-velocity, and passive-force relationships. The main configuration is 30 Hz, a two-cycle window, a one-cycle shift, and five requested cycles. These are baseline elements, not later innovations.</w:t>
+        <w:t>The historical reference is the FES hand-cycling formulation described by Co et al. [7]. It already includes RHO NMPC with primal warm start, IPOPT with MA57 on Linux, degree-3 Radau collocation, a fatigable Ding model, and force-length, force-velocity, and passive-force relationships. The main configuration is 30 Hz, a two-cycle window, a one-cycle shift, and five requested cycles. These are baseline elements, not later innovations.</w:t>
       </w:r>
     </w:p>
     <w:p>
@@ -562,7 +562,3639 @@
         <w:spacing w:after="120" w:line="269" w:lineRule="auto"/>
       </w:pPr>
       <w:r>
-        <w:t>6. References</w:t>
+        <w:t>6. Cumulative 30 Hz ablation and frequency campaign</w:t>
+      </w:r>
+    </w:p>
+    <w:p>
+      <w:pPr>
+        <w:spacing w:after="120" w:line="269" w:lineRule="auto"/>
+      </w:pPr>
+      <w:r>
+        <w:t>The following cumulative IPOPT MA57 ablation uses 100 one-cycle RHO windows, reduced dynamic mechanics, Radau IIA degree five, and 30 uniformly spaced stimulations per crank revolution. A result is validated only if every window converges, has primal feasibility below 1e-5, and passes the mechanical audit. Cold construction, compilation, and audit time are excluded from the hot percentiles, which describe cycles 2 to 100.</w:t>
+      </w:r>
+    </w:p>
+    <w:tbl>
+      <w:tblPr>
+        <w:tblStyle w:val="TableGrid"/>
+        <w:tblW w:type="auto" w:w="0"/>
+        <w:jc w:val="center"/>
+        <w:tblLook w:firstColumn="1" w:firstRow="1" w:lastColumn="0" w:lastRow="0" w:noHBand="0" w:noVBand="1" w:val="04A0"/>
+      </w:tblPr>
+      <w:tblGrid>
+        <w:gridCol w:w="1666"/>
+        <w:gridCol w:w="1666"/>
+        <w:gridCol w:w="1666"/>
+        <w:gridCol w:w="1666"/>
+        <w:gridCol w:w="1666"/>
+        <w:gridCol w:w="1666"/>
+      </w:tblGrid>
+      <w:tr>
+        <w:tc>
+          <w:tcPr>
+            <w:tcW w:type="dxa" w:w="1666"/>
+            <w:shd w:fill="1F4E78"/>
+            <w:tcBorders>
+              <w:top w:val="single" w:sz="4" w:color="D9D9D9"/>
+              <w:left w:val="single" w:sz="4" w:color="D9D9D9"/>
+              <w:bottom w:val="single" w:sz="4" w:color="D9D9D9"/>
+              <w:right w:val="single" w:sz="4" w:color="D9D9D9"/>
+              <w:insideH w:val="single" w:sz="4" w:color="D9D9D9"/>
+              <w:insideV w:val="single" w:sz="4" w:color="D9D9D9"/>
+            </w:tcBorders>
+          </w:tcPr>
+          <w:p>
+            <w:r>
+              <w:rPr>
+                <w:b/>
+                <w:color w:val="FFFFFF"/>
+                <w:sz w:val="16"/>
+              </w:rPr>
+              <w:t>Case</w:t>
+            </w:r>
+          </w:p>
+        </w:tc>
+        <w:tc>
+          <w:tcPr>
+            <w:tcW w:type="dxa" w:w="1666"/>
+            <w:shd w:fill="1F4E78"/>
+            <w:tcBorders>
+              <w:top w:val="single" w:sz="4" w:color="D9D9D9"/>
+              <w:left w:val="single" w:sz="4" w:color="D9D9D9"/>
+              <w:bottom w:val="single" w:sz="4" w:color="D9D9D9"/>
+              <w:right w:val="single" w:sz="4" w:color="D9D9D9"/>
+              <w:insideH w:val="single" w:sz="4" w:color="D9D9D9"/>
+              <w:insideV w:val="single" w:sz="4" w:color="D9D9D9"/>
+            </w:tcBorders>
+          </w:tcPr>
+          <w:p>
+            <w:r>
+              <w:rPr>
+                <w:b/>
+                <w:color w:val="FFFFFF"/>
+                <w:sz w:val="16"/>
+              </w:rPr>
+              <w:t>Incremental change</w:t>
+            </w:r>
+          </w:p>
+        </w:tc>
+        <w:tc>
+          <w:tcPr>
+            <w:tcW w:type="dxa" w:w="1666"/>
+            <w:shd w:fill="1F4E78"/>
+            <w:tcBorders>
+              <w:top w:val="single" w:sz="4" w:color="D9D9D9"/>
+              <w:left w:val="single" w:sz="4" w:color="D9D9D9"/>
+              <w:bottom w:val="single" w:sz="4" w:color="D9D9D9"/>
+              <w:right w:val="single" w:sz="4" w:color="D9D9D9"/>
+              <w:insideH w:val="single" w:sz="4" w:color="D9D9D9"/>
+              <w:insideV w:val="single" w:sz="4" w:color="D9D9D9"/>
+            </w:tcBorders>
+          </w:tcPr>
+          <w:p>
+            <w:r>
+              <w:rPr>
+                <w:b/>
+                <w:color w:val="FFFFFF"/>
+                <w:sz w:val="16"/>
+              </w:rPr>
+              <w:t>Validated</w:t>
+            </w:r>
+          </w:p>
+        </w:tc>
+        <w:tc>
+          <w:tcPr>
+            <w:tcW w:type="dxa" w:w="1666"/>
+            <w:shd w:fill="1F4E78"/>
+            <w:tcBorders>
+              <w:top w:val="single" w:sz="4" w:color="D9D9D9"/>
+              <w:left w:val="single" w:sz="4" w:color="D9D9D9"/>
+              <w:bottom w:val="single" w:sz="4" w:color="D9D9D9"/>
+              <w:right w:val="single" w:sz="4" w:color="D9D9D9"/>
+              <w:insideH w:val="single" w:sz="4" w:color="D9D9D9"/>
+              <w:insideV w:val="single" w:sz="4" w:color="D9D9D9"/>
+            </w:tcBorders>
+          </w:tcPr>
+          <w:p>
+            <w:r>
+              <w:rPr>
+                <w:b/>
+                <w:color w:val="FFFFFF"/>
+                <w:sz w:val="16"/>
+              </w:rPr>
+              <w:t>Median s</w:t>
+            </w:r>
+          </w:p>
+        </w:tc>
+        <w:tc>
+          <w:tcPr>
+            <w:tcW w:type="dxa" w:w="1666"/>
+            <w:shd w:fill="1F4E78"/>
+            <w:tcBorders>
+              <w:top w:val="single" w:sz="4" w:color="D9D9D9"/>
+              <w:left w:val="single" w:sz="4" w:color="D9D9D9"/>
+              <w:bottom w:val="single" w:sz="4" w:color="D9D9D9"/>
+              <w:right w:val="single" w:sz="4" w:color="D9D9D9"/>
+              <w:insideH w:val="single" w:sz="4" w:color="D9D9D9"/>
+              <w:insideV w:val="single" w:sz="4" w:color="D9D9D9"/>
+            </w:tcBorders>
+          </w:tcPr>
+          <w:p>
+            <w:r>
+              <w:rPr>
+                <w:b/>
+                <w:color w:val="FFFFFF"/>
+                <w:sz w:val="16"/>
+              </w:rPr>
+              <w:t>P90 s</w:t>
+            </w:r>
+          </w:p>
+        </w:tc>
+        <w:tc>
+          <w:tcPr>
+            <w:tcW w:type="dxa" w:w="1666"/>
+            <w:shd w:fill="1F4E78"/>
+            <w:tcBorders>
+              <w:top w:val="single" w:sz="4" w:color="D9D9D9"/>
+              <w:left w:val="single" w:sz="4" w:color="D9D9D9"/>
+              <w:bottom w:val="single" w:sz="4" w:color="D9D9D9"/>
+              <w:right w:val="single" w:sz="4" w:color="D9D9D9"/>
+              <w:insideH w:val="single" w:sz="4" w:color="D9D9D9"/>
+              <w:insideV w:val="single" w:sz="4" w:color="D9D9D9"/>
+            </w:tcBorders>
+          </w:tcPr>
+          <w:p>
+            <w:r>
+              <w:rPr>
+                <w:b/>
+                <w:color w:val="FFFFFF"/>
+                <w:sz w:val="16"/>
+              </w:rPr>
+              <w:t>Interpretation</w:t>
+            </w:r>
+          </w:p>
+        </w:tc>
+      </w:tr>
+      <w:tr>
+        <w:tc>
+          <w:tcPr>
+            <w:tcW w:type="dxa" w:w="605"/>
+            <w:tcBorders>
+              <w:top w:val="single" w:sz="4" w:color="D9D9D9"/>
+              <w:left w:val="single" w:sz="4" w:color="D9D9D9"/>
+              <w:bottom w:val="single" w:sz="4" w:color="D9D9D9"/>
+              <w:right w:val="single" w:sz="4" w:color="D9D9D9"/>
+              <w:insideH w:val="single" w:sz="4" w:color="D9D9D9"/>
+              <w:insideV w:val="single" w:sz="4" w:color="D9D9D9"/>
+            </w:tcBorders>
+            <w:vAlign w:val="center"/>
+          </w:tcPr>
+          <w:p>
+            <w:pPr>
+              <w:spacing w:after="20" w:line="240" w:lineRule="auto"/>
+            </w:pPr>
+            <w:r>
+              <w:rPr>
+                <w:sz w:val="16"/>
+              </w:rPr>
+              <w:t>K3</w:t>
+            </w:r>
+          </w:p>
+        </w:tc>
+        <w:tc>
+          <w:tcPr>
+            <w:tcW w:type="dxa" w:w="1728"/>
+            <w:tcBorders>
+              <w:top w:val="single" w:sz="4" w:color="D9D9D9"/>
+              <w:left w:val="single" w:sz="4" w:color="D9D9D9"/>
+              <w:bottom w:val="single" w:sz="4" w:color="D9D9D9"/>
+              <w:right w:val="single" w:sz="4" w:color="D9D9D9"/>
+              <w:insideH w:val="single" w:sz="4" w:color="D9D9D9"/>
+              <w:insideV w:val="single" w:sz="4" w:color="D9D9D9"/>
+            </w:tcBorders>
+            <w:vAlign w:val="center"/>
+          </w:tcPr>
+          <w:p>
+            <w:pPr>
+              <w:spacing w:after="20" w:line="240" w:lineRule="auto"/>
+            </w:pPr>
+            <w:r>
+              <w:rPr>
+                <w:sz w:val="16"/>
+              </w:rPr>
+              <w:t>Reduced mechanics</w:t>
+            </w:r>
+          </w:p>
+        </w:tc>
+        <w:tc>
+          <w:tcPr>
+            <w:tcW w:type="dxa" w:w="792"/>
+            <w:tcBorders>
+              <w:top w:val="single" w:sz="4" w:color="D9D9D9"/>
+              <w:left w:val="single" w:sz="4" w:color="D9D9D9"/>
+              <w:bottom w:val="single" w:sz="4" w:color="D9D9D9"/>
+              <w:right w:val="single" w:sz="4" w:color="D9D9D9"/>
+              <w:insideH w:val="single" w:sz="4" w:color="D9D9D9"/>
+              <w:insideV w:val="single" w:sz="4" w:color="D9D9D9"/>
+            </w:tcBorders>
+            <w:vAlign w:val="center"/>
+          </w:tcPr>
+          <w:p>
+            <w:pPr>
+              <w:spacing w:after="20" w:line="240" w:lineRule="auto"/>
+            </w:pPr>
+            <w:r>
+              <w:rPr>
+                <w:sz w:val="16"/>
+              </w:rPr>
+              <w:t>100/100</w:t>
+            </w:r>
+          </w:p>
+        </w:tc>
+        <w:tc>
+          <w:tcPr>
+            <w:tcW w:type="dxa" w:w="749"/>
+            <w:tcBorders>
+              <w:top w:val="single" w:sz="4" w:color="D9D9D9"/>
+              <w:left w:val="single" w:sz="4" w:color="D9D9D9"/>
+              <w:bottom w:val="single" w:sz="4" w:color="D9D9D9"/>
+              <w:right w:val="single" w:sz="4" w:color="D9D9D9"/>
+              <w:insideH w:val="single" w:sz="4" w:color="D9D9D9"/>
+              <w:insideV w:val="single" w:sz="4" w:color="D9D9D9"/>
+            </w:tcBorders>
+            <w:vAlign w:val="center"/>
+          </w:tcPr>
+          <w:p>
+            <w:pPr>
+              <w:spacing w:after="20" w:line="240" w:lineRule="auto"/>
+            </w:pPr>
+            <w:r>
+              <w:rPr>
+                <w:sz w:val="16"/>
+              </w:rPr>
+              <w:t>5.943</w:t>
+            </w:r>
+          </w:p>
+        </w:tc>
+        <w:tc>
+          <w:tcPr>
+            <w:tcW w:type="dxa" w:w="691"/>
+            <w:tcBorders>
+              <w:top w:val="single" w:sz="4" w:color="D9D9D9"/>
+              <w:left w:val="single" w:sz="4" w:color="D9D9D9"/>
+              <w:bottom w:val="single" w:sz="4" w:color="D9D9D9"/>
+              <w:right w:val="single" w:sz="4" w:color="D9D9D9"/>
+              <w:insideH w:val="single" w:sz="4" w:color="D9D9D9"/>
+              <w:insideV w:val="single" w:sz="4" w:color="D9D9D9"/>
+            </w:tcBorders>
+            <w:vAlign w:val="center"/>
+          </w:tcPr>
+          <w:p>
+            <w:pPr>
+              <w:spacing w:after="20" w:line="240" w:lineRule="auto"/>
+            </w:pPr>
+            <w:r>
+              <w:rPr>
+                <w:sz w:val="16"/>
+              </w:rPr>
+              <w:t>6.918</w:t>
+            </w:r>
+          </w:p>
+        </w:tc>
+        <w:tc>
+          <w:tcPr>
+            <w:tcW w:type="dxa" w:w="4104"/>
+            <w:tcBorders>
+              <w:top w:val="single" w:sz="4" w:color="D9D9D9"/>
+              <w:left w:val="single" w:sz="4" w:color="D9D9D9"/>
+              <w:bottom w:val="single" w:sz="4" w:color="D9D9D9"/>
+              <w:right w:val="single" w:sz="4" w:color="D9D9D9"/>
+              <w:insideH w:val="single" w:sz="4" w:color="D9D9D9"/>
+              <w:insideV w:val="single" w:sz="4" w:color="D9D9D9"/>
+            </w:tcBorders>
+            <w:vAlign w:val="center"/>
+          </w:tcPr>
+          <w:p>
+            <w:pPr>
+              <w:spacing w:after="20" w:line="240" w:lineRule="auto"/>
+            </w:pPr>
+            <w:r>
+              <w:rPr>
+                <w:sz w:val="16"/>
+              </w:rPr>
+              <w:t>MX graph remains expensive</w:t>
+            </w:r>
+          </w:p>
+        </w:tc>
+      </w:tr>
+      <w:tr>
+        <w:tc>
+          <w:tcPr>
+            <w:tcW w:type="dxa" w:w="605"/>
+            <w:tcBorders>
+              <w:top w:val="single" w:sz="4" w:color="D9D9D9"/>
+              <w:left w:val="single" w:sz="4" w:color="D9D9D9"/>
+              <w:bottom w:val="single" w:sz="4" w:color="D9D9D9"/>
+              <w:right w:val="single" w:sz="4" w:color="D9D9D9"/>
+              <w:insideH w:val="single" w:sz="4" w:color="D9D9D9"/>
+              <w:insideV w:val="single" w:sz="4" w:color="D9D9D9"/>
+            </w:tcBorders>
+            <w:vAlign w:val="center"/>
+            <w:shd w:fill="EAF2F8"/>
+          </w:tcPr>
+          <w:p>
+            <w:pPr>
+              <w:spacing w:after="20" w:line="240" w:lineRule="auto"/>
+            </w:pPr>
+            <w:r>
+              <w:rPr>
+                <w:sz w:val="16"/>
+              </w:rPr>
+              <w:t>K4</w:t>
+            </w:r>
+          </w:p>
+        </w:tc>
+        <w:tc>
+          <w:tcPr>
+            <w:tcW w:type="dxa" w:w="1728"/>
+            <w:tcBorders>
+              <w:top w:val="single" w:sz="4" w:color="D9D9D9"/>
+              <w:left w:val="single" w:sz="4" w:color="D9D9D9"/>
+              <w:bottom w:val="single" w:sz="4" w:color="D9D9D9"/>
+              <w:right w:val="single" w:sz="4" w:color="D9D9D9"/>
+              <w:insideH w:val="single" w:sz="4" w:color="D9D9D9"/>
+              <w:insideV w:val="single" w:sz="4" w:color="D9D9D9"/>
+            </w:tcBorders>
+            <w:vAlign w:val="center"/>
+            <w:shd w:fill="EAF2F8"/>
+          </w:tcPr>
+          <w:p>
+            <w:pPr>
+              <w:spacing w:after="20" w:line="240" w:lineRule="auto"/>
+            </w:pPr>
+            <w:r>
+              <w:rPr>
+                <w:sz w:val="16"/>
+              </w:rPr>
+              <w:t>Periodic-node calcium</w:t>
+            </w:r>
+          </w:p>
+        </w:tc>
+        <w:tc>
+          <w:tcPr>
+            <w:tcW w:type="dxa" w:w="792"/>
+            <w:tcBorders>
+              <w:top w:val="single" w:sz="4" w:color="D9D9D9"/>
+              <w:left w:val="single" w:sz="4" w:color="D9D9D9"/>
+              <w:bottom w:val="single" w:sz="4" w:color="D9D9D9"/>
+              <w:right w:val="single" w:sz="4" w:color="D9D9D9"/>
+              <w:insideH w:val="single" w:sz="4" w:color="D9D9D9"/>
+              <w:insideV w:val="single" w:sz="4" w:color="D9D9D9"/>
+            </w:tcBorders>
+            <w:vAlign w:val="center"/>
+            <w:shd w:fill="EAF2F8"/>
+          </w:tcPr>
+          <w:p>
+            <w:pPr>
+              <w:spacing w:after="20" w:line="240" w:lineRule="auto"/>
+            </w:pPr>
+            <w:r>
+              <w:rPr>
+                <w:sz w:val="16"/>
+              </w:rPr>
+              <w:t>100/100</w:t>
+            </w:r>
+          </w:p>
+        </w:tc>
+        <w:tc>
+          <w:tcPr>
+            <w:tcW w:type="dxa" w:w="749"/>
+            <w:tcBorders>
+              <w:top w:val="single" w:sz="4" w:color="D9D9D9"/>
+              <w:left w:val="single" w:sz="4" w:color="D9D9D9"/>
+              <w:bottom w:val="single" w:sz="4" w:color="D9D9D9"/>
+              <w:right w:val="single" w:sz="4" w:color="D9D9D9"/>
+              <w:insideH w:val="single" w:sz="4" w:color="D9D9D9"/>
+              <w:insideV w:val="single" w:sz="4" w:color="D9D9D9"/>
+            </w:tcBorders>
+            <w:vAlign w:val="center"/>
+            <w:shd w:fill="EAF2F8"/>
+          </w:tcPr>
+          <w:p>
+            <w:pPr>
+              <w:spacing w:after="20" w:line="240" w:lineRule="auto"/>
+            </w:pPr>
+            <w:r>
+              <w:rPr>
+                <w:sz w:val="16"/>
+              </w:rPr>
+              <w:t>5.740</w:t>
+            </w:r>
+          </w:p>
+        </w:tc>
+        <w:tc>
+          <w:tcPr>
+            <w:tcW w:type="dxa" w:w="691"/>
+            <w:tcBorders>
+              <w:top w:val="single" w:sz="4" w:color="D9D9D9"/>
+              <w:left w:val="single" w:sz="4" w:color="D9D9D9"/>
+              <w:bottom w:val="single" w:sz="4" w:color="D9D9D9"/>
+              <w:right w:val="single" w:sz="4" w:color="D9D9D9"/>
+              <w:insideH w:val="single" w:sz="4" w:color="D9D9D9"/>
+              <w:insideV w:val="single" w:sz="4" w:color="D9D9D9"/>
+            </w:tcBorders>
+            <w:vAlign w:val="center"/>
+            <w:shd w:fill="EAF2F8"/>
+          </w:tcPr>
+          <w:p>
+            <w:pPr>
+              <w:spacing w:after="20" w:line="240" w:lineRule="auto"/>
+            </w:pPr>
+            <w:r>
+              <w:rPr>
+                <w:sz w:val="16"/>
+              </w:rPr>
+              <w:t>6.584</w:t>
+            </w:r>
+          </w:p>
+        </w:tc>
+        <w:tc>
+          <w:tcPr>
+            <w:tcW w:type="dxa" w:w="4104"/>
+            <w:tcBorders>
+              <w:top w:val="single" w:sz="4" w:color="D9D9D9"/>
+              <w:left w:val="single" w:sz="4" w:color="D9D9D9"/>
+              <w:bottom w:val="single" w:sz="4" w:color="D9D9D9"/>
+              <w:right w:val="single" w:sz="4" w:color="D9D9D9"/>
+              <w:insideH w:val="single" w:sz="4" w:color="D9D9D9"/>
+              <w:insideV w:val="single" w:sz="4" w:color="D9D9D9"/>
+            </w:tcBorders>
+            <w:vAlign w:val="center"/>
+            <w:shd w:fill="EAF2F8"/>
+          </w:tcPr>
+          <w:p>
+            <w:pPr>
+              <w:spacing w:after="20" w:line="240" w:lineRule="auto"/>
+            </w:pPr>
+            <w:r>
+              <w:rPr>
+                <w:sz w:val="16"/>
+              </w:rPr>
+              <w:t>Small pre-compilation effect</w:t>
+            </w:r>
+          </w:p>
+        </w:tc>
+      </w:tr>
+      <w:tr>
+        <w:tc>
+          <w:tcPr>
+            <w:tcW w:type="dxa" w:w="605"/>
+            <w:tcBorders>
+              <w:top w:val="single" w:sz="4" w:color="D9D9D9"/>
+              <w:left w:val="single" w:sz="4" w:color="D9D9D9"/>
+              <w:bottom w:val="single" w:sz="4" w:color="D9D9D9"/>
+              <w:right w:val="single" w:sz="4" w:color="D9D9D9"/>
+              <w:insideH w:val="single" w:sz="4" w:color="D9D9D9"/>
+              <w:insideV w:val="single" w:sz="4" w:color="D9D9D9"/>
+            </w:tcBorders>
+            <w:vAlign w:val="center"/>
+          </w:tcPr>
+          <w:p>
+            <w:pPr>
+              <w:spacing w:after="20" w:line="240" w:lineRule="auto"/>
+            </w:pPr>
+            <w:r>
+              <w:rPr>
+                <w:sz w:val="16"/>
+              </w:rPr>
+              <w:t>K5</w:t>
+            </w:r>
+          </w:p>
+        </w:tc>
+        <w:tc>
+          <w:tcPr>
+            <w:tcW w:type="dxa" w:w="1728"/>
+            <w:tcBorders>
+              <w:top w:val="single" w:sz="4" w:color="D9D9D9"/>
+              <w:left w:val="single" w:sz="4" w:color="D9D9D9"/>
+              <w:bottom w:val="single" w:sz="4" w:color="D9D9D9"/>
+              <w:right w:val="single" w:sz="4" w:color="D9D9D9"/>
+              <w:insideH w:val="single" w:sz="4" w:color="D9D9D9"/>
+              <w:insideV w:val="single" w:sz="4" w:color="D9D9D9"/>
+            </w:tcBorders>
+            <w:vAlign w:val="center"/>
+          </w:tcPr>
+          <w:p>
+            <w:pPr>
+              <w:spacing w:after="20" w:line="240" w:lineRule="auto"/>
+            </w:pPr>
+            <w:r>
+              <w:rPr>
+                <w:sz w:val="16"/>
+              </w:rPr>
+              <w:t>SX graph</w:t>
+            </w:r>
+          </w:p>
+        </w:tc>
+        <w:tc>
+          <w:tcPr>
+            <w:tcW w:type="dxa" w:w="792"/>
+            <w:tcBorders>
+              <w:top w:val="single" w:sz="4" w:color="D9D9D9"/>
+              <w:left w:val="single" w:sz="4" w:color="D9D9D9"/>
+              <w:bottom w:val="single" w:sz="4" w:color="D9D9D9"/>
+              <w:right w:val="single" w:sz="4" w:color="D9D9D9"/>
+              <w:insideH w:val="single" w:sz="4" w:color="D9D9D9"/>
+              <w:insideV w:val="single" w:sz="4" w:color="D9D9D9"/>
+            </w:tcBorders>
+            <w:vAlign w:val="center"/>
+          </w:tcPr>
+          <w:p>
+            <w:pPr>
+              <w:spacing w:after="20" w:line="240" w:lineRule="auto"/>
+            </w:pPr>
+            <w:r>
+              <w:rPr>
+                <w:sz w:val="16"/>
+              </w:rPr>
+              <w:t>100/100</w:t>
+            </w:r>
+          </w:p>
+        </w:tc>
+        <w:tc>
+          <w:tcPr>
+            <w:tcW w:type="dxa" w:w="749"/>
+            <w:tcBorders>
+              <w:top w:val="single" w:sz="4" w:color="D9D9D9"/>
+              <w:left w:val="single" w:sz="4" w:color="D9D9D9"/>
+              <w:bottom w:val="single" w:sz="4" w:color="D9D9D9"/>
+              <w:right w:val="single" w:sz="4" w:color="D9D9D9"/>
+              <w:insideH w:val="single" w:sz="4" w:color="D9D9D9"/>
+              <w:insideV w:val="single" w:sz="4" w:color="D9D9D9"/>
+            </w:tcBorders>
+            <w:vAlign w:val="center"/>
+          </w:tcPr>
+          <w:p>
+            <w:pPr>
+              <w:spacing w:after="20" w:line="240" w:lineRule="auto"/>
+            </w:pPr>
+            <w:r>
+              <w:rPr>
+                <w:sz w:val="16"/>
+              </w:rPr>
+              <w:t>0.678</w:t>
+            </w:r>
+          </w:p>
+        </w:tc>
+        <w:tc>
+          <w:tcPr>
+            <w:tcW w:type="dxa" w:w="691"/>
+            <w:tcBorders>
+              <w:top w:val="single" w:sz="4" w:color="D9D9D9"/>
+              <w:left w:val="single" w:sz="4" w:color="D9D9D9"/>
+              <w:bottom w:val="single" w:sz="4" w:color="D9D9D9"/>
+              <w:right w:val="single" w:sz="4" w:color="D9D9D9"/>
+              <w:insideH w:val="single" w:sz="4" w:color="D9D9D9"/>
+              <w:insideV w:val="single" w:sz="4" w:color="D9D9D9"/>
+            </w:tcBorders>
+            <w:vAlign w:val="center"/>
+          </w:tcPr>
+          <w:p>
+            <w:pPr>
+              <w:spacing w:after="20" w:line="240" w:lineRule="auto"/>
+            </w:pPr>
+            <w:r>
+              <w:rPr>
+                <w:sz w:val="16"/>
+              </w:rPr>
+              <w:t>0.798</w:t>
+            </w:r>
+          </w:p>
+        </w:tc>
+        <w:tc>
+          <w:tcPr>
+            <w:tcW w:type="dxa" w:w="4104"/>
+            <w:tcBorders>
+              <w:top w:val="single" w:sz="4" w:color="D9D9D9"/>
+              <w:left w:val="single" w:sz="4" w:color="D9D9D9"/>
+              <w:bottom w:val="single" w:sz="4" w:color="D9D9D9"/>
+              <w:right w:val="single" w:sz="4" w:color="D9D9D9"/>
+              <w:insideH w:val="single" w:sz="4" w:color="D9D9D9"/>
+              <w:insideV w:val="single" w:sz="4" w:color="D9D9D9"/>
+            </w:tcBorders>
+            <w:vAlign w:val="center"/>
+          </w:tcPr>
+          <w:p>
+            <w:pPr>
+              <w:spacing w:after="20" w:line="240" w:lineRule="auto"/>
+            </w:pPr>
+            <w:r>
+              <w:rPr>
+                <w:sz w:val="16"/>
+              </w:rPr>
+              <w:t>Largest observed acceleration</w:t>
+            </w:r>
+          </w:p>
+        </w:tc>
+      </w:tr>
+      <w:tr>
+        <w:tc>
+          <w:tcPr>
+            <w:tcW w:type="dxa" w:w="605"/>
+            <w:tcBorders>
+              <w:top w:val="single" w:sz="4" w:color="D9D9D9"/>
+              <w:left w:val="single" w:sz="4" w:color="D9D9D9"/>
+              <w:bottom w:val="single" w:sz="4" w:color="D9D9D9"/>
+              <w:right w:val="single" w:sz="4" w:color="D9D9D9"/>
+              <w:insideH w:val="single" w:sz="4" w:color="D9D9D9"/>
+              <w:insideV w:val="single" w:sz="4" w:color="D9D9D9"/>
+            </w:tcBorders>
+            <w:vAlign w:val="center"/>
+            <w:shd w:fill="EAF2F8"/>
+          </w:tcPr>
+          <w:p>
+            <w:pPr>
+              <w:spacing w:after="20" w:line="240" w:lineRule="auto"/>
+            </w:pPr>
+            <w:r>
+              <w:rPr>
+                <w:sz w:val="16"/>
+              </w:rPr>
+              <w:t>K6</w:t>
+            </w:r>
+          </w:p>
+        </w:tc>
+        <w:tc>
+          <w:tcPr>
+            <w:tcW w:type="dxa" w:w="1728"/>
+            <w:tcBorders>
+              <w:top w:val="single" w:sz="4" w:color="D9D9D9"/>
+              <w:left w:val="single" w:sz="4" w:color="D9D9D9"/>
+              <w:bottom w:val="single" w:sz="4" w:color="D9D9D9"/>
+              <w:right w:val="single" w:sz="4" w:color="D9D9D9"/>
+              <w:insideH w:val="single" w:sz="4" w:color="D9D9D9"/>
+              <w:insideV w:val="single" w:sz="4" w:color="D9D9D9"/>
+            </w:tcBorders>
+            <w:vAlign w:val="center"/>
+            <w:shd w:fill="EAF2F8"/>
+          </w:tcPr>
+          <w:p>
+            <w:pPr>
+              <w:spacing w:after="20" w:line="240" w:lineRule="auto"/>
+            </w:pPr>
+            <w:r>
+              <w:rPr>
+                <w:sz w:val="16"/>
+              </w:rPr>
+              <w:t>Compiled exact Hessian</w:t>
+            </w:r>
+          </w:p>
+        </w:tc>
+        <w:tc>
+          <w:tcPr>
+            <w:tcW w:type="dxa" w:w="792"/>
+            <w:tcBorders>
+              <w:top w:val="single" w:sz="4" w:color="D9D9D9"/>
+              <w:left w:val="single" w:sz="4" w:color="D9D9D9"/>
+              <w:bottom w:val="single" w:sz="4" w:color="D9D9D9"/>
+              <w:right w:val="single" w:sz="4" w:color="D9D9D9"/>
+              <w:insideH w:val="single" w:sz="4" w:color="D9D9D9"/>
+              <w:insideV w:val="single" w:sz="4" w:color="D9D9D9"/>
+            </w:tcBorders>
+            <w:vAlign w:val="center"/>
+            <w:shd w:fill="EAF2F8"/>
+          </w:tcPr>
+          <w:p>
+            <w:pPr>
+              <w:spacing w:after="20" w:line="240" w:lineRule="auto"/>
+            </w:pPr>
+            <w:r>
+              <w:rPr>
+                <w:sz w:val="16"/>
+              </w:rPr>
+              <w:t>100/100</w:t>
+            </w:r>
+          </w:p>
+        </w:tc>
+        <w:tc>
+          <w:tcPr>
+            <w:tcW w:type="dxa" w:w="749"/>
+            <w:tcBorders>
+              <w:top w:val="single" w:sz="4" w:color="D9D9D9"/>
+              <w:left w:val="single" w:sz="4" w:color="D9D9D9"/>
+              <w:bottom w:val="single" w:sz="4" w:color="D9D9D9"/>
+              <w:right w:val="single" w:sz="4" w:color="D9D9D9"/>
+              <w:insideH w:val="single" w:sz="4" w:color="D9D9D9"/>
+              <w:insideV w:val="single" w:sz="4" w:color="D9D9D9"/>
+            </w:tcBorders>
+            <w:vAlign w:val="center"/>
+            <w:shd w:fill="EAF2F8"/>
+          </w:tcPr>
+          <w:p>
+            <w:pPr>
+              <w:spacing w:after="20" w:line="240" w:lineRule="auto"/>
+            </w:pPr>
+            <w:r>
+              <w:rPr>
+                <w:sz w:val="16"/>
+              </w:rPr>
+              <w:t>0.449</w:t>
+            </w:r>
+          </w:p>
+        </w:tc>
+        <w:tc>
+          <w:tcPr>
+            <w:tcW w:type="dxa" w:w="691"/>
+            <w:tcBorders>
+              <w:top w:val="single" w:sz="4" w:color="D9D9D9"/>
+              <w:left w:val="single" w:sz="4" w:color="D9D9D9"/>
+              <w:bottom w:val="single" w:sz="4" w:color="D9D9D9"/>
+              <w:right w:val="single" w:sz="4" w:color="D9D9D9"/>
+              <w:insideH w:val="single" w:sz="4" w:color="D9D9D9"/>
+              <w:insideV w:val="single" w:sz="4" w:color="D9D9D9"/>
+            </w:tcBorders>
+            <w:vAlign w:val="center"/>
+            <w:shd w:fill="EAF2F8"/>
+          </w:tcPr>
+          <w:p>
+            <w:pPr>
+              <w:spacing w:after="20" w:line="240" w:lineRule="auto"/>
+            </w:pPr>
+            <w:r>
+              <w:rPr>
+                <w:sz w:val="16"/>
+              </w:rPr>
+              <w:t>0.521</w:t>
+            </w:r>
+          </w:p>
+        </w:tc>
+        <w:tc>
+          <w:tcPr>
+            <w:tcW w:type="dxa" w:w="4104"/>
+            <w:tcBorders>
+              <w:top w:val="single" w:sz="4" w:color="D9D9D9"/>
+              <w:left w:val="single" w:sz="4" w:color="D9D9D9"/>
+              <w:bottom w:val="single" w:sz="4" w:color="D9D9D9"/>
+              <w:right w:val="single" w:sz="4" w:color="D9D9D9"/>
+              <w:insideH w:val="single" w:sz="4" w:color="D9D9D9"/>
+              <w:insideV w:val="single" w:sz="4" w:color="D9D9D9"/>
+            </w:tcBorders>
+            <w:vAlign w:val="center"/>
+            <w:shd w:fill="EAF2F8"/>
+          </w:tcPr>
+          <w:p>
+            <w:pPr>
+              <w:spacing w:after="20" w:line="240" w:lineRule="auto"/>
+            </w:pPr>
+            <w:r>
+              <w:rPr>
+                <w:sz w:val="16"/>
+              </w:rPr>
+              <w:t>Fastest valid 30 Hz case</w:t>
+            </w:r>
+          </w:p>
+        </w:tc>
+      </w:tr>
+      <w:tr>
+        <w:tc>
+          <w:tcPr>
+            <w:tcW w:type="dxa" w:w="605"/>
+            <w:tcBorders>
+              <w:top w:val="single" w:sz="4" w:color="D9D9D9"/>
+              <w:left w:val="single" w:sz="4" w:color="D9D9D9"/>
+              <w:bottom w:val="single" w:sz="4" w:color="D9D9D9"/>
+              <w:right w:val="single" w:sz="4" w:color="D9D9D9"/>
+              <w:insideH w:val="single" w:sz="4" w:color="D9D9D9"/>
+              <w:insideV w:val="single" w:sz="4" w:color="D9D9D9"/>
+            </w:tcBorders>
+            <w:vAlign w:val="center"/>
+          </w:tcPr>
+          <w:p>
+            <w:pPr>
+              <w:spacing w:after="20" w:line="240" w:lineRule="auto"/>
+            </w:pPr>
+            <w:r>
+              <w:rPr>
+                <w:sz w:val="16"/>
+              </w:rPr>
+              <w:t>K7</w:t>
+            </w:r>
+          </w:p>
+        </w:tc>
+        <w:tc>
+          <w:tcPr>
+            <w:tcW w:type="dxa" w:w="1728"/>
+            <w:tcBorders>
+              <w:top w:val="single" w:sz="4" w:color="D9D9D9"/>
+              <w:left w:val="single" w:sz="4" w:color="D9D9D9"/>
+              <w:bottom w:val="single" w:sz="4" w:color="D9D9D9"/>
+              <w:right w:val="single" w:sz="4" w:color="D9D9D9"/>
+              <w:insideH w:val="single" w:sz="4" w:color="D9D9D9"/>
+              <w:insideV w:val="single" w:sz="4" w:color="D9D9D9"/>
+            </w:tcBorders>
+            <w:vAlign w:val="center"/>
+          </w:tcPr>
+          <w:p>
+            <w:pPr>
+              <w:spacing w:after="20" w:line="240" w:lineRule="auto"/>
+            </w:pPr>
+            <w:r>
+              <w:rPr>
+                <w:sz w:val="16"/>
+              </w:rPr>
+              <w:t>Compact RHO output</w:t>
+            </w:r>
+          </w:p>
+        </w:tc>
+        <w:tc>
+          <w:tcPr>
+            <w:tcW w:type="dxa" w:w="792"/>
+            <w:tcBorders>
+              <w:top w:val="single" w:sz="4" w:color="D9D9D9"/>
+              <w:left w:val="single" w:sz="4" w:color="D9D9D9"/>
+              <w:bottom w:val="single" w:sz="4" w:color="D9D9D9"/>
+              <w:right w:val="single" w:sz="4" w:color="D9D9D9"/>
+              <w:insideH w:val="single" w:sz="4" w:color="D9D9D9"/>
+              <w:insideV w:val="single" w:sz="4" w:color="D9D9D9"/>
+            </w:tcBorders>
+            <w:vAlign w:val="center"/>
+          </w:tcPr>
+          <w:p>
+            <w:pPr>
+              <w:spacing w:after="20" w:line="240" w:lineRule="auto"/>
+            </w:pPr>
+            <w:r>
+              <w:rPr>
+                <w:sz w:val="16"/>
+              </w:rPr>
+              <w:t>100/100</w:t>
+            </w:r>
+          </w:p>
+        </w:tc>
+        <w:tc>
+          <w:tcPr>
+            <w:tcW w:type="dxa" w:w="749"/>
+            <w:tcBorders>
+              <w:top w:val="single" w:sz="4" w:color="D9D9D9"/>
+              <w:left w:val="single" w:sz="4" w:color="D9D9D9"/>
+              <w:bottom w:val="single" w:sz="4" w:color="D9D9D9"/>
+              <w:right w:val="single" w:sz="4" w:color="D9D9D9"/>
+              <w:insideH w:val="single" w:sz="4" w:color="D9D9D9"/>
+              <w:insideV w:val="single" w:sz="4" w:color="D9D9D9"/>
+            </w:tcBorders>
+            <w:vAlign w:val="center"/>
+          </w:tcPr>
+          <w:p>
+            <w:pPr>
+              <w:spacing w:after="20" w:line="240" w:lineRule="auto"/>
+            </w:pPr>
+            <w:r>
+              <w:rPr>
+                <w:sz w:val="16"/>
+              </w:rPr>
+              <w:t>0.465</w:t>
+            </w:r>
+          </w:p>
+        </w:tc>
+        <w:tc>
+          <w:tcPr>
+            <w:tcW w:type="dxa" w:w="691"/>
+            <w:tcBorders>
+              <w:top w:val="single" w:sz="4" w:color="D9D9D9"/>
+              <w:left w:val="single" w:sz="4" w:color="D9D9D9"/>
+              <w:bottom w:val="single" w:sz="4" w:color="D9D9D9"/>
+              <w:right w:val="single" w:sz="4" w:color="D9D9D9"/>
+              <w:insideH w:val="single" w:sz="4" w:color="D9D9D9"/>
+              <w:insideV w:val="single" w:sz="4" w:color="D9D9D9"/>
+            </w:tcBorders>
+            <w:vAlign w:val="center"/>
+          </w:tcPr>
+          <w:p>
+            <w:pPr>
+              <w:spacing w:after="20" w:line="240" w:lineRule="auto"/>
+            </w:pPr>
+            <w:r>
+              <w:rPr>
+                <w:sz w:val="16"/>
+              </w:rPr>
+              <w:t>0.563</w:t>
+            </w:r>
+          </w:p>
+        </w:tc>
+        <w:tc>
+          <w:tcPr>
+            <w:tcW w:type="dxa" w:w="4104"/>
+            <w:tcBorders>
+              <w:top w:val="single" w:sz="4" w:color="D9D9D9"/>
+              <w:left w:val="single" w:sz="4" w:color="D9D9D9"/>
+              <w:bottom w:val="single" w:sz="4" w:color="D9D9D9"/>
+              <w:right w:val="single" w:sz="4" w:color="D9D9D9"/>
+              <w:insideH w:val="single" w:sz="4" w:color="D9D9D9"/>
+              <w:insideV w:val="single" w:sz="4" w:color="D9D9D9"/>
+            </w:tcBorders>
+            <w:vAlign w:val="center"/>
+          </w:tcPr>
+          <w:p>
+            <w:pPr>
+              <w:spacing w:after="20" w:line="240" w:lineRule="auto"/>
+            </w:pPr>
+            <w:r>
+              <w:rPr>
+                <w:sz w:val="16"/>
+              </w:rPr>
+              <w:t>Small output-retention cost</w:t>
+            </w:r>
+          </w:p>
+        </w:tc>
+      </w:tr>
+      <w:tr>
+        <w:tc>
+          <w:tcPr>
+            <w:tcW w:type="dxa" w:w="605"/>
+            <w:tcBorders>
+              <w:top w:val="single" w:sz="4" w:color="D9D9D9"/>
+              <w:left w:val="single" w:sz="4" w:color="D9D9D9"/>
+              <w:bottom w:val="single" w:sz="4" w:color="D9D9D9"/>
+              <w:right w:val="single" w:sz="4" w:color="D9D9D9"/>
+              <w:insideH w:val="single" w:sz="4" w:color="D9D9D9"/>
+              <w:insideV w:val="single" w:sz="4" w:color="D9D9D9"/>
+            </w:tcBorders>
+            <w:vAlign w:val="center"/>
+            <w:shd w:fill="EAF2F8"/>
+          </w:tcPr>
+          <w:p>
+            <w:pPr>
+              <w:spacing w:after="20" w:line="240" w:lineRule="auto"/>
+            </w:pPr>
+            <w:r>
+              <w:rPr>
+                <w:sz w:val="16"/>
+              </w:rPr>
+              <w:t>K8</w:t>
+            </w:r>
+          </w:p>
+        </w:tc>
+        <w:tc>
+          <w:tcPr>
+            <w:tcW w:type="dxa" w:w="1728"/>
+            <w:tcBorders>
+              <w:top w:val="single" w:sz="4" w:color="D9D9D9"/>
+              <w:left w:val="single" w:sz="4" w:color="D9D9D9"/>
+              <w:bottom w:val="single" w:sz="4" w:color="D9D9D9"/>
+              <w:right w:val="single" w:sz="4" w:color="D9D9D9"/>
+              <w:insideH w:val="single" w:sz="4" w:color="D9D9D9"/>
+              <w:insideV w:val="single" w:sz="4" w:color="D9D9D9"/>
+            </w:tcBorders>
+            <w:vAlign w:val="center"/>
+            <w:shd w:fill="EAF2F8"/>
+          </w:tcPr>
+          <w:p>
+            <w:pPr>
+              <w:spacing w:after="20" w:line="240" w:lineRule="auto"/>
+            </w:pPr>
+            <w:r>
+              <w:rPr>
+                <w:sz w:val="16"/>
+              </w:rPr>
+              <w:t>Hard 100 us delta PW bound</w:t>
+            </w:r>
+          </w:p>
+        </w:tc>
+        <w:tc>
+          <w:tcPr>
+            <w:tcW w:type="dxa" w:w="792"/>
+            <w:tcBorders>
+              <w:top w:val="single" w:sz="4" w:color="D9D9D9"/>
+              <w:left w:val="single" w:sz="4" w:color="D9D9D9"/>
+              <w:bottom w:val="single" w:sz="4" w:color="D9D9D9"/>
+              <w:right w:val="single" w:sz="4" w:color="D9D9D9"/>
+              <w:insideH w:val="single" w:sz="4" w:color="D9D9D9"/>
+              <w:insideV w:val="single" w:sz="4" w:color="D9D9D9"/>
+            </w:tcBorders>
+            <w:vAlign w:val="center"/>
+            <w:shd w:fill="EAF2F8"/>
+          </w:tcPr>
+          <w:p>
+            <w:pPr>
+              <w:spacing w:after="20" w:line="240" w:lineRule="auto"/>
+            </w:pPr>
+            <w:r>
+              <w:rPr>
+                <w:sz w:val="16"/>
+              </w:rPr>
+              <w:t>100/100</w:t>
+            </w:r>
+          </w:p>
+        </w:tc>
+        <w:tc>
+          <w:tcPr>
+            <w:tcW w:type="dxa" w:w="749"/>
+            <w:tcBorders>
+              <w:top w:val="single" w:sz="4" w:color="D9D9D9"/>
+              <w:left w:val="single" w:sz="4" w:color="D9D9D9"/>
+              <w:bottom w:val="single" w:sz="4" w:color="D9D9D9"/>
+              <w:right w:val="single" w:sz="4" w:color="D9D9D9"/>
+              <w:insideH w:val="single" w:sz="4" w:color="D9D9D9"/>
+              <w:insideV w:val="single" w:sz="4" w:color="D9D9D9"/>
+            </w:tcBorders>
+            <w:vAlign w:val="center"/>
+            <w:shd w:fill="EAF2F8"/>
+          </w:tcPr>
+          <w:p>
+            <w:pPr>
+              <w:spacing w:after="20" w:line="240" w:lineRule="auto"/>
+            </w:pPr>
+            <w:r>
+              <w:rPr>
+                <w:sz w:val="16"/>
+              </w:rPr>
+              <w:t>0.920</w:t>
+            </w:r>
+          </w:p>
+        </w:tc>
+        <w:tc>
+          <w:tcPr>
+            <w:tcW w:type="dxa" w:w="691"/>
+            <w:tcBorders>
+              <w:top w:val="single" w:sz="4" w:color="D9D9D9"/>
+              <w:left w:val="single" w:sz="4" w:color="D9D9D9"/>
+              <w:bottom w:val="single" w:sz="4" w:color="D9D9D9"/>
+              <w:right w:val="single" w:sz="4" w:color="D9D9D9"/>
+              <w:insideH w:val="single" w:sz="4" w:color="D9D9D9"/>
+              <w:insideV w:val="single" w:sz="4" w:color="D9D9D9"/>
+            </w:tcBorders>
+            <w:vAlign w:val="center"/>
+            <w:shd w:fill="EAF2F8"/>
+          </w:tcPr>
+          <w:p>
+            <w:pPr>
+              <w:spacing w:after="20" w:line="240" w:lineRule="auto"/>
+            </w:pPr>
+            <w:r>
+              <w:rPr>
+                <w:sz w:val="16"/>
+              </w:rPr>
+              <w:t>1.151</w:t>
+            </w:r>
+          </w:p>
+        </w:tc>
+        <w:tc>
+          <w:tcPr>
+            <w:tcW w:type="dxa" w:w="4104"/>
+            <w:tcBorders>
+              <w:top w:val="single" w:sz="4" w:color="D9D9D9"/>
+              <w:left w:val="single" w:sz="4" w:color="D9D9D9"/>
+              <w:bottom w:val="single" w:sz="4" w:color="D9D9D9"/>
+              <w:right w:val="single" w:sz="4" w:color="D9D9D9"/>
+              <w:insideH w:val="single" w:sz="4" w:color="D9D9D9"/>
+              <w:insideV w:val="single" w:sz="4" w:color="D9D9D9"/>
+            </w:tcBorders>
+            <w:vAlign w:val="center"/>
+            <w:shd w:fill="EAF2F8"/>
+          </w:tcPr>
+          <w:p>
+            <w:pPr>
+              <w:spacing w:after="20" w:line="240" w:lineRule="auto"/>
+            </w:pPr>
+            <w:r>
+              <w:rPr>
+                <w:sz w:val="16"/>
+              </w:rPr>
+              <w:t>Regularity constraint costs time</w:t>
+            </w:r>
+          </w:p>
+        </w:tc>
+      </w:tr>
+      <w:tr>
+        <w:tc>
+          <w:tcPr>
+            <w:tcW w:type="dxa" w:w="605"/>
+            <w:tcBorders>
+              <w:top w:val="single" w:sz="4" w:color="D9D9D9"/>
+              <w:left w:val="single" w:sz="4" w:color="D9D9D9"/>
+              <w:bottom w:val="single" w:sz="4" w:color="D9D9D9"/>
+              <w:right w:val="single" w:sz="4" w:color="D9D9D9"/>
+              <w:insideH w:val="single" w:sz="4" w:color="D9D9D9"/>
+              <w:insideV w:val="single" w:sz="4" w:color="D9D9D9"/>
+            </w:tcBorders>
+            <w:vAlign w:val="center"/>
+          </w:tcPr>
+          <w:p>
+            <w:pPr>
+              <w:spacing w:after="20" w:line="240" w:lineRule="auto"/>
+            </w:pPr>
+            <w:r>
+              <w:rPr>
+                <w:sz w:val="16"/>
+              </w:rPr>
+              <w:t>K9</w:t>
+            </w:r>
+          </w:p>
+        </w:tc>
+        <w:tc>
+          <w:tcPr>
+            <w:tcW w:type="dxa" w:w="1728"/>
+            <w:tcBorders>
+              <w:top w:val="single" w:sz="4" w:color="D9D9D9"/>
+              <w:left w:val="single" w:sz="4" w:color="D9D9D9"/>
+              <w:bottom w:val="single" w:sz="4" w:color="D9D9D9"/>
+              <w:right w:val="single" w:sz="4" w:color="D9D9D9"/>
+              <w:insideH w:val="single" w:sz="4" w:color="D9D9D9"/>
+              <w:insideV w:val="single" w:sz="4" w:color="D9D9D9"/>
+            </w:tcBorders>
+            <w:vAlign w:val="center"/>
+          </w:tcPr>
+          <w:p>
+            <w:pPr>
+              <w:spacing w:after="20" w:line="240" w:lineRule="auto"/>
+            </w:pPr>
+            <w:r>
+              <w:rPr>
+                <w:sz w:val="16"/>
+              </w:rPr>
+              <w:t>Delta PW penalty, weight 0.01</w:t>
+            </w:r>
+          </w:p>
+        </w:tc>
+        <w:tc>
+          <w:tcPr>
+            <w:tcW w:type="dxa" w:w="792"/>
+            <w:tcBorders>
+              <w:top w:val="single" w:sz="4" w:color="D9D9D9"/>
+              <w:left w:val="single" w:sz="4" w:color="D9D9D9"/>
+              <w:bottom w:val="single" w:sz="4" w:color="D9D9D9"/>
+              <w:right w:val="single" w:sz="4" w:color="D9D9D9"/>
+              <w:insideH w:val="single" w:sz="4" w:color="D9D9D9"/>
+              <w:insideV w:val="single" w:sz="4" w:color="D9D9D9"/>
+            </w:tcBorders>
+            <w:vAlign w:val="center"/>
+          </w:tcPr>
+          <w:p>
+            <w:pPr>
+              <w:spacing w:after="20" w:line="240" w:lineRule="auto"/>
+            </w:pPr>
+            <w:r>
+              <w:rPr>
+                <w:sz w:val="16"/>
+              </w:rPr>
+              <w:t>100/100</w:t>
+            </w:r>
+          </w:p>
+        </w:tc>
+        <w:tc>
+          <w:tcPr>
+            <w:tcW w:type="dxa" w:w="749"/>
+            <w:tcBorders>
+              <w:top w:val="single" w:sz="4" w:color="D9D9D9"/>
+              <w:left w:val="single" w:sz="4" w:color="D9D9D9"/>
+              <w:bottom w:val="single" w:sz="4" w:color="D9D9D9"/>
+              <w:right w:val="single" w:sz="4" w:color="D9D9D9"/>
+              <w:insideH w:val="single" w:sz="4" w:color="D9D9D9"/>
+              <w:insideV w:val="single" w:sz="4" w:color="D9D9D9"/>
+            </w:tcBorders>
+            <w:vAlign w:val="center"/>
+          </w:tcPr>
+          <w:p>
+            <w:pPr>
+              <w:spacing w:after="20" w:line="240" w:lineRule="auto"/>
+            </w:pPr>
+            <w:r>
+              <w:rPr>
+                <w:sz w:val="16"/>
+              </w:rPr>
+              <w:t>0.789</w:t>
+            </w:r>
+          </w:p>
+        </w:tc>
+        <w:tc>
+          <w:tcPr>
+            <w:tcW w:type="dxa" w:w="691"/>
+            <w:tcBorders>
+              <w:top w:val="single" w:sz="4" w:color="D9D9D9"/>
+              <w:left w:val="single" w:sz="4" w:color="D9D9D9"/>
+              <w:bottom w:val="single" w:sz="4" w:color="D9D9D9"/>
+              <w:right w:val="single" w:sz="4" w:color="D9D9D9"/>
+              <w:insideH w:val="single" w:sz="4" w:color="D9D9D9"/>
+              <w:insideV w:val="single" w:sz="4" w:color="D9D9D9"/>
+            </w:tcBorders>
+            <w:vAlign w:val="center"/>
+          </w:tcPr>
+          <w:p>
+            <w:pPr>
+              <w:spacing w:after="20" w:line="240" w:lineRule="auto"/>
+            </w:pPr>
+            <w:r>
+              <w:rPr>
+                <w:sz w:val="16"/>
+              </w:rPr>
+              <w:t>0.892</w:t>
+            </w:r>
+          </w:p>
+        </w:tc>
+        <w:tc>
+          <w:tcPr>
+            <w:tcW w:type="dxa" w:w="4104"/>
+            <w:tcBorders>
+              <w:top w:val="single" w:sz="4" w:color="D9D9D9"/>
+              <w:left w:val="single" w:sz="4" w:color="D9D9D9"/>
+              <w:bottom w:val="single" w:sz="4" w:color="D9D9D9"/>
+              <w:right w:val="single" w:sz="4" w:color="D9D9D9"/>
+              <w:insideH w:val="single" w:sz="4" w:color="D9D9D9"/>
+              <w:insideV w:val="single" w:sz="4" w:color="D9D9D9"/>
+            </w:tcBorders>
+            <w:vAlign w:val="center"/>
+          </w:tcPr>
+          <w:p>
+            <w:pPr>
+              <w:spacing w:after="20" w:line="240" w:lineRule="auto"/>
+            </w:pPr>
+            <w:r>
+              <w:rPr>
+                <w:sz w:val="16"/>
+              </w:rPr>
+              <w:t>Best regularized case</w:t>
+            </w:r>
+          </w:p>
+        </w:tc>
+      </w:tr>
+    </w:tbl>
+    <w:p>
+      <w:pPr>
+        <w:spacing w:after="120" w:line="269" w:lineRule="auto"/>
+      </w:pPr>
+      <w:r/>
+    </w:p>
+    <w:p>
+      <w:pPr>
+        <w:spacing w:after="120" w:line="269" w:lineRule="auto"/>
+      </w:pPr>
+      <w:r>
+        <w:t>SX is the largest timing change in this implementation and the compiled Hessian is beneficial after symbolic reduction. Speedup factors must not be multiplied because each row changes the symbolic graph and constrained NLP. K1 and K2 full-mechanics runs solved numerically but failed absolute crank-progress validation; their 29.739 s and 27.562 s medians are not solver comparisons. K0 degree-three Radau was intentionally excluded at 30 Hz by the independent integration gate.</w:t>
+      </w:r>
+    </w:p>
+    <w:p>
+      <w:pPr>
+        <w:pStyle w:val="Heading2"/>
+        <w:spacing w:after="120" w:line="269" w:lineRule="auto"/>
+      </w:pPr>
+      <w:r>
+        <w:t>6.1 Frequency and periodic calcium</w:t>
+      </w:r>
+    </w:p>
+    <w:p>
+      <w:pPr>
+        <w:spacing w:after="120" w:line="269" w:lineRule="auto"/>
+      </w:pPr>
+      <w:r>
+        <w:t>For a one-second cycle with Ns evenly spaced pulses, the periodic-node model uses h = 1/Ns and recomputes decay, post-pulse amplitude, and the periodic calcium fixed point at each frequency.</w:t>
+      </w:r>
+    </w:p>
+    <w:p>
+      <w:pPr>
+        <w:spacing w:after="160"/>
+        <w:jc w:val="center"/>
+      </w:pPr>
+      <w:r>
+        <w:rPr>
+          <w:rFonts w:ascii="Cambria Math" w:hAnsi="Cambria Math"/>
+          <w:sz w:val="21"/>
+        </w:rPr>
+        <w:t>d = exp(−h/τc),     Cn* = d H0(h)(h/τc)/(1−d)</w:t>
+      </w:r>
+    </w:p>
+    <w:p>
+      <w:pPr>
+        <w:spacing w:after="120" w:line="269" w:lineRule="auto"/>
+      </w:pPr>
+      <w:r>
+        <w:t>The frequency runs are therefore fixed-frequency periodic-calcium experiments, not reuses of a 30 Hz calcium trace. They represent the steady periodic regime after warm-up. A true change in frequency requires phase-resampling controls and initialising calcium at the fixed point for the new interval, or explicitly simulating the transition.</w:t>
+      </w:r>
+    </w:p>
+    <w:tbl>
+      <w:tblPr>
+        <w:tblStyle w:val="TableGrid"/>
+        <w:tblW w:type="auto" w:w="0"/>
+        <w:jc w:val="center"/>
+        <w:tblLook w:firstColumn="1" w:firstRow="1" w:lastColumn="0" w:lastRow="0" w:noHBand="0" w:noVBand="1" w:val="04A0"/>
+      </w:tblPr>
+      <w:tblGrid>
+        <w:gridCol w:w="1666"/>
+        <w:gridCol w:w="1666"/>
+        <w:gridCol w:w="1666"/>
+        <w:gridCol w:w="1666"/>
+        <w:gridCol w:w="1666"/>
+        <w:gridCol w:w="1666"/>
+      </w:tblGrid>
+      <w:tr>
+        <w:tc>
+          <w:tcPr>
+            <w:tcW w:type="dxa" w:w="1666"/>
+            <w:shd w:fill="1F4E78"/>
+            <w:tcBorders>
+              <w:top w:val="single" w:sz="4" w:color="D9D9D9"/>
+              <w:left w:val="single" w:sz="4" w:color="D9D9D9"/>
+              <w:bottom w:val="single" w:sz="4" w:color="D9D9D9"/>
+              <w:right w:val="single" w:sz="4" w:color="D9D9D9"/>
+              <w:insideH w:val="single" w:sz="4" w:color="D9D9D9"/>
+              <w:insideV w:val="single" w:sz="4" w:color="D9D9D9"/>
+            </w:tcBorders>
+          </w:tcPr>
+          <w:p>
+            <w:r>
+              <w:rPr>
+                <w:b/>
+                <w:color w:val="FFFFFF"/>
+                <w:sz w:val="16"/>
+              </w:rPr>
+              <w:t>Frequency and case</w:t>
+            </w:r>
+          </w:p>
+        </w:tc>
+        <w:tc>
+          <w:tcPr>
+            <w:tcW w:type="dxa" w:w="1666"/>
+            <w:shd w:fill="1F4E78"/>
+            <w:tcBorders>
+              <w:top w:val="single" w:sz="4" w:color="D9D9D9"/>
+              <w:left w:val="single" w:sz="4" w:color="D9D9D9"/>
+              <w:bottom w:val="single" w:sz="4" w:color="D9D9D9"/>
+              <w:right w:val="single" w:sz="4" w:color="D9D9D9"/>
+              <w:insideH w:val="single" w:sz="4" w:color="D9D9D9"/>
+              <w:insideV w:val="single" w:sz="4" w:color="D9D9D9"/>
+            </w:tcBorders>
+          </w:tcPr>
+          <w:p>
+            <w:r>
+              <w:rPr>
+                <w:b/>
+                <w:color w:val="FFFFFF"/>
+                <w:sz w:val="16"/>
+              </w:rPr>
+              <w:t>Solver</w:t>
+            </w:r>
+          </w:p>
+        </w:tc>
+        <w:tc>
+          <w:tcPr>
+            <w:tcW w:type="dxa" w:w="1666"/>
+            <w:shd w:fill="1F4E78"/>
+            <w:tcBorders>
+              <w:top w:val="single" w:sz="4" w:color="D9D9D9"/>
+              <w:left w:val="single" w:sz="4" w:color="D9D9D9"/>
+              <w:bottom w:val="single" w:sz="4" w:color="D9D9D9"/>
+              <w:right w:val="single" w:sz="4" w:color="D9D9D9"/>
+              <w:insideH w:val="single" w:sz="4" w:color="D9D9D9"/>
+              <w:insideV w:val="single" w:sz="4" w:color="D9D9D9"/>
+            </w:tcBorders>
+          </w:tcPr>
+          <w:p>
+            <w:r>
+              <w:rPr>
+                <w:b/>
+                <w:color w:val="FFFFFF"/>
+                <w:sz w:val="16"/>
+              </w:rPr>
+              <w:t>Validated</w:t>
+            </w:r>
+          </w:p>
+        </w:tc>
+        <w:tc>
+          <w:tcPr>
+            <w:tcW w:type="dxa" w:w="1666"/>
+            <w:shd w:fill="1F4E78"/>
+            <w:tcBorders>
+              <w:top w:val="single" w:sz="4" w:color="D9D9D9"/>
+              <w:left w:val="single" w:sz="4" w:color="D9D9D9"/>
+              <w:bottom w:val="single" w:sz="4" w:color="D9D9D9"/>
+              <w:right w:val="single" w:sz="4" w:color="D9D9D9"/>
+              <w:insideH w:val="single" w:sz="4" w:color="D9D9D9"/>
+              <w:insideV w:val="single" w:sz="4" w:color="D9D9D9"/>
+            </w:tcBorders>
+          </w:tcPr>
+          <w:p>
+            <w:r>
+              <w:rPr>
+                <w:b/>
+                <w:color w:val="FFFFFF"/>
+                <w:sz w:val="16"/>
+              </w:rPr>
+              <w:t>Median s</w:t>
+            </w:r>
+          </w:p>
+        </w:tc>
+        <w:tc>
+          <w:tcPr>
+            <w:tcW w:type="dxa" w:w="1666"/>
+            <w:shd w:fill="1F4E78"/>
+            <w:tcBorders>
+              <w:top w:val="single" w:sz="4" w:color="D9D9D9"/>
+              <w:left w:val="single" w:sz="4" w:color="D9D9D9"/>
+              <w:bottom w:val="single" w:sz="4" w:color="D9D9D9"/>
+              <w:right w:val="single" w:sz="4" w:color="D9D9D9"/>
+              <w:insideH w:val="single" w:sz="4" w:color="D9D9D9"/>
+              <w:insideV w:val="single" w:sz="4" w:color="D9D9D9"/>
+            </w:tcBorders>
+          </w:tcPr>
+          <w:p>
+            <w:r>
+              <w:rPr>
+                <w:b/>
+                <w:color w:val="FFFFFF"/>
+                <w:sz w:val="16"/>
+              </w:rPr>
+              <w:t>P90 s</w:t>
+            </w:r>
+          </w:p>
+        </w:tc>
+        <w:tc>
+          <w:tcPr>
+            <w:tcW w:type="dxa" w:w="1666"/>
+            <w:shd w:fill="1F4E78"/>
+            <w:tcBorders>
+              <w:top w:val="single" w:sz="4" w:color="D9D9D9"/>
+              <w:left w:val="single" w:sz="4" w:color="D9D9D9"/>
+              <w:bottom w:val="single" w:sz="4" w:color="D9D9D9"/>
+              <w:right w:val="single" w:sz="4" w:color="D9D9D9"/>
+              <w:insideH w:val="single" w:sz="4" w:color="D9D9D9"/>
+              <w:insideV w:val="single" w:sz="4" w:color="D9D9D9"/>
+            </w:tcBorders>
+          </w:tcPr>
+          <w:p>
+            <w:r>
+              <w:rPr>
+                <w:b/>
+                <w:color w:val="FFFFFF"/>
+                <w:sz w:val="16"/>
+              </w:rPr>
+              <w:t>Status</w:t>
+            </w:r>
+          </w:p>
+        </w:tc>
+      </w:tr>
+      <w:tr>
+        <w:tc>
+          <w:tcPr>
+            <w:tcW w:type="dxa" w:w="1267"/>
+            <w:tcBorders>
+              <w:top w:val="single" w:sz="4" w:color="D9D9D9"/>
+              <w:left w:val="single" w:sz="4" w:color="D9D9D9"/>
+              <w:bottom w:val="single" w:sz="4" w:color="D9D9D9"/>
+              <w:right w:val="single" w:sz="4" w:color="D9D9D9"/>
+              <w:insideH w:val="single" w:sz="4" w:color="D9D9D9"/>
+              <w:insideV w:val="single" w:sz="4" w:color="D9D9D9"/>
+            </w:tcBorders>
+            <w:vAlign w:val="center"/>
+          </w:tcPr>
+          <w:p>
+            <w:pPr>
+              <w:spacing w:after="20" w:line="240" w:lineRule="auto"/>
+            </w:pPr>
+            <w:r>
+              <w:rPr>
+                <w:sz w:val="16"/>
+              </w:rPr>
+              <w:t>30 Hz K5</w:t>
+            </w:r>
+          </w:p>
+        </w:tc>
+        <w:tc>
+          <w:tcPr>
+            <w:tcW w:type="dxa" w:w="1872"/>
+            <w:tcBorders>
+              <w:top w:val="single" w:sz="4" w:color="D9D9D9"/>
+              <w:left w:val="single" w:sz="4" w:color="D9D9D9"/>
+              <w:bottom w:val="single" w:sz="4" w:color="D9D9D9"/>
+              <w:right w:val="single" w:sz="4" w:color="D9D9D9"/>
+              <w:insideH w:val="single" w:sz="4" w:color="D9D9D9"/>
+              <w:insideV w:val="single" w:sz="4" w:color="D9D9D9"/>
+            </w:tcBorders>
+            <w:vAlign w:val="center"/>
+          </w:tcPr>
+          <w:p>
+            <w:pPr>
+              <w:spacing w:after="20" w:line="240" w:lineRule="auto"/>
+            </w:pPr>
+            <w:r>
+              <w:rPr>
+                <w:sz w:val="16"/>
+              </w:rPr>
+              <w:t>MadNLP 0.10.1 MA57</w:t>
+            </w:r>
+          </w:p>
+        </w:tc>
+        <w:tc>
+          <w:tcPr>
+            <w:tcW w:type="dxa" w:w="792"/>
+            <w:tcBorders>
+              <w:top w:val="single" w:sz="4" w:color="D9D9D9"/>
+              <w:left w:val="single" w:sz="4" w:color="D9D9D9"/>
+              <w:bottom w:val="single" w:sz="4" w:color="D9D9D9"/>
+              <w:right w:val="single" w:sz="4" w:color="D9D9D9"/>
+              <w:insideH w:val="single" w:sz="4" w:color="D9D9D9"/>
+              <w:insideV w:val="single" w:sz="4" w:color="D9D9D9"/>
+            </w:tcBorders>
+            <w:vAlign w:val="center"/>
+          </w:tcPr>
+          <w:p>
+            <w:pPr>
+              <w:spacing w:after="20" w:line="240" w:lineRule="auto"/>
+            </w:pPr>
+            <w:r>
+              <w:rPr>
+                <w:sz w:val="16"/>
+              </w:rPr>
+              <w:t>100/100</w:t>
+            </w:r>
+          </w:p>
+        </w:tc>
+        <w:tc>
+          <w:tcPr>
+            <w:tcW w:type="dxa" w:w="749"/>
+            <w:tcBorders>
+              <w:top w:val="single" w:sz="4" w:color="D9D9D9"/>
+              <w:left w:val="single" w:sz="4" w:color="D9D9D9"/>
+              <w:bottom w:val="single" w:sz="4" w:color="D9D9D9"/>
+              <w:right w:val="single" w:sz="4" w:color="D9D9D9"/>
+              <w:insideH w:val="single" w:sz="4" w:color="D9D9D9"/>
+              <w:insideV w:val="single" w:sz="4" w:color="D9D9D9"/>
+            </w:tcBorders>
+            <w:vAlign w:val="center"/>
+          </w:tcPr>
+          <w:p>
+            <w:pPr>
+              <w:spacing w:after="20" w:line="240" w:lineRule="auto"/>
+            </w:pPr>
+            <w:r>
+              <w:rPr>
+                <w:sz w:val="16"/>
+              </w:rPr>
+              <w:t>0.925</w:t>
+            </w:r>
+          </w:p>
+        </w:tc>
+        <w:tc>
+          <w:tcPr>
+            <w:tcW w:type="dxa" w:w="691"/>
+            <w:tcBorders>
+              <w:top w:val="single" w:sz="4" w:color="D9D9D9"/>
+              <w:left w:val="single" w:sz="4" w:color="D9D9D9"/>
+              <w:bottom w:val="single" w:sz="4" w:color="D9D9D9"/>
+              <w:right w:val="single" w:sz="4" w:color="D9D9D9"/>
+              <w:insideH w:val="single" w:sz="4" w:color="D9D9D9"/>
+              <w:insideV w:val="single" w:sz="4" w:color="D9D9D9"/>
+            </w:tcBorders>
+            <w:vAlign w:val="center"/>
+          </w:tcPr>
+          <w:p>
+            <w:pPr>
+              <w:spacing w:after="20" w:line="240" w:lineRule="auto"/>
+            </w:pPr>
+            <w:r>
+              <w:rPr>
+                <w:sz w:val="16"/>
+              </w:rPr>
+              <w:t>1.193</w:t>
+            </w:r>
+          </w:p>
+        </w:tc>
+        <w:tc>
+          <w:tcPr>
+            <w:tcW w:type="dxa" w:w="3312"/>
+            <w:tcBorders>
+              <w:top w:val="single" w:sz="4" w:color="D9D9D9"/>
+              <w:left w:val="single" w:sz="4" w:color="D9D9D9"/>
+              <w:bottom w:val="single" w:sz="4" w:color="D9D9D9"/>
+              <w:right w:val="single" w:sz="4" w:color="D9D9D9"/>
+              <w:insideH w:val="single" w:sz="4" w:color="D9D9D9"/>
+              <w:insideV w:val="single" w:sz="4" w:color="D9D9D9"/>
+            </w:tcBorders>
+            <w:vAlign w:val="center"/>
+          </w:tcPr>
+          <w:p>
+            <w:pPr>
+              <w:spacing w:after="20" w:line="240" w:lineRule="auto"/>
+            </w:pPr>
+            <w:r>
+              <w:rPr>
+                <w:sz w:val="16"/>
+              </w:rPr>
+              <w:t>Native valid comparator</w:t>
+            </w:r>
+          </w:p>
+        </w:tc>
+      </w:tr>
+      <w:tr>
+        <w:tc>
+          <w:tcPr>
+            <w:tcW w:type="dxa" w:w="1267"/>
+            <w:tcBorders>
+              <w:top w:val="single" w:sz="4" w:color="D9D9D9"/>
+              <w:left w:val="single" w:sz="4" w:color="D9D9D9"/>
+              <w:bottom w:val="single" w:sz="4" w:color="D9D9D9"/>
+              <w:right w:val="single" w:sz="4" w:color="D9D9D9"/>
+              <w:insideH w:val="single" w:sz="4" w:color="D9D9D9"/>
+              <w:insideV w:val="single" w:sz="4" w:color="D9D9D9"/>
+            </w:tcBorders>
+            <w:vAlign w:val="center"/>
+            <w:shd w:fill="EAF2F8"/>
+          </w:tcPr>
+          <w:p>
+            <w:pPr>
+              <w:spacing w:after="20" w:line="240" w:lineRule="auto"/>
+            </w:pPr>
+            <w:r>
+              <w:rPr>
+                <w:sz w:val="16"/>
+              </w:rPr>
+              <w:t>33 Hz K7</w:t>
+            </w:r>
+          </w:p>
+        </w:tc>
+        <w:tc>
+          <w:tcPr>
+            <w:tcW w:type="dxa" w:w="1872"/>
+            <w:tcBorders>
+              <w:top w:val="single" w:sz="4" w:color="D9D9D9"/>
+              <w:left w:val="single" w:sz="4" w:color="D9D9D9"/>
+              <w:bottom w:val="single" w:sz="4" w:color="D9D9D9"/>
+              <w:right w:val="single" w:sz="4" w:color="D9D9D9"/>
+              <w:insideH w:val="single" w:sz="4" w:color="D9D9D9"/>
+              <w:insideV w:val="single" w:sz="4" w:color="D9D9D9"/>
+            </w:tcBorders>
+            <w:vAlign w:val="center"/>
+            <w:shd w:fill="EAF2F8"/>
+          </w:tcPr>
+          <w:p>
+            <w:pPr>
+              <w:spacing w:after="20" w:line="240" w:lineRule="auto"/>
+            </w:pPr>
+            <w:r>
+              <w:rPr>
+                <w:sz w:val="16"/>
+              </w:rPr>
+              <w:t>IPOPT MA57</w:t>
+            </w:r>
+          </w:p>
+        </w:tc>
+        <w:tc>
+          <w:tcPr>
+            <w:tcW w:type="dxa" w:w="792"/>
+            <w:tcBorders>
+              <w:top w:val="single" w:sz="4" w:color="D9D9D9"/>
+              <w:left w:val="single" w:sz="4" w:color="D9D9D9"/>
+              <w:bottom w:val="single" w:sz="4" w:color="D9D9D9"/>
+              <w:right w:val="single" w:sz="4" w:color="D9D9D9"/>
+              <w:insideH w:val="single" w:sz="4" w:color="D9D9D9"/>
+              <w:insideV w:val="single" w:sz="4" w:color="D9D9D9"/>
+            </w:tcBorders>
+            <w:vAlign w:val="center"/>
+            <w:shd w:fill="EAF2F8"/>
+          </w:tcPr>
+          <w:p>
+            <w:pPr>
+              <w:spacing w:after="20" w:line="240" w:lineRule="auto"/>
+            </w:pPr>
+            <w:r>
+              <w:rPr>
+                <w:sz w:val="16"/>
+              </w:rPr>
+              <w:t>100/100</w:t>
+            </w:r>
+          </w:p>
+        </w:tc>
+        <w:tc>
+          <w:tcPr>
+            <w:tcW w:type="dxa" w:w="749"/>
+            <w:tcBorders>
+              <w:top w:val="single" w:sz="4" w:color="D9D9D9"/>
+              <w:left w:val="single" w:sz="4" w:color="D9D9D9"/>
+              <w:bottom w:val="single" w:sz="4" w:color="D9D9D9"/>
+              <w:right w:val="single" w:sz="4" w:color="D9D9D9"/>
+              <w:insideH w:val="single" w:sz="4" w:color="D9D9D9"/>
+              <w:insideV w:val="single" w:sz="4" w:color="D9D9D9"/>
+            </w:tcBorders>
+            <w:vAlign w:val="center"/>
+            <w:shd w:fill="EAF2F8"/>
+          </w:tcPr>
+          <w:p>
+            <w:pPr>
+              <w:spacing w:after="20" w:line="240" w:lineRule="auto"/>
+            </w:pPr>
+            <w:r>
+              <w:rPr>
+                <w:sz w:val="16"/>
+              </w:rPr>
+              <w:t>0.558</w:t>
+            </w:r>
+          </w:p>
+        </w:tc>
+        <w:tc>
+          <w:tcPr>
+            <w:tcW w:type="dxa" w:w="691"/>
+            <w:tcBorders>
+              <w:top w:val="single" w:sz="4" w:color="D9D9D9"/>
+              <w:left w:val="single" w:sz="4" w:color="D9D9D9"/>
+              <w:bottom w:val="single" w:sz="4" w:color="D9D9D9"/>
+              <w:right w:val="single" w:sz="4" w:color="D9D9D9"/>
+              <w:insideH w:val="single" w:sz="4" w:color="D9D9D9"/>
+              <w:insideV w:val="single" w:sz="4" w:color="D9D9D9"/>
+            </w:tcBorders>
+            <w:vAlign w:val="center"/>
+            <w:shd w:fill="EAF2F8"/>
+          </w:tcPr>
+          <w:p>
+            <w:pPr>
+              <w:spacing w:after="20" w:line="240" w:lineRule="auto"/>
+            </w:pPr>
+            <w:r>
+              <w:rPr>
+                <w:sz w:val="16"/>
+              </w:rPr>
+              <w:t>0.681</w:t>
+            </w:r>
+          </w:p>
+        </w:tc>
+        <w:tc>
+          <w:tcPr>
+            <w:tcW w:type="dxa" w:w="3312"/>
+            <w:tcBorders>
+              <w:top w:val="single" w:sz="4" w:color="D9D9D9"/>
+              <w:left w:val="single" w:sz="4" w:color="D9D9D9"/>
+              <w:bottom w:val="single" w:sz="4" w:color="D9D9D9"/>
+              <w:right w:val="single" w:sz="4" w:color="D9D9D9"/>
+              <w:insideH w:val="single" w:sz="4" w:color="D9D9D9"/>
+              <w:insideV w:val="single" w:sz="4" w:color="D9D9D9"/>
+            </w:tcBorders>
+            <w:vAlign w:val="center"/>
+            <w:shd w:fill="EAF2F8"/>
+          </w:tcPr>
+          <w:p>
+            <w:pPr>
+              <w:spacing w:after="20" w:line="240" w:lineRule="auto"/>
+            </w:pPr>
+            <w:r>
+              <w:rPr>
+                <w:sz w:val="16"/>
+              </w:rPr>
+              <w:t>Valid, below one second</w:t>
+            </w:r>
+          </w:p>
+        </w:tc>
+      </w:tr>
+      <w:tr>
+        <w:tc>
+          <w:tcPr>
+            <w:tcW w:type="dxa" w:w="1267"/>
+            <w:tcBorders>
+              <w:top w:val="single" w:sz="4" w:color="D9D9D9"/>
+              <w:left w:val="single" w:sz="4" w:color="D9D9D9"/>
+              <w:bottom w:val="single" w:sz="4" w:color="D9D9D9"/>
+              <w:right w:val="single" w:sz="4" w:color="D9D9D9"/>
+              <w:insideH w:val="single" w:sz="4" w:color="D9D9D9"/>
+              <w:insideV w:val="single" w:sz="4" w:color="D9D9D9"/>
+            </w:tcBorders>
+            <w:vAlign w:val="center"/>
+          </w:tcPr>
+          <w:p>
+            <w:pPr>
+              <w:spacing w:after="20" w:line="240" w:lineRule="auto"/>
+            </w:pPr>
+            <w:r>
+              <w:rPr>
+                <w:sz w:val="16"/>
+              </w:rPr>
+              <w:t>35 Hz K5</w:t>
+            </w:r>
+          </w:p>
+        </w:tc>
+        <w:tc>
+          <w:tcPr>
+            <w:tcW w:type="dxa" w:w="1872"/>
+            <w:tcBorders>
+              <w:top w:val="single" w:sz="4" w:color="D9D9D9"/>
+              <w:left w:val="single" w:sz="4" w:color="D9D9D9"/>
+              <w:bottom w:val="single" w:sz="4" w:color="D9D9D9"/>
+              <w:right w:val="single" w:sz="4" w:color="D9D9D9"/>
+              <w:insideH w:val="single" w:sz="4" w:color="D9D9D9"/>
+              <w:insideV w:val="single" w:sz="4" w:color="D9D9D9"/>
+            </w:tcBorders>
+            <w:vAlign w:val="center"/>
+          </w:tcPr>
+          <w:p>
+            <w:pPr>
+              <w:spacing w:after="20" w:line="240" w:lineRule="auto"/>
+            </w:pPr>
+            <w:r>
+              <w:rPr>
+                <w:sz w:val="16"/>
+              </w:rPr>
+              <w:t>IPOPT MA57</w:t>
+            </w:r>
+          </w:p>
+        </w:tc>
+        <w:tc>
+          <w:tcPr>
+            <w:tcW w:type="dxa" w:w="792"/>
+            <w:tcBorders>
+              <w:top w:val="single" w:sz="4" w:color="D9D9D9"/>
+              <w:left w:val="single" w:sz="4" w:color="D9D9D9"/>
+              <w:bottom w:val="single" w:sz="4" w:color="D9D9D9"/>
+              <w:right w:val="single" w:sz="4" w:color="D9D9D9"/>
+              <w:insideH w:val="single" w:sz="4" w:color="D9D9D9"/>
+              <w:insideV w:val="single" w:sz="4" w:color="D9D9D9"/>
+            </w:tcBorders>
+            <w:vAlign w:val="center"/>
+          </w:tcPr>
+          <w:p>
+            <w:pPr>
+              <w:spacing w:after="20" w:line="240" w:lineRule="auto"/>
+            </w:pPr>
+            <w:r>
+              <w:rPr>
+                <w:sz w:val="16"/>
+              </w:rPr>
+              <w:t>100/100</w:t>
+            </w:r>
+          </w:p>
+        </w:tc>
+        <w:tc>
+          <w:tcPr>
+            <w:tcW w:type="dxa" w:w="749"/>
+            <w:tcBorders>
+              <w:top w:val="single" w:sz="4" w:color="D9D9D9"/>
+              <w:left w:val="single" w:sz="4" w:color="D9D9D9"/>
+              <w:bottom w:val="single" w:sz="4" w:color="D9D9D9"/>
+              <w:right w:val="single" w:sz="4" w:color="D9D9D9"/>
+              <w:insideH w:val="single" w:sz="4" w:color="D9D9D9"/>
+              <w:insideV w:val="single" w:sz="4" w:color="D9D9D9"/>
+            </w:tcBorders>
+            <w:vAlign w:val="center"/>
+          </w:tcPr>
+          <w:p>
+            <w:pPr>
+              <w:spacing w:after="20" w:line="240" w:lineRule="auto"/>
+            </w:pPr>
+            <w:r>
+              <w:rPr>
+                <w:sz w:val="16"/>
+              </w:rPr>
+              <w:t>0.875</w:t>
+            </w:r>
+          </w:p>
+        </w:tc>
+        <w:tc>
+          <w:tcPr>
+            <w:tcW w:type="dxa" w:w="691"/>
+            <w:tcBorders>
+              <w:top w:val="single" w:sz="4" w:color="D9D9D9"/>
+              <w:left w:val="single" w:sz="4" w:color="D9D9D9"/>
+              <w:bottom w:val="single" w:sz="4" w:color="D9D9D9"/>
+              <w:right w:val="single" w:sz="4" w:color="D9D9D9"/>
+              <w:insideH w:val="single" w:sz="4" w:color="D9D9D9"/>
+              <w:insideV w:val="single" w:sz="4" w:color="D9D9D9"/>
+            </w:tcBorders>
+            <w:vAlign w:val="center"/>
+          </w:tcPr>
+          <w:p>
+            <w:pPr>
+              <w:spacing w:after="20" w:line="240" w:lineRule="auto"/>
+            </w:pPr>
+            <w:r>
+              <w:rPr>
+                <w:sz w:val="16"/>
+              </w:rPr>
+              <w:t>1.451</w:t>
+            </w:r>
+          </w:p>
+        </w:tc>
+        <w:tc>
+          <w:tcPr>
+            <w:tcW w:type="dxa" w:w="3312"/>
+            <w:tcBorders>
+              <w:top w:val="single" w:sz="4" w:color="D9D9D9"/>
+              <w:left w:val="single" w:sz="4" w:color="D9D9D9"/>
+              <w:bottom w:val="single" w:sz="4" w:color="D9D9D9"/>
+              <w:right w:val="single" w:sz="4" w:color="D9D9D9"/>
+              <w:insideH w:val="single" w:sz="4" w:color="D9D9D9"/>
+              <w:insideV w:val="single" w:sz="4" w:color="D9D9D9"/>
+            </w:tcBorders>
+            <w:vAlign w:val="center"/>
+          </w:tcPr>
+          <w:p>
+            <w:pPr>
+              <w:spacing w:after="20" w:line="240" w:lineRule="auto"/>
+            </w:pPr>
+            <w:r>
+              <w:rPr>
+                <w:sz w:val="16"/>
+              </w:rPr>
+              <w:t>Valid, tail above one second</w:t>
+            </w:r>
+          </w:p>
+        </w:tc>
+      </w:tr>
+      <w:tr>
+        <w:tc>
+          <w:tcPr>
+            <w:tcW w:type="dxa" w:w="1267"/>
+            <w:tcBorders>
+              <w:top w:val="single" w:sz="4" w:color="D9D9D9"/>
+              <w:left w:val="single" w:sz="4" w:color="D9D9D9"/>
+              <w:bottom w:val="single" w:sz="4" w:color="D9D9D9"/>
+              <w:right w:val="single" w:sz="4" w:color="D9D9D9"/>
+              <w:insideH w:val="single" w:sz="4" w:color="D9D9D9"/>
+              <w:insideV w:val="single" w:sz="4" w:color="D9D9D9"/>
+            </w:tcBorders>
+            <w:vAlign w:val="center"/>
+            <w:shd w:fill="EAF2F8"/>
+          </w:tcPr>
+          <w:p>
+            <w:pPr>
+              <w:spacing w:after="20" w:line="240" w:lineRule="auto"/>
+            </w:pPr>
+            <w:r>
+              <w:rPr>
+                <w:sz w:val="16"/>
+              </w:rPr>
+              <w:t>35 Hz K5</w:t>
+            </w:r>
+          </w:p>
+        </w:tc>
+        <w:tc>
+          <w:tcPr>
+            <w:tcW w:type="dxa" w:w="1872"/>
+            <w:tcBorders>
+              <w:top w:val="single" w:sz="4" w:color="D9D9D9"/>
+              <w:left w:val="single" w:sz="4" w:color="D9D9D9"/>
+              <w:bottom w:val="single" w:sz="4" w:color="D9D9D9"/>
+              <w:right w:val="single" w:sz="4" w:color="D9D9D9"/>
+              <w:insideH w:val="single" w:sz="4" w:color="D9D9D9"/>
+              <w:insideV w:val="single" w:sz="4" w:color="D9D9D9"/>
+            </w:tcBorders>
+            <w:vAlign w:val="center"/>
+            <w:shd w:fill="EAF2F8"/>
+          </w:tcPr>
+          <w:p>
+            <w:pPr>
+              <w:spacing w:after="20" w:line="240" w:lineRule="auto"/>
+            </w:pPr>
+            <w:r>
+              <w:rPr>
+                <w:sz w:val="16"/>
+              </w:rPr>
+              <w:t>MadNLP 0.10.1 MA57</w:t>
+            </w:r>
+          </w:p>
+        </w:tc>
+        <w:tc>
+          <w:tcPr>
+            <w:tcW w:type="dxa" w:w="792"/>
+            <w:tcBorders>
+              <w:top w:val="single" w:sz="4" w:color="D9D9D9"/>
+              <w:left w:val="single" w:sz="4" w:color="D9D9D9"/>
+              <w:bottom w:val="single" w:sz="4" w:color="D9D9D9"/>
+              <w:right w:val="single" w:sz="4" w:color="D9D9D9"/>
+              <w:insideH w:val="single" w:sz="4" w:color="D9D9D9"/>
+              <w:insideV w:val="single" w:sz="4" w:color="D9D9D9"/>
+            </w:tcBorders>
+            <w:vAlign w:val="center"/>
+            <w:shd w:fill="EAF2F8"/>
+          </w:tcPr>
+          <w:p>
+            <w:pPr>
+              <w:spacing w:after="20" w:line="240" w:lineRule="auto"/>
+            </w:pPr>
+            <w:r>
+              <w:rPr>
+                <w:sz w:val="16"/>
+              </w:rPr>
+              <w:t>100/100</w:t>
+            </w:r>
+          </w:p>
+        </w:tc>
+        <w:tc>
+          <w:tcPr>
+            <w:tcW w:type="dxa" w:w="749"/>
+            <w:tcBorders>
+              <w:top w:val="single" w:sz="4" w:color="D9D9D9"/>
+              <w:left w:val="single" w:sz="4" w:color="D9D9D9"/>
+              <w:bottom w:val="single" w:sz="4" w:color="D9D9D9"/>
+              <w:right w:val="single" w:sz="4" w:color="D9D9D9"/>
+              <w:insideH w:val="single" w:sz="4" w:color="D9D9D9"/>
+              <w:insideV w:val="single" w:sz="4" w:color="D9D9D9"/>
+            </w:tcBorders>
+            <w:vAlign w:val="center"/>
+            <w:shd w:fill="EAF2F8"/>
+          </w:tcPr>
+          <w:p>
+            <w:pPr>
+              <w:spacing w:after="20" w:line="240" w:lineRule="auto"/>
+            </w:pPr>
+            <w:r>
+              <w:rPr>
+                <w:sz w:val="16"/>
+              </w:rPr>
+              <w:t>1.148</w:t>
+            </w:r>
+          </w:p>
+        </w:tc>
+        <w:tc>
+          <w:tcPr>
+            <w:tcW w:type="dxa" w:w="691"/>
+            <w:tcBorders>
+              <w:top w:val="single" w:sz="4" w:color="D9D9D9"/>
+              <w:left w:val="single" w:sz="4" w:color="D9D9D9"/>
+              <w:bottom w:val="single" w:sz="4" w:color="D9D9D9"/>
+              <w:right w:val="single" w:sz="4" w:color="D9D9D9"/>
+              <w:insideH w:val="single" w:sz="4" w:color="D9D9D9"/>
+              <w:insideV w:val="single" w:sz="4" w:color="D9D9D9"/>
+            </w:tcBorders>
+            <w:vAlign w:val="center"/>
+            <w:shd w:fill="EAF2F8"/>
+          </w:tcPr>
+          <w:p>
+            <w:pPr>
+              <w:spacing w:after="20" w:line="240" w:lineRule="auto"/>
+            </w:pPr>
+            <w:r>
+              <w:rPr>
+                <w:sz w:val="16"/>
+              </w:rPr>
+              <w:t>1.399</w:t>
+            </w:r>
+          </w:p>
+        </w:tc>
+        <w:tc>
+          <w:tcPr>
+            <w:tcW w:type="dxa" w:w="3312"/>
+            <w:tcBorders>
+              <w:top w:val="single" w:sz="4" w:color="D9D9D9"/>
+              <w:left w:val="single" w:sz="4" w:color="D9D9D9"/>
+              <w:bottom w:val="single" w:sz="4" w:color="D9D9D9"/>
+              <w:right w:val="single" w:sz="4" w:color="D9D9D9"/>
+              <w:insideH w:val="single" w:sz="4" w:color="D9D9D9"/>
+              <w:insideV w:val="single" w:sz="4" w:color="D9D9D9"/>
+            </w:tcBorders>
+            <w:vAlign w:val="center"/>
+            <w:shd w:fill="EAF2F8"/>
+          </w:tcPr>
+          <w:p>
+            <w:pPr>
+              <w:spacing w:after="20" w:line="240" w:lineRule="auto"/>
+            </w:pPr>
+            <w:r>
+              <w:rPr>
+                <w:sz w:val="16"/>
+              </w:rPr>
+              <w:t>Valid, not real-time</w:t>
+            </w:r>
+          </w:p>
+        </w:tc>
+      </w:tr>
+      <w:tr>
+        <w:tc>
+          <w:tcPr>
+            <w:tcW w:type="dxa" w:w="1267"/>
+            <w:tcBorders>
+              <w:top w:val="single" w:sz="4" w:color="D9D9D9"/>
+              <w:left w:val="single" w:sz="4" w:color="D9D9D9"/>
+              <w:bottom w:val="single" w:sz="4" w:color="D9D9D9"/>
+              <w:right w:val="single" w:sz="4" w:color="D9D9D9"/>
+              <w:insideH w:val="single" w:sz="4" w:color="D9D9D9"/>
+              <w:insideV w:val="single" w:sz="4" w:color="D9D9D9"/>
+            </w:tcBorders>
+            <w:vAlign w:val="center"/>
+          </w:tcPr>
+          <w:p>
+            <w:pPr>
+              <w:spacing w:after="20" w:line="240" w:lineRule="auto"/>
+            </w:pPr>
+            <w:r>
+              <w:rPr>
+                <w:sz w:val="16"/>
+              </w:rPr>
+              <w:t>40 Hz K5</w:t>
+            </w:r>
+          </w:p>
+        </w:tc>
+        <w:tc>
+          <w:tcPr>
+            <w:tcW w:type="dxa" w:w="1872"/>
+            <w:tcBorders>
+              <w:top w:val="single" w:sz="4" w:color="D9D9D9"/>
+              <w:left w:val="single" w:sz="4" w:color="D9D9D9"/>
+              <w:bottom w:val="single" w:sz="4" w:color="D9D9D9"/>
+              <w:right w:val="single" w:sz="4" w:color="D9D9D9"/>
+              <w:insideH w:val="single" w:sz="4" w:color="D9D9D9"/>
+              <w:insideV w:val="single" w:sz="4" w:color="D9D9D9"/>
+            </w:tcBorders>
+            <w:vAlign w:val="center"/>
+          </w:tcPr>
+          <w:p>
+            <w:pPr>
+              <w:spacing w:after="20" w:line="240" w:lineRule="auto"/>
+            </w:pPr>
+            <w:r>
+              <w:rPr>
+                <w:sz w:val="16"/>
+              </w:rPr>
+              <w:t>IPOPT MA57</w:t>
+            </w:r>
+          </w:p>
+        </w:tc>
+        <w:tc>
+          <w:tcPr>
+            <w:tcW w:type="dxa" w:w="792"/>
+            <w:tcBorders>
+              <w:top w:val="single" w:sz="4" w:color="D9D9D9"/>
+              <w:left w:val="single" w:sz="4" w:color="D9D9D9"/>
+              <w:bottom w:val="single" w:sz="4" w:color="D9D9D9"/>
+              <w:right w:val="single" w:sz="4" w:color="D9D9D9"/>
+              <w:insideH w:val="single" w:sz="4" w:color="D9D9D9"/>
+              <w:insideV w:val="single" w:sz="4" w:color="D9D9D9"/>
+            </w:tcBorders>
+            <w:vAlign w:val="center"/>
+          </w:tcPr>
+          <w:p>
+            <w:pPr>
+              <w:spacing w:after="20" w:line="240" w:lineRule="auto"/>
+            </w:pPr>
+            <w:r>
+              <w:rPr>
+                <w:sz w:val="16"/>
+              </w:rPr>
+              <w:t>100/100</w:t>
+            </w:r>
+          </w:p>
+        </w:tc>
+        <w:tc>
+          <w:tcPr>
+            <w:tcW w:type="dxa" w:w="749"/>
+            <w:tcBorders>
+              <w:top w:val="single" w:sz="4" w:color="D9D9D9"/>
+              <w:left w:val="single" w:sz="4" w:color="D9D9D9"/>
+              <w:bottom w:val="single" w:sz="4" w:color="D9D9D9"/>
+              <w:right w:val="single" w:sz="4" w:color="D9D9D9"/>
+              <w:insideH w:val="single" w:sz="4" w:color="D9D9D9"/>
+              <w:insideV w:val="single" w:sz="4" w:color="D9D9D9"/>
+            </w:tcBorders>
+            <w:vAlign w:val="center"/>
+          </w:tcPr>
+          <w:p>
+            <w:pPr>
+              <w:spacing w:after="20" w:line="240" w:lineRule="auto"/>
+            </w:pPr>
+            <w:r>
+              <w:rPr>
+                <w:sz w:val="16"/>
+              </w:rPr>
+              <w:t>1.043</w:t>
+            </w:r>
+          </w:p>
+        </w:tc>
+        <w:tc>
+          <w:tcPr>
+            <w:tcW w:type="dxa" w:w="691"/>
+            <w:tcBorders>
+              <w:top w:val="single" w:sz="4" w:color="D9D9D9"/>
+              <w:left w:val="single" w:sz="4" w:color="D9D9D9"/>
+              <w:bottom w:val="single" w:sz="4" w:color="D9D9D9"/>
+              <w:right w:val="single" w:sz="4" w:color="D9D9D9"/>
+              <w:insideH w:val="single" w:sz="4" w:color="D9D9D9"/>
+              <w:insideV w:val="single" w:sz="4" w:color="D9D9D9"/>
+            </w:tcBorders>
+            <w:vAlign w:val="center"/>
+          </w:tcPr>
+          <w:p>
+            <w:pPr>
+              <w:spacing w:after="20" w:line="240" w:lineRule="auto"/>
+            </w:pPr>
+            <w:r>
+              <w:rPr>
+                <w:sz w:val="16"/>
+              </w:rPr>
+              <w:t>1.319</w:t>
+            </w:r>
+          </w:p>
+        </w:tc>
+        <w:tc>
+          <w:tcPr>
+            <w:tcW w:type="dxa" w:w="3312"/>
+            <w:tcBorders>
+              <w:top w:val="single" w:sz="4" w:color="D9D9D9"/>
+              <w:left w:val="single" w:sz="4" w:color="D9D9D9"/>
+              <w:bottom w:val="single" w:sz="4" w:color="D9D9D9"/>
+              <w:right w:val="single" w:sz="4" w:color="D9D9D9"/>
+              <w:insideH w:val="single" w:sz="4" w:color="D9D9D9"/>
+              <w:insideV w:val="single" w:sz="4" w:color="D9D9D9"/>
+            </w:tcBorders>
+            <w:vAlign w:val="center"/>
+          </w:tcPr>
+          <w:p>
+            <w:pPr>
+              <w:spacing w:after="20" w:line="240" w:lineRule="auto"/>
+            </w:pPr>
+            <w:r>
+              <w:rPr>
+                <w:sz w:val="16"/>
+              </w:rPr>
+              <w:t>Valid, median above one second</w:t>
+            </w:r>
+          </w:p>
+        </w:tc>
+      </w:tr>
+      <w:tr>
+        <w:tc>
+          <w:tcPr>
+            <w:tcW w:type="dxa" w:w="1267"/>
+            <w:tcBorders>
+              <w:top w:val="single" w:sz="4" w:color="D9D9D9"/>
+              <w:left w:val="single" w:sz="4" w:color="D9D9D9"/>
+              <w:bottom w:val="single" w:sz="4" w:color="D9D9D9"/>
+              <w:right w:val="single" w:sz="4" w:color="D9D9D9"/>
+              <w:insideH w:val="single" w:sz="4" w:color="D9D9D9"/>
+              <w:insideV w:val="single" w:sz="4" w:color="D9D9D9"/>
+            </w:tcBorders>
+            <w:vAlign w:val="center"/>
+            <w:shd w:fill="EAF2F8"/>
+          </w:tcPr>
+          <w:p>
+            <w:pPr>
+              <w:spacing w:after="20" w:line="240" w:lineRule="auto"/>
+            </w:pPr>
+            <w:r>
+              <w:rPr>
+                <w:sz w:val="16"/>
+              </w:rPr>
+              <w:t>40 Hz K5</w:t>
+            </w:r>
+          </w:p>
+        </w:tc>
+        <w:tc>
+          <w:tcPr>
+            <w:tcW w:type="dxa" w:w="1872"/>
+            <w:tcBorders>
+              <w:top w:val="single" w:sz="4" w:color="D9D9D9"/>
+              <w:left w:val="single" w:sz="4" w:color="D9D9D9"/>
+              <w:bottom w:val="single" w:sz="4" w:color="D9D9D9"/>
+              <w:right w:val="single" w:sz="4" w:color="D9D9D9"/>
+              <w:insideH w:val="single" w:sz="4" w:color="D9D9D9"/>
+              <w:insideV w:val="single" w:sz="4" w:color="D9D9D9"/>
+            </w:tcBorders>
+            <w:vAlign w:val="center"/>
+            <w:shd w:fill="EAF2F8"/>
+          </w:tcPr>
+          <w:p>
+            <w:pPr>
+              <w:spacing w:after="20" w:line="240" w:lineRule="auto"/>
+            </w:pPr>
+            <w:r>
+              <w:rPr>
+                <w:sz w:val="16"/>
+              </w:rPr>
+              <w:t>MadNLP 0.10.1 MA57</w:t>
+            </w:r>
+          </w:p>
+        </w:tc>
+        <w:tc>
+          <w:tcPr>
+            <w:tcW w:type="dxa" w:w="792"/>
+            <w:tcBorders>
+              <w:top w:val="single" w:sz="4" w:color="D9D9D9"/>
+              <w:left w:val="single" w:sz="4" w:color="D9D9D9"/>
+              <w:bottom w:val="single" w:sz="4" w:color="D9D9D9"/>
+              <w:right w:val="single" w:sz="4" w:color="D9D9D9"/>
+              <w:insideH w:val="single" w:sz="4" w:color="D9D9D9"/>
+              <w:insideV w:val="single" w:sz="4" w:color="D9D9D9"/>
+            </w:tcBorders>
+            <w:vAlign w:val="center"/>
+            <w:shd w:fill="EAF2F8"/>
+          </w:tcPr>
+          <w:p>
+            <w:pPr>
+              <w:spacing w:after="20" w:line="240" w:lineRule="auto"/>
+            </w:pPr>
+            <w:r>
+              <w:rPr>
+                <w:sz w:val="16"/>
+              </w:rPr>
+              <w:t>0/100</w:t>
+            </w:r>
+          </w:p>
+        </w:tc>
+        <w:tc>
+          <w:tcPr>
+            <w:tcW w:type="dxa" w:w="749"/>
+            <w:tcBorders>
+              <w:top w:val="single" w:sz="4" w:color="D9D9D9"/>
+              <w:left w:val="single" w:sz="4" w:color="D9D9D9"/>
+              <w:bottom w:val="single" w:sz="4" w:color="D9D9D9"/>
+              <w:right w:val="single" w:sz="4" w:color="D9D9D9"/>
+              <w:insideH w:val="single" w:sz="4" w:color="D9D9D9"/>
+              <w:insideV w:val="single" w:sz="4" w:color="D9D9D9"/>
+            </w:tcBorders>
+            <w:vAlign w:val="center"/>
+            <w:shd w:fill="EAF2F8"/>
+          </w:tcPr>
+          <w:p>
+            <w:pPr>
+              <w:spacing w:after="20" w:line="240" w:lineRule="auto"/>
+            </w:pPr>
+            <w:r>
+              <w:rPr>
+                <w:sz w:val="16"/>
+              </w:rPr>
+              <w:t>--</w:t>
+            </w:r>
+          </w:p>
+        </w:tc>
+        <w:tc>
+          <w:tcPr>
+            <w:tcW w:type="dxa" w:w="691"/>
+            <w:tcBorders>
+              <w:top w:val="single" w:sz="4" w:color="D9D9D9"/>
+              <w:left w:val="single" w:sz="4" w:color="D9D9D9"/>
+              <w:bottom w:val="single" w:sz="4" w:color="D9D9D9"/>
+              <w:right w:val="single" w:sz="4" w:color="D9D9D9"/>
+              <w:insideH w:val="single" w:sz="4" w:color="D9D9D9"/>
+              <w:insideV w:val="single" w:sz="4" w:color="D9D9D9"/>
+            </w:tcBorders>
+            <w:vAlign w:val="center"/>
+            <w:shd w:fill="EAF2F8"/>
+          </w:tcPr>
+          <w:p>
+            <w:pPr>
+              <w:spacing w:after="20" w:line="240" w:lineRule="auto"/>
+            </w:pPr>
+            <w:r>
+              <w:rPr>
+                <w:sz w:val="16"/>
+              </w:rPr>
+              <w:t>--</w:t>
+            </w:r>
+          </w:p>
+        </w:tc>
+        <w:tc>
+          <w:tcPr>
+            <w:tcW w:type="dxa" w:w="3312"/>
+            <w:tcBorders>
+              <w:top w:val="single" w:sz="4" w:color="D9D9D9"/>
+              <w:left w:val="single" w:sz="4" w:color="D9D9D9"/>
+              <w:bottom w:val="single" w:sz="4" w:color="D9D9D9"/>
+              <w:right w:val="single" w:sz="4" w:color="D9D9D9"/>
+              <w:insideH w:val="single" w:sz="4" w:color="D9D9D9"/>
+              <w:insideV w:val="single" w:sz="4" w:color="D9D9D9"/>
+            </w:tcBorders>
+            <w:vAlign w:val="center"/>
+            <w:shd w:fill="EAF2F8"/>
+          </w:tcPr>
+          <w:p>
+            <w:pPr>
+              <w:spacing w:after="20" w:line="240" w:lineRule="auto"/>
+            </w:pPr>
+            <w:r>
+              <w:rPr>
+                <w:sz w:val="16"/>
+              </w:rPr>
+              <w:t>Native continuity failure</w:t>
+            </w:r>
+          </w:p>
+        </w:tc>
+      </w:tr>
+      <w:tr>
+        <w:tc>
+          <w:tcPr>
+            <w:tcW w:type="dxa" w:w="1267"/>
+            <w:tcBorders>
+              <w:top w:val="single" w:sz="4" w:color="D9D9D9"/>
+              <w:left w:val="single" w:sz="4" w:color="D9D9D9"/>
+              <w:bottom w:val="single" w:sz="4" w:color="D9D9D9"/>
+              <w:right w:val="single" w:sz="4" w:color="D9D9D9"/>
+              <w:insideH w:val="single" w:sz="4" w:color="D9D9D9"/>
+              <w:insideV w:val="single" w:sz="4" w:color="D9D9D9"/>
+            </w:tcBorders>
+            <w:vAlign w:val="center"/>
+          </w:tcPr>
+          <w:p>
+            <w:pPr>
+              <w:spacing w:after="20" w:line="240" w:lineRule="auto"/>
+            </w:pPr>
+            <w:r>
+              <w:rPr>
+                <w:sz w:val="16"/>
+              </w:rPr>
+              <w:t>50 Hz K10</w:t>
+            </w:r>
+          </w:p>
+        </w:tc>
+        <w:tc>
+          <w:tcPr>
+            <w:tcW w:type="dxa" w:w="1872"/>
+            <w:tcBorders>
+              <w:top w:val="single" w:sz="4" w:color="D9D9D9"/>
+              <w:left w:val="single" w:sz="4" w:color="D9D9D9"/>
+              <w:bottom w:val="single" w:sz="4" w:color="D9D9D9"/>
+              <w:right w:val="single" w:sz="4" w:color="D9D9D9"/>
+              <w:insideH w:val="single" w:sz="4" w:color="D9D9D9"/>
+              <w:insideV w:val="single" w:sz="4" w:color="D9D9D9"/>
+            </w:tcBorders>
+            <w:vAlign w:val="center"/>
+          </w:tcPr>
+          <w:p>
+            <w:pPr>
+              <w:spacing w:after="20" w:line="240" w:lineRule="auto"/>
+            </w:pPr>
+            <w:r>
+              <w:rPr>
+                <w:sz w:val="16"/>
+              </w:rPr>
+              <w:t>IPOPT MA57</w:t>
+            </w:r>
+          </w:p>
+        </w:tc>
+        <w:tc>
+          <w:tcPr>
+            <w:tcW w:type="dxa" w:w="792"/>
+            <w:tcBorders>
+              <w:top w:val="single" w:sz="4" w:color="D9D9D9"/>
+              <w:left w:val="single" w:sz="4" w:color="D9D9D9"/>
+              <w:bottom w:val="single" w:sz="4" w:color="D9D9D9"/>
+              <w:right w:val="single" w:sz="4" w:color="D9D9D9"/>
+              <w:insideH w:val="single" w:sz="4" w:color="D9D9D9"/>
+              <w:insideV w:val="single" w:sz="4" w:color="D9D9D9"/>
+            </w:tcBorders>
+            <w:vAlign w:val="center"/>
+          </w:tcPr>
+          <w:p>
+            <w:pPr>
+              <w:spacing w:after="20" w:line="240" w:lineRule="auto"/>
+            </w:pPr>
+            <w:r>
+              <w:rPr>
+                <w:sz w:val="16"/>
+              </w:rPr>
+              <w:t>100/100</w:t>
+            </w:r>
+          </w:p>
+        </w:tc>
+        <w:tc>
+          <w:tcPr>
+            <w:tcW w:type="dxa" w:w="749"/>
+            <w:tcBorders>
+              <w:top w:val="single" w:sz="4" w:color="D9D9D9"/>
+              <w:left w:val="single" w:sz="4" w:color="D9D9D9"/>
+              <w:bottom w:val="single" w:sz="4" w:color="D9D9D9"/>
+              <w:right w:val="single" w:sz="4" w:color="D9D9D9"/>
+              <w:insideH w:val="single" w:sz="4" w:color="D9D9D9"/>
+              <w:insideV w:val="single" w:sz="4" w:color="D9D9D9"/>
+            </w:tcBorders>
+            <w:vAlign w:val="center"/>
+          </w:tcPr>
+          <w:p>
+            <w:pPr>
+              <w:spacing w:after="20" w:line="240" w:lineRule="auto"/>
+            </w:pPr>
+            <w:r>
+              <w:rPr>
+                <w:sz w:val="16"/>
+              </w:rPr>
+              <w:t>1.488</w:t>
+            </w:r>
+          </w:p>
+        </w:tc>
+        <w:tc>
+          <w:tcPr>
+            <w:tcW w:type="dxa" w:w="691"/>
+            <w:tcBorders>
+              <w:top w:val="single" w:sz="4" w:color="D9D9D9"/>
+              <w:left w:val="single" w:sz="4" w:color="D9D9D9"/>
+              <w:bottom w:val="single" w:sz="4" w:color="D9D9D9"/>
+              <w:right w:val="single" w:sz="4" w:color="D9D9D9"/>
+              <w:insideH w:val="single" w:sz="4" w:color="D9D9D9"/>
+              <w:insideV w:val="single" w:sz="4" w:color="D9D9D9"/>
+            </w:tcBorders>
+            <w:vAlign w:val="center"/>
+          </w:tcPr>
+          <w:p>
+            <w:pPr>
+              <w:spacing w:after="20" w:line="240" w:lineRule="auto"/>
+            </w:pPr>
+            <w:r>
+              <w:rPr>
+                <w:sz w:val="16"/>
+              </w:rPr>
+              <w:t>1.716</w:t>
+            </w:r>
+          </w:p>
+        </w:tc>
+        <w:tc>
+          <w:tcPr>
+            <w:tcW w:type="dxa" w:w="3312"/>
+            <w:tcBorders>
+              <w:top w:val="single" w:sz="4" w:color="D9D9D9"/>
+              <w:left w:val="single" w:sz="4" w:color="D9D9D9"/>
+              <w:bottom w:val="single" w:sz="4" w:color="D9D9D9"/>
+              <w:right w:val="single" w:sz="4" w:color="D9D9D9"/>
+              <w:insideH w:val="single" w:sz="4" w:color="D9D9D9"/>
+              <w:insideV w:val="single" w:sz="4" w:color="D9D9D9"/>
+            </w:tcBorders>
+            <w:vAlign w:val="center"/>
+          </w:tcPr>
+          <w:p>
+            <w:pPr>
+              <w:spacing w:after="20" w:line="240" w:lineRule="auto"/>
+            </w:pPr>
+            <w:r>
+              <w:rPr>
+                <w:sz w:val="16"/>
+              </w:rPr>
+              <w:t>Robustness point, not real-time</w:t>
+            </w:r>
+          </w:p>
+        </w:tc>
+      </w:tr>
+    </w:tbl>
+    <w:p>
+      <w:pPr>
+        <w:spacing w:after="120" w:line="269" w:lineRule="auto"/>
+      </w:pPr>
+      <w:r/>
+    </w:p>
+    <w:p>
+      <w:pPr>
+        <w:spacing w:after="120" w:line="269" w:lineRule="auto"/>
+      </w:pPr>
+      <w:r>
+        <w:t>The 33 Hz K7 result is the conservative high-frequency reference: it passes the mechanical audit and remains below one second at P90. The 50 Hz K10 result is robust but outside a one-second control budget. The original IPOPT MUMPS protocol did not produce a native valid 100-cycle trajectory, so no MA57 versus MUMPS speed ratio is reported. Acados remains diagnostic because of a between-node velocity excursion. Its local Ding map checks are near machine precision, but its 76-cycle stopping point does not support a 100-cycle performance claim.</w:t>
+      </w:r>
+    </w:p>
+    <w:p>
+      <w:pPr>
+        <w:pStyle w:val="Heading2"/>
+        <w:spacing w:after="120" w:line="269" w:lineRule="auto"/>
+      </w:pPr>
+      <w:r>
+        <w:t>6.2 Decision efficient validation policy</w:t>
+      </w:r>
+    </w:p>
+    <w:p>
+      <w:pPr>
+        <w:spacing w:after="120" w:line="269" w:lineRule="auto"/>
+      </w:pPr>
+      <w:r>
+        <w:t>Rather than test every solver, frequency, and graph option, use IPOPT MA57 as the certified frequency reference. Advance frequency only after feasibility passes. Test an independent solver at 30 Hz, at the last IPOPT point whose P90 is below one second, and at the first point beyond this threshold. Test MUMPS only as an IPOPT linear-solver A/B, and retain Acados only after common DOP853 replay passes. Final comparisons must report DOP853 objective, speed excursion, phase or work error, and pulse-width feasibility separately from native solver timings.</w:t>
+      </w:r>
+    </w:p>
+    <w:p>
+      <w:pPr>
+        <w:pStyle w:val="Heading2"/>
+        <w:spacing w:after="120" w:line="269" w:lineRule="auto"/>
+      </w:pPr>
+      <w:r>
+        <w:t>6.3 Terminal half-step guard at the RHO seam</w:t>
+      </w:r>
+    </w:p>
+    <w:p>
+      <w:pPr>
+        <w:spacing w:after="120" w:line="269" w:lineRule="auto"/>
+      </w:pPr>
+      <w:r>
+        <w:t>In free-cadence reduced mechanics, the terminal state of a RHO window is the fixed incoming state of the next window. The optional seam guard reuses the reduced internal cadence predictor at the terminal node, before the next window can change a control. With h one shooting interval and fomega the reduced angular acceleration, it constrains the Euler half-step prediction to the same speed interval as the internal guard.</w:t>
+      </w:r>
+    </w:p>
+    <w:p>
+      <w:pPr>
+        <w:spacing w:after="160"/>
+        <w:jc w:val="center"/>
+      </w:pPr>
+      <w:r>
+        <w:rPr>
+          <w:rFonts w:ascii="Cambria Math" w:hAnsi="Cambria Math"/>
+          <w:sz w:val="21"/>
+        </w:rPr>
+        <w:t>ωhalf = ωT + (h/2) fω(θT, ωT, FT, τext)</w:t>
+      </w:r>
+    </w:p>
+    <w:p>
+      <w:pPr>
+        <w:spacing w:after="120" w:line="269" w:lineRule="auto"/>
+      </w:pPr>
+      <w:r>
+        <w:t>The guard is available only with dynamic reduced mechanics and an active internal reduced-speed guard. It adds no decision variable and does not trigger a new NLP compilation. It is a local, differentiable Euler prediction—not a DOP853 replay and not a certificate for every constraint over the next cycle.</w:t>
+      </w:r>
+    </w:p>
+    <w:tbl>
+      <w:tblPr>
+        <w:tblStyle w:val="TableGrid"/>
+        <w:tblW w:type="auto" w:w="0"/>
+        <w:jc w:val="center"/>
+        <w:tblLook w:firstColumn="1" w:firstRow="1" w:lastColumn="0" w:lastRow="0" w:noHBand="0" w:noVBand="1" w:val="04A0"/>
+      </w:tblPr>
+      <w:tblGrid>
+        <w:gridCol w:w="1999"/>
+        <w:gridCol w:w="1999"/>
+        <w:gridCol w:w="1999"/>
+        <w:gridCol w:w="1999"/>
+        <w:gridCol w:w="1999"/>
+      </w:tblGrid>
+      <w:tr>
+        <w:tc>
+          <w:tcPr>
+            <w:tcW w:type="dxa" w:w="1999"/>
+            <w:shd w:fill="1F4E78"/>
+            <w:tcBorders>
+              <w:top w:val="single" w:sz="4" w:color="D9D9D9"/>
+              <w:left w:val="single" w:sz="4" w:color="D9D9D9"/>
+              <w:bottom w:val="single" w:sz="4" w:color="D9D9D9"/>
+              <w:right w:val="single" w:sz="4" w:color="D9D9D9"/>
+              <w:insideH w:val="single" w:sz="4" w:color="D9D9D9"/>
+              <w:insideV w:val="single" w:sz="4" w:color="D9D9D9"/>
+            </w:tcBorders>
+          </w:tcPr>
+          <w:p>
+            <w:r>
+              <w:rPr>
+                <w:b/>
+                <w:color w:val="FFFFFF"/>
+                <w:sz w:val="16"/>
+              </w:rPr>
+              <w:t>Terminal seam guard</w:t>
+            </w:r>
+          </w:p>
+        </w:tc>
+        <w:tc>
+          <w:tcPr>
+            <w:tcW w:type="dxa" w:w="1999"/>
+            <w:shd w:fill="1F4E78"/>
+            <w:tcBorders>
+              <w:top w:val="single" w:sz="4" w:color="D9D9D9"/>
+              <w:left w:val="single" w:sz="4" w:color="D9D9D9"/>
+              <w:bottom w:val="single" w:sz="4" w:color="D9D9D9"/>
+              <w:right w:val="single" w:sz="4" w:color="D9D9D9"/>
+              <w:insideH w:val="single" w:sz="4" w:color="D9D9D9"/>
+              <w:insideV w:val="single" w:sz="4" w:color="D9D9D9"/>
+            </w:tcBorders>
+          </w:tcPr>
+          <w:p>
+            <w:r>
+              <w:rPr>
+                <w:b/>
+                <w:color w:val="FFFFFF"/>
+                <w:sz w:val="16"/>
+              </w:rPr>
+              <w:t>Certified</w:t>
+            </w:r>
+          </w:p>
+        </w:tc>
+        <w:tc>
+          <w:tcPr>
+            <w:tcW w:type="dxa" w:w="1999"/>
+            <w:shd w:fill="1F4E78"/>
+            <w:tcBorders>
+              <w:top w:val="single" w:sz="4" w:color="D9D9D9"/>
+              <w:left w:val="single" w:sz="4" w:color="D9D9D9"/>
+              <w:bottom w:val="single" w:sz="4" w:color="D9D9D9"/>
+              <w:right w:val="single" w:sz="4" w:color="D9D9D9"/>
+              <w:insideH w:val="single" w:sz="4" w:color="D9D9D9"/>
+              <w:insideV w:val="single" w:sz="4" w:color="D9D9D9"/>
+            </w:tcBorders>
+          </w:tcPr>
+          <w:p>
+            <w:r>
+              <w:rPr>
+                <w:b/>
+                <w:color w:val="FFFFFF"/>
+                <w:sz w:val="16"/>
+              </w:rPr>
+              <w:t>Hot median / P90 s</w:t>
+            </w:r>
+          </w:p>
+        </w:tc>
+        <w:tc>
+          <w:tcPr>
+            <w:tcW w:type="dxa" w:w="1999"/>
+            <w:shd w:fill="1F4E78"/>
+            <w:tcBorders>
+              <w:top w:val="single" w:sz="4" w:color="D9D9D9"/>
+              <w:left w:val="single" w:sz="4" w:color="D9D9D9"/>
+              <w:bottom w:val="single" w:sz="4" w:color="D9D9D9"/>
+              <w:right w:val="single" w:sz="4" w:color="D9D9D9"/>
+              <w:insideH w:val="single" w:sz="4" w:color="D9D9D9"/>
+              <w:insideV w:val="single" w:sz="4" w:color="D9D9D9"/>
+            </w:tcBorders>
+          </w:tcPr>
+          <w:p>
+            <w:r>
+              <w:rPr>
+                <w:b/>
+                <w:color w:val="FFFFFF"/>
+                <w:sz w:val="16"/>
+              </w:rPr>
+              <w:t>Validated loop wall s</w:t>
+            </w:r>
+          </w:p>
+        </w:tc>
+        <w:tc>
+          <w:tcPr>
+            <w:tcW w:type="dxa" w:w="1999"/>
+            <w:shd w:fill="1F4E78"/>
+            <w:tcBorders>
+              <w:top w:val="single" w:sz="4" w:color="D9D9D9"/>
+              <w:left w:val="single" w:sz="4" w:color="D9D9D9"/>
+              <w:bottom w:val="single" w:sz="4" w:color="D9D9D9"/>
+              <w:right w:val="single" w:sz="4" w:color="D9D9D9"/>
+              <w:insideH w:val="single" w:sz="4" w:color="D9D9D9"/>
+              <w:insideV w:val="single" w:sz="4" w:color="D9D9D9"/>
+            </w:tcBorders>
+          </w:tcPr>
+          <w:p>
+            <w:r>
+              <w:rPr>
+                <w:b/>
+                <w:color w:val="FFFFFF"/>
+                <w:sz w:val="16"/>
+              </w:rPr>
+              <w:t>Interpretation</w:t>
+            </w:r>
+          </w:p>
+        </w:tc>
+      </w:tr>
+      <w:tr>
+        <w:tc>
+          <w:tcPr>
+            <w:tcW w:type="dxa" w:w="1152"/>
+            <w:tcBorders>
+              <w:top w:val="single" w:sz="4" w:color="D9D9D9"/>
+              <w:left w:val="single" w:sz="4" w:color="D9D9D9"/>
+              <w:bottom w:val="single" w:sz="4" w:color="D9D9D9"/>
+              <w:right w:val="single" w:sz="4" w:color="D9D9D9"/>
+              <w:insideH w:val="single" w:sz="4" w:color="D9D9D9"/>
+              <w:insideV w:val="single" w:sz="4" w:color="D9D9D9"/>
+            </w:tcBorders>
+            <w:vAlign w:val="center"/>
+          </w:tcPr>
+          <w:p>
+            <w:pPr>
+              <w:spacing w:after="20" w:line="240" w:lineRule="auto"/>
+            </w:pPr>
+            <w:r>
+              <w:rPr>
+                <w:sz w:val="16"/>
+              </w:rPr>
+              <w:t>Off</w:t>
+            </w:r>
+          </w:p>
+        </w:tc>
+        <w:tc>
+          <w:tcPr>
+            <w:tcW w:type="dxa" w:w="864"/>
+            <w:tcBorders>
+              <w:top w:val="single" w:sz="4" w:color="D9D9D9"/>
+              <w:left w:val="single" w:sz="4" w:color="D9D9D9"/>
+              <w:bottom w:val="single" w:sz="4" w:color="D9D9D9"/>
+              <w:right w:val="single" w:sz="4" w:color="D9D9D9"/>
+              <w:insideH w:val="single" w:sz="4" w:color="D9D9D9"/>
+              <w:insideV w:val="single" w:sz="4" w:color="D9D9D9"/>
+            </w:tcBorders>
+            <w:vAlign w:val="center"/>
+          </w:tcPr>
+          <w:p>
+            <w:pPr>
+              <w:spacing w:after="20" w:line="240" w:lineRule="auto"/>
+            </w:pPr>
+            <w:r>
+              <w:rPr>
+                <w:sz w:val="16"/>
+              </w:rPr>
+              <w:t>100/100</w:t>
+            </w:r>
+          </w:p>
+        </w:tc>
+        <w:tc>
+          <w:tcPr>
+            <w:tcW w:type="dxa" w:w="1440"/>
+            <w:tcBorders>
+              <w:top w:val="single" w:sz="4" w:color="D9D9D9"/>
+              <w:left w:val="single" w:sz="4" w:color="D9D9D9"/>
+              <w:bottom w:val="single" w:sz="4" w:color="D9D9D9"/>
+              <w:right w:val="single" w:sz="4" w:color="D9D9D9"/>
+              <w:insideH w:val="single" w:sz="4" w:color="D9D9D9"/>
+              <w:insideV w:val="single" w:sz="4" w:color="D9D9D9"/>
+            </w:tcBorders>
+            <w:vAlign w:val="center"/>
+          </w:tcPr>
+          <w:p>
+            <w:pPr>
+              <w:spacing w:after="20" w:line="240" w:lineRule="auto"/>
+            </w:pPr>
+            <w:r>
+              <w:rPr>
+                <w:sz w:val="16"/>
+              </w:rPr>
+              <w:t>0.650 / 0.898</w:t>
+            </w:r>
+          </w:p>
+        </w:tc>
+        <w:tc>
+          <w:tcPr>
+            <w:tcW w:type="dxa" w:w="1440"/>
+            <w:tcBorders>
+              <w:top w:val="single" w:sz="4" w:color="D9D9D9"/>
+              <w:left w:val="single" w:sz="4" w:color="D9D9D9"/>
+              <w:bottom w:val="single" w:sz="4" w:color="D9D9D9"/>
+              <w:right w:val="single" w:sz="4" w:color="D9D9D9"/>
+              <w:insideH w:val="single" w:sz="4" w:color="D9D9D9"/>
+              <w:insideV w:val="single" w:sz="4" w:color="D9D9D9"/>
+            </w:tcBorders>
+            <w:vAlign w:val="center"/>
+          </w:tcPr>
+          <w:p>
+            <w:pPr>
+              <w:spacing w:after="20" w:line="240" w:lineRule="auto"/>
+            </w:pPr>
+            <w:r>
+              <w:rPr>
+                <w:sz w:val="16"/>
+              </w:rPr>
+              <w:t>81.172</w:t>
+            </w:r>
+          </w:p>
+        </w:tc>
+        <w:tc>
+          <w:tcPr>
+            <w:tcW w:type="dxa" w:w="2880"/>
+            <w:tcBorders>
+              <w:top w:val="single" w:sz="4" w:color="D9D9D9"/>
+              <w:left w:val="single" w:sz="4" w:color="D9D9D9"/>
+              <w:bottom w:val="single" w:sz="4" w:color="D9D9D9"/>
+              <w:right w:val="single" w:sz="4" w:color="D9D9D9"/>
+              <w:insideH w:val="single" w:sz="4" w:color="D9D9D9"/>
+              <w:insideV w:val="single" w:sz="4" w:color="D9D9D9"/>
+            </w:tcBorders>
+            <w:vAlign w:val="center"/>
+          </w:tcPr>
+          <w:p>
+            <w:pPr>
+              <w:spacing w:after="20" w:line="240" w:lineRule="auto"/>
+            </w:pPr>
+            <w:r>
+              <w:rPr>
+                <w:sz w:val="16"/>
+              </w:rPr>
+              <w:t>Reference internal guard only</w:t>
+            </w:r>
+          </w:p>
+        </w:tc>
+      </w:tr>
+      <w:tr>
+        <w:tc>
+          <w:tcPr>
+            <w:tcW w:type="dxa" w:w="1152"/>
+            <w:tcBorders>
+              <w:top w:val="single" w:sz="4" w:color="D9D9D9"/>
+              <w:left w:val="single" w:sz="4" w:color="D9D9D9"/>
+              <w:bottom w:val="single" w:sz="4" w:color="D9D9D9"/>
+              <w:right w:val="single" w:sz="4" w:color="D9D9D9"/>
+              <w:insideH w:val="single" w:sz="4" w:color="D9D9D9"/>
+              <w:insideV w:val="single" w:sz="4" w:color="D9D9D9"/>
+            </w:tcBorders>
+            <w:vAlign w:val="center"/>
+            <w:shd w:fill="EAF2F8"/>
+          </w:tcPr>
+          <w:p>
+            <w:pPr>
+              <w:spacing w:after="20" w:line="240" w:lineRule="auto"/>
+            </w:pPr>
+            <w:r>
+              <w:rPr>
+                <w:sz w:val="16"/>
+              </w:rPr>
+              <w:t>Euler half-step on</w:t>
+            </w:r>
+          </w:p>
+        </w:tc>
+        <w:tc>
+          <w:tcPr>
+            <w:tcW w:type="dxa" w:w="864"/>
+            <w:tcBorders>
+              <w:top w:val="single" w:sz="4" w:color="D9D9D9"/>
+              <w:left w:val="single" w:sz="4" w:color="D9D9D9"/>
+              <w:bottom w:val="single" w:sz="4" w:color="D9D9D9"/>
+              <w:right w:val="single" w:sz="4" w:color="D9D9D9"/>
+              <w:insideH w:val="single" w:sz="4" w:color="D9D9D9"/>
+              <w:insideV w:val="single" w:sz="4" w:color="D9D9D9"/>
+            </w:tcBorders>
+            <w:vAlign w:val="center"/>
+            <w:shd w:fill="EAF2F8"/>
+          </w:tcPr>
+          <w:p>
+            <w:pPr>
+              <w:spacing w:after="20" w:line="240" w:lineRule="auto"/>
+            </w:pPr>
+            <w:r>
+              <w:rPr>
+                <w:sz w:val="16"/>
+              </w:rPr>
+              <w:t>100/100</w:t>
+            </w:r>
+          </w:p>
+        </w:tc>
+        <w:tc>
+          <w:tcPr>
+            <w:tcW w:type="dxa" w:w="1440"/>
+            <w:tcBorders>
+              <w:top w:val="single" w:sz="4" w:color="D9D9D9"/>
+              <w:left w:val="single" w:sz="4" w:color="D9D9D9"/>
+              <w:bottom w:val="single" w:sz="4" w:color="D9D9D9"/>
+              <w:right w:val="single" w:sz="4" w:color="D9D9D9"/>
+              <w:insideH w:val="single" w:sz="4" w:color="D9D9D9"/>
+              <w:insideV w:val="single" w:sz="4" w:color="D9D9D9"/>
+            </w:tcBorders>
+            <w:vAlign w:val="center"/>
+            <w:shd w:fill="EAF2F8"/>
+          </w:tcPr>
+          <w:p>
+            <w:pPr>
+              <w:spacing w:after="20" w:line="240" w:lineRule="auto"/>
+            </w:pPr>
+            <w:r>
+              <w:rPr>
+                <w:sz w:val="16"/>
+              </w:rPr>
+              <w:t>0.680 / 0.871</w:t>
+            </w:r>
+          </w:p>
+        </w:tc>
+        <w:tc>
+          <w:tcPr>
+            <w:tcW w:type="dxa" w:w="1440"/>
+            <w:tcBorders>
+              <w:top w:val="single" w:sz="4" w:color="D9D9D9"/>
+              <w:left w:val="single" w:sz="4" w:color="D9D9D9"/>
+              <w:bottom w:val="single" w:sz="4" w:color="D9D9D9"/>
+              <w:right w:val="single" w:sz="4" w:color="D9D9D9"/>
+              <w:insideH w:val="single" w:sz="4" w:color="D9D9D9"/>
+              <w:insideV w:val="single" w:sz="4" w:color="D9D9D9"/>
+            </w:tcBorders>
+            <w:vAlign w:val="center"/>
+            <w:shd w:fill="EAF2F8"/>
+          </w:tcPr>
+          <w:p>
+            <w:pPr>
+              <w:spacing w:after="20" w:line="240" w:lineRule="auto"/>
+            </w:pPr>
+            <w:r>
+              <w:rPr>
+                <w:sz w:val="16"/>
+              </w:rPr>
+              <w:t>80.961</w:t>
+            </w:r>
+          </w:p>
+        </w:tc>
+        <w:tc>
+          <w:tcPr>
+            <w:tcW w:type="dxa" w:w="2880"/>
+            <w:tcBorders>
+              <w:top w:val="single" w:sz="4" w:color="D9D9D9"/>
+              <w:left w:val="single" w:sz="4" w:color="D9D9D9"/>
+              <w:bottom w:val="single" w:sz="4" w:color="D9D9D9"/>
+              <w:right w:val="single" w:sz="4" w:color="D9D9D9"/>
+              <w:insideH w:val="single" w:sz="4" w:color="D9D9D9"/>
+              <w:insideV w:val="single" w:sz="4" w:color="D9D9D9"/>
+            </w:tcBorders>
+            <w:vAlign w:val="center"/>
+            <w:shd w:fill="EAF2F8"/>
+          </w:tcPr>
+          <w:p>
+            <w:pPr>
+              <w:spacing w:after="20" w:line="240" w:lineRule="auto"/>
+            </w:pPr>
+            <w:r>
+              <w:rPr>
+                <w:sz w:val="16"/>
+              </w:rPr>
+              <w:t>Timing-neutral within this small A/B</w:t>
+            </w:r>
+          </w:p>
+        </w:tc>
+      </w:tr>
+    </w:tbl>
+    <w:p>
+      <w:pPr>
+        <w:spacing w:after="120" w:line="269" w:lineRule="auto"/>
+      </w:pPr>
+      <w:r/>
+    </w:p>
+    <w:p>
+      <w:pPr>
+        <w:spacing w:after="120" w:line="269" w:lineRule="auto"/>
+      </w:pPr>
+      <w:r>
+        <w:t>This matched IPOPT/MA57/Radau-5 100-window reduced-dynamics A/B shows that the local seam constraint did not remove the observed one-second-scale operation. It does not prove a continuous-time or clinical safety gain. A separate diagnostic found an Euler prediction at 0.9h more conservative than the continuous minimum speed; extra Euler samples or a tightened margin are therefore not presented as certificates. The acceptance test remains a dense DOP853 replay spanning the seam and next applied cycle.</w:t>
+      </w:r>
+    </w:p>
+    <w:p>
+      <w:pPr>
+        <w:pStyle w:val="Heading2"/>
+        <w:spacing w:after="120" w:line="269" w:lineRule="auto"/>
+      </w:pPr>
+      <w:r>
+        <w:t>6.4 Two independent arms and adaptive muscle weights</w:t>
+      </w:r>
+    </w:p>
+    <w:p>
+      <w:pPr>
+        <w:spacing w:after="120" w:line="269" w:lineRule="auto"/>
+      </w:pPr>
+      <w:r>
+        <w:t>Two independent unilateral isokinetic OCPs are used to allocate a prescribed bilateral work budget, not to represent a coupled two-arm crank. Each arm has four Ding muscles, its own state history and pulse widths. A process-isolated coordinator alone enforces the work identity after certification:</w:t>
+      </w:r>
+    </w:p>
+    <w:p>
+      <w:pPr>
+        <w:spacing w:after="160"/>
+        <w:jc w:val="center"/>
+      </w:pPr>
+      <w:r>
+        <w:rPr>
+          <w:rFonts w:ascii="Cambria Math" w:hAnsi="Cambria Math"/>
+          <w:sz w:val="21"/>
+        </w:rPr>
+        <w:t>WR(k) + WL(k) = 2π τbar,total</w:t>
+      </w:r>
+    </w:p>
+    <w:p>
+      <w:pPr>
+        <w:spacing w:after="120" w:line="269" w:lineRule="auto"/>
+      </w:pPr>
+      <w:r>
+        <w:t>No state from one arm enters the other arm's compiled NLP. At cold start the manual split is the declared pair of equivalent mean torques. A capacity–fatigability alternative waits for one certified common cycle. From each maximum-PW isokinetic envelope, csm is a positive work opportunity and dsm the exact prescribed-force Ding capacity-decrement ratio. With Cs = sum(csm), qsm = csm/Cs, Ds = sum(qsm dsm), and Es = Wref/Ds, the initial right share is pR = ER/(ER + EL), clipped only by a declared minimum arm torque. Cs is an opportunity measure, not a feasibility certificate.</w:t>
+      </w:r>
+    </w:p>
+    <w:p>
+      <w:pPr>
+        <w:spacing w:after="120" w:line="269" w:lineRule="auto"/>
+      </w:pPr>
+      <w:r>
+        <w:t>After both arms certify a block boundary, the causal work-split reference uses pR-star = rR-to-the-gain divided by (rR-to-the-gain + rL-to-the-gain), then applies smoothing, a maximum fraction step, and the minimum arm torque. It is work-conserving and updates only every K certified cycles (K=10 by default), but it does not predict the endurance optimum.</w:t>
+      </w:r>
+    </w:p>
+    <w:p>
+      <w:pPr>
+        <w:spacing w:after="120" w:line="269" w:lineRule="auto"/>
+      </w:pPr>
+      <w:r>
+        <w:t>Each unilateral cost is sum over muscles of wm times (1 − Am/Arest,m) squared. Weight vectors have geometric mean one, relative bounds, and bounded log updates; numeric parameter binding preserves the single compiled NLP. The explicit scientific conditions are:</w:t>
+      </w:r>
+    </w:p>
+    <w:tbl>
+      <w:tblPr>
+        <w:tblStyle w:val="TableGrid"/>
+        <w:tblW w:type="auto" w:w="0"/>
+        <w:jc w:val="center"/>
+        <w:tblLook w:firstColumn="1" w:firstRow="1" w:lastColumn="0" w:lastRow="0" w:noHBand="0" w:noVBand="1" w:val="04A0"/>
+      </w:tblPr>
+      <w:tblGrid>
+        <w:gridCol w:w="2498"/>
+        <w:gridCol w:w="2498"/>
+        <w:gridCol w:w="2498"/>
+        <w:gridCol w:w="2498"/>
+      </w:tblGrid>
+      <w:tr>
+        <w:tc>
+          <w:tcPr>
+            <w:tcW w:type="dxa" w:w="2498"/>
+            <w:shd w:fill="1F4E78"/>
+            <w:tcBorders>
+              <w:top w:val="single" w:sz="4" w:color="D9D9D9"/>
+              <w:left w:val="single" w:sz="4" w:color="D9D9D9"/>
+              <w:bottom w:val="single" w:sz="4" w:color="D9D9D9"/>
+              <w:right w:val="single" w:sz="4" w:color="D9D9D9"/>
+              <w:insideH w:val="single" w:sz="4" w:color="D9D9D9"/>
+              <w:insideV w:val="single" w:sz="4" w:color="D9D9D9"/>
+            </w:tcBorders>
+          </w:tcPr>
+          <w:p>
+            <w:r>
+              <w:rPr>
+                <w:b/>
+                <w:color w:val="FFFFFF"/>
+                <w:sz w:val="16"/>
+              </w:rPr>
+              <w:t>Policy</w:t>
+            </w:r>
+          </w:p>
+        </w:tc>
+        <w:tc>
+          <w:tcPr>
+            <w:tcW w:type="dxa" w:w="2498"/>
+            <w:shd w:fill="1F4E78"/>
+            <w:tcBorders>
+              <w:top w:val="single" w:sz="4" w:color="D9D9D9"/>
+              <w:left w:val="single" w:sz="4" w:color="D9D9D9"/>
+              <w:bottom w:val="single" w:sz="4" w:color="D9D9D9"/>
+              <w:right w:val="single" w:sz="4" w:color="D9D9D9"/>
+              <w:insideH w:val="single" w:sz="4" w:color="D9D9D9"/>
+              <w:insideV w:val="single" w:sz="4" w:color="D9D9D9"/>
+            </w:tcBorders>
+          </w:tcPr>
+          <w:p>
+            <w:r>
+              <w:rPr>
+                <w:b/>
+                <w:color w:val="FFFFFF"/>
+                <w:sz w:val="16"/>
+              </w:rPr>
+              <w:t>Cold start</w:t>
+            </w:r>
+          </w:p>
+        </w:tc>
+        <w:tc>
+          <w:tcPr>
+            <w:tcW w:type="dxa" w:w="2498"/>
+            <w:shd w:fill="1F4E78"/>
+            <w:tcBorders>
+              <w:top w:val="single" w:sz="4" w:color="D9D9D9"/>
+              <w:left w:val="single" w:sz="4" w:color="D9D9D9"/>
+              <w:bottom w:val="single" w:sz="4" w:color="D9D9D9"/>
+              <w:right w:val="single" w:sz="4" w:color="D9D9D9"/>
+              <w:insideH w:val="single" w:sz="4" w:color="D9D9D9"/>
+              <w:insideV w:val="single" w:sz="4" w:color="D9D9D9"/>
+            </w:tcBorders>
+          </w:tcPr>
+          <w:p>
+            <w:r>
+              <w:rPr>
+                <w:b/>
+                <w:color w:val="FFFFFF"/>
+                <w:sz w:val="16"/>
+              </w:rPr>
+              <w:t>Certified slow update</w:t>
+            </w:r>
+          </w:p>
+        </w:tc>
+        <w:tc>
+          <w:tcPr>
+            <w:tcW w:type="dxa" w:w="2498"/>
+            <w:shd w:fill="1F4E78"/>
+            <w:tcBorders>
+              <w:top w:val="single" w:sz="4" w:color="D9D9D9"/>
+              <w:left w:val="single" w:sz="4" w:color="D9D9D9"/>
+              <w:bottom w:val="single" w:sz="4" w:color="D9D9D9"/>
+              <w:right w:val="single" w:sz="4" w:color="D9D9D9"/>
+              <w:insideH w:val="single" w:sz="4" w:color="D9D9D9"/>
+              <w:insideV w:val="single" w:sz="4" w:color="D9D9D9"/>
+            </w:tcBorders>
+          </w:tcPr>
+          <w:p>
+            <w:r>
+              <w:rPr>
+                <w:b/>
+                <w:color w:val="FFFFFF"/>
+                <w:sz w:val="16"/>
+              </w:rPr>
+              <w:t>Role</w:t>
+            </w:r>
+          </w:p>
+        </w:tc>
+      </w:tr>
+      <w:tr>
+        <w:tc>
+          <w:tcPr>
+            <w:tcW w:type="dxa" w:w="1584"/>
+            <w:tcBorders>
+              <w:top w:val="single" w:sz="4" w:color="D9D9D9"/>
+              <w:left w:val="single" w:sz="4" w:color="D9D9D9"/>
+              <w:bottom w:val="single" w:sz="4" w:color="D9D9D9"/>
+              <w:right w:val="single" w:sz="4" w:color="D9D9D9"/>
+              <w:insideH w:val="single" w:sz="4" w:color="D9D9D9"/>
+              <w:insideV w:val="single" w:sz="4" w:color="D9D9D9"/>
+            </w:tcBorders>
+            <w:vAlign w:val="center"/>
+          </w:tcPr>
+          <w:p>
+            <w:pPr>
+              <w:spacing w:after="20" w:line="240" w:lineRule="auto"/>
+            </w:pPr>
+            <w:r>
+              <w:rPr>
+                <w:sz w:val="16"/>
+              </w:rPr>
+              <w:t>Unit</w:t>
+            </w:r>
+          </w:p>
+        </w:tc>
+        <w:tc>
+          <w:tcPr>
+            <w:tcW w:type="dxa" w:w="2088"/>
+            <w:tcBorders>
+              <w:top w:val="single" w:sz="4" w:color="D9D9D9"/>
+              <w:left w:val="single" w:sz="4" w:color="D9D9D9"/>
+              <w:bottom w:val="single" w:sz="4" w:color="D9D9D9"/>
+              <w:right w:val="single" w:sz="4" w:color="D9D9D9"/>
+              <w:insideH w:val="single" w:sz="4" w:color="D9D9D9"/>
+              <w:insideV w:val="single" w:sz="4" w:color="D9D9D9"/>
+            </w:tcBorders>
+            <w:vAlign w:val="center"/>
+          </w:tcPr>
+          <w:p>
+            <w:pPr>
+              <w:spacing w:after="20" w:line="240" w:lineRule="auto"/>
+            </w:pPr>
+            <w:r>
+              <w:rPr>
+                <w:sz w:val="16"/>
+              </w:rPr>
+              <w:t>wm = 1</w:t>
+            </w:r>
+          </w:p>
+        </w:tc>
+        <w:tc>
+          <w:tcPr>
+            <w:tcW w:type="dxa" w:w="3024"/>
+            <w:tcBorders>
+              <w:top w:val="single" w:sz="4" w:color="D9D9D9"/>
+              <w:left w:val="single" w:sz="4" w:color="D9D9D9"/>
+              <w:bottom w:val="single" w:sz="4" w:color="D9D9D9"/>
+              <w:right w:val="single" w:sz="4" w:color="D9D9D9"/>
+              <w:insideH w:val="single" w:sz="4" w:color="D9D9D9"/>
+              <w:insideV w:val="single" w:sz="4" w:color="D9D9D9"/>
+            </w:tcBorders>
+            <w:vAlign w:val="center"/>
+          </w:tcPr>
+          <w:p>
+            <w:pPr>
+              <w:spacing w:after="20" w:line="240" w:lineRule="auto"/>
+            </w:pPr>
+            <w:r>
+              <w:rPr>
+                <w:sz w:val="16"/>
+              </w:rPr>
+              <w:t>None</w:t>
+            </w:r>
+          </w:p>
+        </w:tc>
+        <w:tc>
+          <w:tcPr>
+            <w:tcW w:type="dxa" w:w="1944"/>
+            <w:tcBorders>
+              <w:top w:val="single" w:sz="4" w:color="D9D9D9"/>
+              <w:left w:val="single" w:sz="4" w:color="D9D9D9"/>
+              <w:bottom w:val="single" w:sz="4" w:color="D9D9D9"/>
+              <w:right w:val="single" w:sz="4" w:color="D9D9D9"/>
+              <w:insideH w:val="single" w:sz="4" w:color="D9D9D9"/>
+              <w:insideV w:val="single" w:sz="4" w:color="D9D9D9"/>
+            </w:tcBorders>
+            <w:vAlign w:val="center"/>
+          </w:tcPr>
+          <w:p>
+            <w:pPr>
+              <w:spacing w:after="20" w:line="240" w:lineRule="auto"/>
+            </w:pPr>
+            <w:r>
+              <w:rPr>
+                <w:sz w:val="16"/>
+              </w:rPr>
+              <w:t>Neutral reference</w:t>
+            </w:r>
+          </w:p>
+        </w:tc>
+      </w:tr>
+      <w:tr>
+        <w:tc>
+          <w:tcPr>
+            <w:tcW w:type="dxa" w:w="1584"/>
+            <w:tcBorders>
+              <w:top w:val="single" w:sz="4" w:color="D9D9D9"/>
+              <w:left w:val="single" w:sz="4" w:color="D9D9D9"/>
+              <w:bottom w:val="single" w:sz="4" w:color="D9D9D9"/>
+              <w:right w:val="single" w:sz="4" w:color="D9D9D9"/>
+              <w:insideH w:val="single" w:sz="4" w:color="D9D9D9"/>
+              <w:insideV w:val="single" w:sz="4" w:color="D9D9D9"/>
+            </w:tcBorders>
+            <w:vAlign w:val="center"/>
+            <w:shd w:fill="EAF2F8"/>
+          </w:tcPr>
+          <w:p>
+            <w:pPr>
+              <w:spacing w:after="20" w:line="240" w:lineRule="auto"/>
+            </w:pPr>
+            <w:r>
+              <w:rPr>
+                <w:sz w:val="16"/>
+              </w:rPr>
+              <w:t>Physio-U</w:t>
+            </w:r>
+          </w:p>
+        </w:tc>
+        <w:tc>
+          <w:tcPr>
+            <w:tcW w:type="dxa" w:w="2088"/>
+            <w:tcBorders>
+              <w:top w:val="single" w:sz="4" w:color="D9D9D9"/>
+              <w:left w:val="single" w:sz="4" w:color="D9D9D9"/>
+              <w:bottom w:val="single" w:sz="4" w:color="D9D9D9"/>
+              <w:right w:val="single" w:sz="4" w:color="D9D9D9"/>
+              <w:insideH w:val="single" w:sz="4" w:color="D9D9D9"/>
+              <w:insideV w:val="single" w:sz="4" w:color="D9D9D9"/>
+            </w:tcBorders>
+            <w:vAlign w:val="center"/>
+            <w:shd w:fill="EAF2F8"/>
+          </w:tcPr>
+          <w:p>
+            <w:pPr>
+              <w:spacing w:after="20" w:line="240" w:lineRule="auto"/>
+            </w:pPr>
+            <w:r>
+              <w:rPr>
+                <w:sz w:val="16"/>
+              </w:rPr>
+              <w:t>Unit; no FHO/BO</w:t>
+            </w:r>
+          </w:p>
+        </w:tc>
+        <w:tc>
+          <w:tcPr>
+            <w:tcW w:type="dxa" w:w="3024"/>
+            <w:tcBorders>
+              <w:top w:val="single" w:sz="4" w:color="D9D9D9"/>
+              <w:left w:val="single" w:sz="4" w:color="D9D9D9"/>
+              <w:bottom w:val="single" w:sz="4" w:color="D9D9D9"/>
+              <w:right w:val="single" w:sz="4" w:color="D9D9D9"/>
+              <w:insideH w:val="single" w:sz="4" w:color="D9D9D9"/>
+              <w:insideV w:val="single" w:sz="4" w:color="D9D9D9"/>
+            </w:tcBorders>
+            <w:vAlign w:val="center"/>
+            <w:shd w:fill="EAF2F8"/>
+          </w:tcPr>
+          <w:p>
+            <w:pPr>
+              <w:spacing w:after="20" w:line="240" w:lineRule="auto"/>
+            </w:pPr>
+            <w:r>
+              <w:rPr>
+                <w:sz w:val="16"/>
+              </w:rPr>
+              <w:t>Mechanical Shapley credit × state-conditioned Ding force challenge</w:t>
+            </w:r>
+          </w:p>
+        </w:tc>
+        <w:tc>
+          <w:tcPr>
+            <w:tcW w:type="dxa" w:w="1944"/>
+            <w:tcBorders>
+              <w:top w:val="single" w:sz="4" w:color="D9D9D9"/>
+              <w:left w:val="single" w:sz="4" w:color="D9D9D9"/>
+              <w:bottom w:val="single" w:sz="4" w:color="D9D9D9"/>
+              <w:right w:val="single" w:sz="4" w:color="D9D9D9"/>
+              <w:insideH w:val="single" w:sz="4" w:color="D9D9D9"/>
+              <w:insideV w:val="single" w:sz="4" w:color="D9D9D9"/>
+            </w:tcBorders>
+            <w:vAlign w:val="center"/>
+            <w:shd w:fill="EAF2F8"/>
+          </w:tcPr>
+          <w:p>
+            <w:pPr>
+              <w:spacing w:after="20" w:line="240" w:lineRule="auto"/>
+            </w:pPr>
+            <w:r>
+              <w:rPr>
+                <w:sz w:val="16"/>
+              </w:rPr>
+              <w:t>Physiological hypothesis</w:t>
+            </w:r>
+          </w:p>
+        </w:tc>
+      </w:tr>
+      <w:tr>
+        <w:tc>
+          <w:tcPr>
+            <w:tcW w:type="dxa" w:w="1584"/>
+            <w:tcBorders>
+              <w:top w:val="single" w:sz="4" w:color="D9D9D9"/>
+              <w:left w:val="single" w:sz="4" w:color="D9D9D9"/>
+              <w:bottom w:val="single" w:sz="4" w:color="D9D9D9"/>
+              <w:right w:val="single" w:sz="4" w:color="D9D9D9"/>
+              <w:insideH w:val="single" w:sz="4" w:color="D9D9D9"/>
+              <w:insideV w:val="single" w:sz="4" w:color="D9D9D9"/>
+            </w:tcBorders>
+            <w:vAlign w:val="center"/>
+          </w:tcPr>
+          <w:p>
+            <w:pPr>
+              <w:spacing w:after="20" w:line="240" w:lineRule="auto"/>
+            </w:pPr>
+            <w:r>
+              <w:rPr>
+                <w:sz w:val="16"/>
+              </w:rPr>
+              <w:t>Mechanical-sensitivity-squared v1</w:t>
+            </w:r>
+          </w:p>
+        </w:tc>
+        <w:tc>
+          <w:tcPr>
+            <w:tcW w:type="dxa" w:w="2088"/>
+            <w:tcBorders>
+              <w:top w:val="single" w:sz="4" w:color="D9D9D9"/>
+              <w:left w:val="single" w:sz="4" w:color="D9D9D9"/>
+              <w:bottom w:val="single" w:sz="4" w:color="D9D9D9"/>
+              <w:right w:val="single" w:sz="4" w:color="D9D9D9"/>
+              <w:insideH w:val="single" w:sz="4" w:color="D9D9D9"/>
+              <w:insideV w:val="single" w:sz="4" w:color="D9D9D9"/>
+            </w:tcBorders>
+            <w:vAlign w:val="center"/>
+          </w:tcPr>
+          <w:p>
+            <w:pPr>
+              <w:spacing w:after="20" w:line="240" w:lineRule="auto"/>
+            </w:pPr>
+            <w:r>
+              <w:rPr>
+                <w:sz w:val="16"/>
+              </w:rPr>
+              <w:t>Unit; first update waits for live envelope</w:t>
+            </w:r>
+          </w:p>
+        </w:tc>
+        <w:tc>
+          <w:tcPr>
+            <w:tcW w:type="dxa" w:w="3024"/>
+            <w:tcBorders>
+              <w:top w:val="single" w:sz="4" w:color="D9D9D9"/>
+              <w:left w:val="single" w:sz="4" w:color="D9D9D9"/>
+              <w:bottom w:val="single" w:sz="4" w:color="D9D9D9"/>
+              <w:right w:val="single" w:sz="4" w:color="D9D9D9"/>
+              <w:insideH w:val="single" w:sz="4" w:color="D9D9D9"/>
+              <w:insideV w:val="single" w:sz="4" w:color="D9D9D9"/>
+            </w:tcBorders>
+            <w:vAlign w:val="center"/>
+          </w:tcPr>
+          <w:p>
+            <w:pPr>
+              <w:spacing w:after="20" w:line="240" w:lineRule="auto"/>
+            </w:pPr>
+            <w:r>
+              <w:rPr>
+                <w:sz w:val="16"/>
+              </w:rPr>
+              <w:t>wm target proportional to bm squared</w:t>
+            </w:r>
+          </w:p>
+        </w:tc>
+        <w:tc>
+          <w:tcPr>
+            <w:tcW w:type="dxa" w:w="1944"/>
+            <w:tcBorders>
+              <w:top w:val="single" w:sz="4" w:color="D9D9D9"/>
+              <w:left w:val="single" w:sz="4" w:color="D9D9D9"/>
+              <w:bottom w:val="single" w:sz="4" w:color="D9D9D9"/>
+              <w:right w:val="single" w:sz="4" w:color="D9D9D9"/>
+              <w:insideH w:val="single" w:sz="4" w:color="D9D9D9"/>
+              <w:insideV w:val="single" w:sz="4" w:color="D9D9D9"/>
+            </w:tcBorders>
+            <w:vAlign w:val="center"/>
+          </w:tcPr>
+          <w:p>
+            <w:pPr>
+              <w:spacing w:after="20" w:line="240" w:lineRule="auto"/>
+            </w:pPr>
+            <w:r>
+              <w:rPr>
+                <w:sz w:val="16"/>
+              </w:rPr>
+              <w:t>Mechanics-only ablation</w:t>
+            </w:r>
+          </w:p>
+        </w:tc>
+      </w:tr>
+      <w:tr>
+        <w:tc>
+          <w:tcPr>
+            <w:tcW w:type="dxa" w:w="1584"/>
+            <w:tcBorders>
+              <w:top w:val="single" w:sz="4" w:color="D9D9D9"/>
+              <w:left w:val="single" w:sz="4" w:color="D9D9D9"/>
+              <w:bottom w:val="single" w:sz="4" w:color="D9D9D9"/>
+              <w:right w:val="single" w:sz="4" w:color="D9D9D9"/>
+              <w:insideH w:val="single" w:sz="4" w:color="D9D9D9"/>
+              <w:insideV w:val="single" w:sz="4" w:color="D9D9D9"/>
+            </w:tcBorders>
+            <w:vAlign w:val="center"/>
+            <w:shd w:fill="EAF2F8"/>
+          </w:tcPr>
+          <w:p>
+            <w:pPr>
+              <w:spacing w:after="20" w:line="240" w:lineRule="auto"/>
+            </w:pPr>
+            <w:r>
+              <w:rPr>
+                <w:sz w:val="16"/>
+              </w:rPr>
+              <w:t>Capacity feedback</w:t>
+            </w:r>
+          </w:p>
+        </w:tc>
+        <w:tc>
+          <w:tcPr>
+            <w:tcW w:type="dxa" w:w="2088"/>
+            <w:tcBorders>
+              <w:top w:val="single" w:sz="4" w:color="D9D9D9"/>
+              <w:left w:val="single" w:sz="4" w:color="D9D9D9"/>
+              <w:bottom w:val="single" w:sz="4" w:color="D9D9D9"/>
+              <w:right w:val="single" w:sz="4" w:color="D9D9D9"/>
+              <w:insideH w:val="single" w:sz="4" w:color="D9D9D9"/>
+              <w:insideV w:val="single" w:sz="4" w:color="D9D9D9"/>
+            </w:tcBorders>
+            <w:vAlign w:val="center"/>
+            <w:shd w:fill="EAF2F8"/>
+          </w:tcPr>
+          <w:p>
+            <w:pPr>
+              <w:spacing w:after="20" w:line="240" w:lineRule="auto"/>
+            </w:pPr>
+            <w:r>
+              <w:rPr>
+                <w:sz w:val="16"/>
+              </w:rPr>
+              <w:t>Unit</w:t>
+            </w:r>
+          </w:p>
+        </w:tc>
+        <w:tc>
+          <w:tcPr>
+            <w:tcW w:type="dxa" w:w="3024"/>
+            <w:tcBorders>
+              <w:top w:val="single" w:sz="4" w:color="D9D9D9"/>
+              <w:left w:val="single" w:sz="4" w:color="D9D9D9"/>
+              <w:bottom w:val="single" w:sz="4" w:color="D9D9D9"/>
+              <w:right w:val="single" w:sz="4" w:color="D9D9D9"/>
+              <w:insideH w:val="single" w:sz="4" w:color="D9D9D9"/>
+              <w:insideV w:val="single" w:sz="4" w:color="D9D9D9"/>
+            </w:tcBorders>
+            <w:vAlign w:val="center"/>
+            <w:shd w:fill="EAF2F8"/>
+          </w:tcPr>
+          <w:p>
+            <w:pPr>
+              <w:spacing w:after="20" w:line="240" w:lineRule="auto"/>
+            </w:pPr>
+            <w:r>
+              <w:rPr>
+                <w:sz w:val="16"/>
+              </w:rPr>
+              <w:t>Inverse local capacity-ratio feedback</w:t>
+            </w:r>
+          </w:p>
+        </w:tc>
+        <w:tc>
+          <w:tcPr>
+            <w:tcW w:type="dxa" w:w="1944"/>
+            <w:tcBorders>
+              <w:top w:val="single" w:sz="4" w:color="D9D9D9"/>
+              <w:left w:val="single" w:sz="4" w:color="D9D9D9"/>
+              <w:bottom w:val="single" w:sz="4" w:color="D9D9D9"/>
+              <w:right w:val="single" w:sz="4" w:color="D9D9D9"/>
+              <w:insideH w:val="single" w:sz="4" w:color="D9D9D9"/>
+              <w:insideV w:val="single" w:sz="4" w:color="D9D9D9"/>
+            </w:tcBorders>
+            <w:vAlign w:val="center"/>
+            <w:shd w:fill="EAF2F8"/>
+          </w:tcPr>
+          <w:p>
+            <w:pPr>
+              <w:spacing w:after="20" w:line="240" w:lineRule="auto"/>
+            </w:pPr>
+            <w:r>
+              <w:rPr>
+                <w:sz w:val="16"/>
+              </w:rPr>
+              <w:t>Causal reference</w:t>
+            </w:r>
+          </w:p>
+        </w:tc>
+      </w:tr>
+    </w:tbl>
+    <w:p>
+      <w:pPr>
+        <w:spacing w:after="120" w:line="269" w:lineRule="auto"/>
+      </w:pPr>
+      <w:r/>
+    </w:p>
+    <w:p>
+      <w:pPr>
+        <w:spacing w:after="120" w:line="269" w:lineRule="auto"/>
+      </w:pPr>
+      <w:r>
+        <w:t>For the mechanics-only condition, bm is normalized mechanical Shapley work credit. It intentionally does not multiply alpha-A or a fatigue decrement: Ding fatigue is already propagated in A and the objective already squares normalized fatigue. Physio-U remains distinct because it does use the state-conditioned force challenge. Missing, invalid, zero-credit, out-of-domain, or uncertified envelopes hold the incumbent weights. At due boundaries, the live envelope uses the full local Ding state (Cn, F, A, Tau1, Km), pulse-width limits, reduced isokinetic geometry, and certified terminal work; the target is projected, smoothed, and log-step capped before the numeric parameter update.</w:t>
+      </w:r>
+    </w:p>
+    <w:p>
+      <w:pPr>
+        <w:pStyle w:val="Heading1"/>
+        <w:spacing w:after="120" w:line="269" w:lineRule="auto"/>
+      </w:pPr>
+      <w:r>
+        <w:t>7. References</w:t>
       </w:r>
     </w:p>
     <w:p>
@@ -611,6 +4243,14 @@
       </w:pPr>
       <w:r>
         <w:t>[6] De Groote F, Kinney AL, Rao AV, Fregly BJ. Evaluation of direct collocation optimal control problem formulations for solving the muscle redundancy problem. Annals of Biomedical Engineering. 2016;44(10):2922-2936. doi:10.1007/s10439-016-1591-9.</w:t>
+      </w:r>
+    </w:p>
+    <w:p>
+      <w:pPr>
+        <w:spacing w:after="120" w:line="269" w:lineRule="auto"/>
+      </w:pPr>
+      <w:r>
+        <w:t>[7] Co K, Puchaud P, Moissenet F, Begon M. Maximizing Task Endurance through Muscle Fatigue Minimization with Consideration of Muscle Fatigability and Task Contribution: an in-Silico FES Study of Handcycling. Manuscript. 2026.</w:t>
       </w:r>
     </w:p>
     <w:sectPr>

</xml_diff>

<commit_message>
docs: introduce prescribed kinematics early in isokinetic ablation
Separate the dynamic K0-K9 lineage from the isokinetic branch, place prescribed kinematics before SX, and report validated MX and SX comparisons without conflating historical timing records.

Regenerated the DOCX from its source and checked the staged diff.
</commit_message>
<xml_diff>
--- a/docs/scientific_appendix/appendix_acceleration_ding.docx
+++ b/docs/scientific_appendix/appendix_acceleration_ding.docx
@@ -4190,6 +4190,1198 @@
     </w:p>
     <w:p>
       <w:pPr>
+        <w:pStyle w:val="Heading2"/>
+        <w:spacing w:after="120" w:line="269" w:lineRule="auto"/>
+      </w:pPr>
+      <w:r>
+        <w:t>6.5 Isokinetic branch: prescribed kinematics before SX</w:t>
+      </w:r>
+    </w:p>
+    <w:p>
+      <w:pPr>
+        <w:spacing w:after="120" w:line="269" w:lineRule="auto"/>
+      </w:pPr>
+      <w:r>
+        <w:t>The K0–K9 table is a dynamic-mechanics lineage and remains separate: switching to a prescribed cadence changes the task, so no timing factor is propagated from it into the isokinetic branch. In that branch, prescribed kinematics is introduced immediately after reduced mechanics and before SX: K3-I0 is the reduced MX state-kinematics reference and K3-I1 eliminates the prescribed theta/omega equalities. The intended continuation is K4-I periodic calcium, K5-I SX, then K6-I onward for the compiled Hessian, compact output, and control-regularity choices. This makes the structural elimination visible early rather than presenting it as a late consequence of compilation.</w:t>
+      </w:r>
+    </w:p>
+    <w:p>
+      <w:pPr>
+        <w:spacing w:after="120" w:line="269" w:lineRule="auto"/>
+      </w:pPr>
+      <w:r>
+        <w:t>The historical reduced isokinetic transcription keeps theta and omega as NLP states and enforces theta-dot = omega-reference and omega-dot = 0. The prescribed-kinematics alternative removes these equality-constrained variables and reconstructs them at every physical Radau or IRK stage from the same clock and phase origin.</w:t>
+      </w:r>
+    </w:p>
+    <w:p>
+      <w:pPr>
+        <w:spacing w:after="160"/>
+        <w:jc w:val="center"/>
+      </w:pPr>
+      <w:r>
+        <w:rPr>
+          <w:rFonts w:ascii="Cambria Math" w:hAnsi="Cambria Math"/>
+          <w:sz w:val="21"/>
+        </w:rPr>
+        <w:t>θ(t) = θ₀ + ωref(t − t₀),     ω(t) = ωref</w:t>
+      </w:r>
+    </w:p>
+    <w:p>
+      <w:pPr>
+        <w:spacing w:after="120" w:line="269" w:lineRule="auto"/>
+      </w:pPr>
+      <w:r>
+        <w:t>For four muscles, this changes the state dimension from 23 to 21: the 20 Ding states and Eprod remain. Fibre geometry, force-length, force-velocity, passive force, inverse load, and work rate are evaluated at the reconstructed exact stage angle. No lookup-table approximation or stage interpolation is introduced. The phase origin must be transferred consistently between RHO windows; resetting local time without the matching phase would change the Hill relations.</w:t>
+      </w:r>
+    </w:p>
+    <w:p>
+      <w:pPr>
+        <w:spacing w:after="120" w:line="269" w:lineRule="auto"/>
+      </w:pPr>
+      <w:r>
+        <w:t>This is an elimination of prescribed kinematic equalities within one isokinetic transcription. It is not a comparison with the isoresistive task. Bounds, seed transfer, result summaries, and dense audits reconstruct theta and omega from the physical clock; the mode is restricted to reduced isokinetic mechanics and does not use redundant free-cadence velocity guards.</w:t>
+      </w:r>
+    </w:p>
+    <w:p>
+      <w:pPr>
+        <w:spacing w:after="120" w:line="269" w:lineRule="auto"/>
+      </w:pPr>
+      <w:r>
+        <w:t>A new controlled pre-SX MX pair was run for 100 one-cycle windows. The current isokinetic driver uses periodic calcium, so it is a K4-I realization of the K3-I0/K3-I1 design: it establishes the kinematic elimination before SX, but does not isolate an interaction with the historical Ding representation. The cases were sequential, with 16 CasADi threads and single-thread numerical libraries, without explicit CPU pinning. They differ physically only in the kinematic representation.</w:t>
+      </w:r>
+    </w:p>
+    <w:tbl>
+      <w:tblPr>
+        <w:tblStyle w:val="TableGrid"/>
+        <w:tblW w:type="auto" w:w="0"/>
+        <w:jc w:val="center"/>
+        <w:tblLook w:firstColumn="1" w:firstRow="1" w:lastColumn="0" w:lastRow="0" w:noHBand="0" w:noVBand="1" w:val="04A0"/>
+      </w:tblPr>
+      <w:tblGrid>
+        <w:gridCol w:w="1666"/>
+        <w:gridCol w:w="1666"/>
+        <w:gridCol w:w="1666"/>
+        <w:gridCol w:w="1666"/>
+        <w:gridCol w:w="1666"/>
+        <w:gridCol w:w="1666"/>
+      </w:tblGrid>
+      <w:tr>
+        <w:tc>
+          <w:tcPr>
+            <w:tcW w:type="dxa" w:w="1666"/>
+            <w:shd w:fill="1F4E78"/>
+            <w:tcBorders>
+              <w:top w:val="single" w:sz="4" w:color="D9D9D9"/>
+              <w:left w:val="single" w:sz="4" w:color="D9D9D9"/>
+              <w:bottom w:val="single" w:sz="4" w:color="D9D9D9"/>
+              <w:right w:val="single" w:sz="4" w:color="D9D9D9"/>
+              <w:insideH w:val="single" w:sz="4" w:color="D9D9D9"/>
+              <w:insideV w:val="single" w:sz="4" w:color="D9D9D9"/>
+            </w:tcBorders>
+          </w:tcPr>
+          <w:p>
+            <w:r>
+              <w:rPr>
+                <w:b/>
+                <w:color w:val="FFFFFF"/>
+                <w:sz w:val="16"/>
+              </w:rPr>
+              <w:t>Case</w:t>
+            </w:r>
+          </w:p>
+        </w:tc>
+        <w:tc>
+          <w:tcPr>
+            <w:tcW w:type="dxa" w:w="1666"/>
+            <w:shd w:fill="1F4E78"/>
+            <w:tcBorders>
+              <w:top w:val="single" w:sz="4" w:color="D9D9D9"/>
+              <w:left w:val="single" w:sz="4" w:color="D9D9D9"/>
+              <w:bottom w:val="single" w:sz="4" w:color="D9D9D9"/>
+              <w:right w:val="single" w:sz="4" w:color="D9D9D9"/>
+              <w:insideH w:val="single" w:sz="4" w:color="D9D9D9"/>
+              <w:insideV w:val="single" w:sz="4" w:color="D9D9D9"/>
+            </w:tcBorders>
+          </w:tcPr>
+          <w:p>
+            <w:r>
+              <w:rPr>
+                <w:b/>
+                <w:color w:val="FFFFFF"/>
+                <w:sz w:val="16"/>
+              </w:rPr>
+              <w:t>Representation</w:t>
+            </w:r>
+          </w:p>
+        </w:tc>
+        <w:tc>
+          <w:tcPr>
+            <w:tcW w:type="dxa" w:w="1666"/>
+            <w:shd w:fill="1F4E78"/>
+            <w:tcBorders>
+              <w:top w:val="single" w:sz="4" w:color="D9D9D9"/>
+              <w:left w:val="single" w:sz="4" w:color="D9D9D9"/>
+              <w:bottom w:val="single" w:sz="4" w:color="D9D9D9"/>
+              <w:right w:val="single" w:sz="4" w:color="D9D9D9"/>
+              <w:insideH w:val="single" w:sz="4" w:color="D9D9D9"/>
+              <w:insideV w:val="single" w:sz="4" w:color="D9D9D9"/>
+            </w:tcBorders>
+          </w:tcPr>
+          <w:p>
+            <w:r>
+              <w:rPr>
+                <w:b/>
+                <w:color w:val="FFFFFF"/>
+                <w:sz w:val="16"/>
+              </w:rPr>
+              <w:t>Certified</w:t>
+            </w:r>
+          </w:p>
+        </w:tc>
+        <w:tc>
+          <w:tcPr>
+            <w:tcW w:type="dxa" w:w="1666"/>
+            <w:shd w:fill="1F4E78"/>
+            <w:tcBorders>
+              <w:top w:val="single" w:sz="4" w:color="D9D9D9"/>
+              <w:left w:val="single" w:sz="4" w:color="D9D9D9"/>
+              <w:bottom w:val="single" w:sz="4" w:color="D9D9D9"/>
+              <w:right w:val="single" w:sz="4" w:color="D9D9D9"/>
+              <w:insideH w:val="single" w:sz="4" w:color="D9D9D9"/>
+              <w:insideV w:val="single" w:sz="4" w:color="D9D9D9"/>
+            </w:tcBorders>
+          </w:tcPr>
+          <w:p>
+            <w:r>
+              <w:rPr>
+                <w:b/>
+                <w:color w:val="FFFFFF"/>
+                <w:sz w:val="16"/>
+              </w:rPr>
+              <w:t>Hot solve median / P90</w:t>
+            </w:r>
+          </w:p>
+        </w:tc>
+        <w:tc>
+          <w:tcPr>
+            <w:tcW w:type="dxa" w:w="1666"/>
+            <w:shd w:fill="1F4E78"/>
+            <w:tcBorders>
+              <w:top w:val="single" w:sz="4" w:color="D9D9D9"/>
+              <w:left w:val="single" w:sz="4" w:color="D9D9D9"/>
+              <w:bottom w:val="single" w:sz="4" w:color="D9D9D9"/>
+              <w:right w:val="single" w:sz="4" w:color="D9D9D9"/>
+              <w:insideH w:val="single" w:sz="4" w:color="D9D9D9"/>
+              <w:insideV w:val="single" w:sz="4" w:color="D9D9D9"/>
+            </w:tcBorders>
+          </w:tcPr>
+          <w:p>
+            <w:r>
+              <w:rPr>
+                <w:b/>
+                <w:color w:val="FFFFFF"/>
+                <w:sz w:val="16"/>
+              </w:rPr>
+              <w:t>Complete RHO median / P90</w:t>
+            </w:r>
+          </w:p>
+        </w:tc>
+        <w:tc>
+          <w:tcPr>
+            <w:tcW w:type="dxa" w:w="1666"/>
+            <w:shd w:fill="1F4E78"/>
+            <w:tcBorders>
+              <w:top w:val="single" w:sz="4" w:color="D9D9D9"/>
+              <w:left w:val="single" w:sz="4" w:color="D9D9D9"/>
+              <w:bottom w:val="single" w:sz="4" w:color="D9D9D9"/>
+              <w:right w:val="single" w:sz="4" w:color="D9D9D9"/>
+              <w:insideH w:val="single" w:sz="4" w:color="D9D9D9"/>
+              <w:insideV w:val="single" w:sz="4" w:color="D9D9D9"/>
+            </w:tcBorders>
+          </w:tcPr>
+          <w:p>
+            <w:r>
+              <w:rPr>
+                <w:b/>
+                <w:color w:val="FFFFFF"/>
+                <w:sz w:val="16"/>
+              </w:rPr>
+              <w:t>NLP variables</w:t>
+            </w:r>
+          </w:p>
+        </w:tc>
+      </w:tr>
+      <w:tr>
+        <w:tc>
+          <w:tcPr>
+            <w:tcW w:type="dxa" w:w="1440"/>
+            <w:tcBorders>
+              <w:top w:val="single" w:sz="4" w:color="D9D9D9"/>
+              <w:left w:val="single" w:sz="4" w:color="D9D9D9"/>
+              <w:bottom w:val="single" w:sz="4" w:color="D9D9D9"/>
+              <w:right w:val="single" w:sz="4" w:color="D9D9D9"/>
+              <w:insideH w:val="single" w:sz="4" w:color="D9D9D9"/>
+              <w:insideV w:val="single" w:sz="4" w:color="D9D9D9"/>
+            </w:tcBorders>
+            <w:vAlign w:val="center"/>
+          </w:tcPr>
+          <w:p>
+            <w:pPr>
+              <w:spacing w:after="20" w:line="240" w:lineRule="auto"/>
+            </w:pPr>
+            <w:r>
+              <w:rPr>
+                <w:sz w:val="16"/>
+              </w:rPr>
+              <w:t>K3-I0 / K4-I reference</w:t>
+            </w:r>
+          </w:p>
+        </w:tc>
+        <w:tc>
+          <w:tcPr>
+            <w:tcW w:type="dxa" w:w="1800"/>
+            <w:tcBorders>
+              <w:top w:val="single" w:sz="4" w:color="D9D9D9"/>
+              <w:left w:val="single" w:sz="4" w:color="D9D9D9"/>
+              <w:bottom w:val="single" w:sz="4" w:color="D9D9D9"/>
+              <w:right w:val="single" w:sz="4" w:color="D9D9D9"/>
+              <w:insideH w:val="single" w:sz="4" w:color="D9D9D9"/>
+              <w:insideV w:val="single" w:sz="4" w:color="D9D9D9"/>
+            </w:tcBorders>
+            <w:vAlign w:val="center"/>
+          </w:tcPr>
+          <w:p>
+            <w:pPr>
+              <w:spacing w:after="20" w:line="240" w:lineRule="auto"/>
+            </w:pPr>
+            <w:r>
+              <w:rPr>
+                <w:sz w:val="16"/>
+              </w:rPr>
+              <w:t>MX, theta/omega states</w:t>
+            </w:r>
+          </w:p>
+        </w:tc>
+        <w:tc>
+          <w:tcPr>
+            <w:tcW w:type="dxa" w:w="936"/>
+            <w:tcBorders>
+              <w:top w:val="single" w:sz="4" w:color="D9D9D9"/>
+              <w:left w:val="single" w:sz="4" w:color="D9D9D9"/>
+              <w:bottom w:val="single" w:sz="4" w:color="D9D9D9"/>
+              <w:right w:val="single" w:sz="4" w:color="D9D9D9"/>
+              <w:insideH w:val="single" w:sz="4" w:color="D9D9D9"/>
+              <w:insideV w:val="single" w:sz="4" w:color="D9D9D9"/>
+            </w:tcBorders>
+            <w:vAlign w:val="center"/>
+          </w:tcPr>
+          <w:p>
+            <w:pPr>
+              <w:spacing w:after="20" w:line="240" w:lineRule="auto"/>
+            </w:pPr>
+            <w:r>
+              <w:rPr>
+                <w:sz w:val="16"/>
+              </w:rPr>
+              <w:t>100/100</w:t>
+            </w:r>
+          </w:p>
+        </w:tc>
+        <w:tc>
+          <w:tcPr>
+            <w:tcW w:type="dxa" w:w="1656"/>
+            <w:tcBorders>
+              <w:top w:val="single" w:sz="4" w:color="D9D9D9"/>
+              <w:left w:val="single" w:sz="4" w:color="D9D9D9"/>
+              <w:bottom w:val="single" w:sz="4" w:color="D9D9D9"/>
+              <w:right w:val="single" w:sz="4" w:color="D9D9D9"/>
+              <w:insideH w:val="single" w:sz="4" w:color="D9D9D9"/>
+              <w:insideV w:val="single" w:sz="4" w:color="D9D9D9"/>
+            </w:tcBorders>
+            <w:vAlign w:val="center"/>
+          </w:tcPr>
+          <w:p>
+            <w:pPr>
+              <w:spacing w:after="20" w:line="240" w:lineRule="auto"/>
+            </w:pPr>
+            <w:r>
+              <w:rPr>
+                <w:sz w:val="16"/>
+              </w:rPr>
+              <w:t>4.631 / 5.487 s</w:t>
+            </w:r>
+          </w:p>
+        </w:tc>
+        <w:tc>
+          <w:tcPr>
+            <w:tcW w:type="dxa" w:w="1872"/>
+            <w:tcBorders>
+              <w:top w:val="single" w:sz="4" w:color="D9D9D9"/>
+              <w:left w:val="single" w:sz="4" w:color="D9D9D9"/>
+              <w:bottom w:val="single" w:sz="4" w:color="D9D9D9"/>
+              <w:right w:val="single" w:sz="4" w:color="D9D9D9"/>
+              <w:insideH w:val="single" w:sz="4" w:color="D9D9D9"/>
+              <w:insideV w:val="single" w:sz="4" w:color="D9D9D9"/>
+            </w:tcBorders>
+            <w:vAlign w:val="center"/>
+          </w:tcPr>
+          <w:p>
+            <w:pPr>
+              <w:spacing w:after="20" w:line="240" w:lineRule="auto"/>
+            </w:pPr>
+            <w:r>
+              <w:rPr>
+                <w:sz w:val="16"/>
+              </w:rPr>
+              <w:t>4.791 / 5.655 s</w:t>
+            </w:r>
+          </w:p>
+        </w:tc>
+        <w:tc>
+          <w:tcPr>
+            <w:tcW w:type="dxa" w:w="936"/>
+            <w:tcBorders>
+              <w:top w:val="single" w:sz="4" w:color="D9D9D9"/>
+              <w:left w:val="single" w:sz="4" w:color="D9D9D9"/>
+              <w:bottom w:val="single" w:sz="4" w:color="D9D9D9"/>
+              <w:right w:val="single" w:sz="4" w:color="D9D9D9"/>
+              <w:insideH w:val="single" w:sz="4" w:color="D9D9D9"/>
+              <w:insideV w:val="single" w:sz="4" w:color="D9D9D9"/>
+            </w:tcBorders>
+            <w:vAlign w:val="center"/>
+          </w:tcPr>
+          <w:p>
+            <w:pPr>
+              <w:spacing w:after="20" w:line="240" w:lineRule="auto"/>
+            </w:pPr>
+            <w:r>
+              <w:rPr>
+                <w:sz w:val="16"/>
+              </w:rPr>
+              <w:t>4284</w:t>
+            </w:r>
+          </w:p>
+        </w:tc>
+      </w:tr>
+      <w:tr>
+        <w:tc>
+          <w:tcPr>
+            <w:tcW w:type="dxa" w:w="1440"/>
+            <w:tcBorders>
+              <w:top w:val="single" w:sz="4" w:color="D9D9D9"/>
+              <w:left w:val="single" w:sz="4" w:color="D9D9D9"/>
+              <w:bottom w:val="single" w:sz="4" w:color="D9D9D9"/>
+              <w:right w:val="single" w:sz="4" w:color="D9D9D9"/>
+              <w:insideH w:val="single" w:sz="4" w:color="D9D9D9"/>
+              <w:insideV w:val="single" w:sz="4" w:color="D9D9D9"/>
+            </w:tcBorders>
+            <w:vAlign w:val="center"/>
+            <w:shd w:fill="EAF2F8"/>
+          </w:tcPr>
+          <w:p>
+            <w:pPr>
+              <w:spacing w:after="20" w:line="240" w:lineRule="auto"/>
+            </w:pPr>
+            <w:r>
+              <w:rPr>
+                <w:sz w:val="16"/>
+              </w:rPr>
+              <w:t>K3-I1 / K4-I</w:t>
+            </w:r>
+          </w:p>
+        </w:tc>
+        <w:tc>
+          <w:tcPr>
+            <w:tcW w:type="dxa" w:w="1800"/>
+            <w:tcBorders>
+              <w:top w:val="single" w:sz="4" w:color="D9D9D9"/>
+              <w:left w:val="single" w:sz="4" w:color="D9D9D9"/>
+              <w:bottom w:val="single" w:sz="4" w:color="D9D9D9"/>
+              <w:right w:val="single" w:sz="4" w:color="D9D9D9"/>
+              <w:insideH w:val="single" w:sz="4" w:color="D9D9D9"/>
+              <w:insideV w:val="single" w:sz="4" w:color="D9D9D9"/>
+            </w:tcBorders>
+            <w:vAlign w:val="center"/>
+            <w:shd w:fill="EAF2F8"/>
+          </w:tcPr>
+          <w:p>
+            <w:pPr>
+              <w:spacing w:after="20" w:line="240" w:lineRule="auto"/>
+            </w:pPr>
+            <w:r>
+              <w:rPr>
+                <w:sz w:val="16"/>
+              </w:rPr>
+              <w:t>MX, prescribed</w:t>
+            </w:r>
+          </w:p>
+        </w:tc>
+        <w:tc>
+          <w:tcPr>
+            <w:tcW w:type="dxa" w:w="936"/>
+            <w:tcBorders>
+              <w:top w:val="single" w:sz="4" w:color="D9D9D9"/>
+              <w:left w:val="single" w:sz="4" w:color="D9D9D9"/>
+              <w:bottom w:val="single" w:sz="4" w:color="D9D9D9"/>
+              <w:right w:val="single" w:sz="4" w:color="D9D9D9"/>
+              <w:insideH w:val="single" w:sz="4" w:color="D9D9D9"/>
+              <w:insideV w:val="single" w:sz="4" w:color="D9D9D9"/>
+            </w:tcBorders>
+            <w:vAlign w:val="center"/>
+            <w:shd w:fill="EAF2F8"/>
+          </w:tcPr>
+          <w:p>
+            <w:pPr>
+              <w:spacing w:after="20" w:line="240" w:lineRule="auto"/>
+            </w:pPr>
+            <w:r>
+              <w:rPr>
+                <w:sz w:val="16"/>
+              </w:rPr>
+              <w:t>100/100</w:t>
+            </w:r>
+          </w:p>
+        </w:tc>
+        <w:tc>
+          <w:tcPr>
+            <w:tcW w:type="dxa" w:w="1656"/>
+            <w:tcBorders>
+              <w:top w:val="single" w:sz="4" w:color="D9D9D9"/>
+              <w:left w:val="single" w:sz="4" w:color="D9D9D9"/>
+              <w:bottom w:val="single" w:sz="4" w:color="D9D9D9"/>
+              <w:right w:val="single" w:sz="4" w:color="D9D9D9"/>
+              <w:insideH w:val="single" w:sz="4" w:color="D9D9D9"/>
+              <w:insideV w:val="single" w:sz="4" w:color="D9D9D9"/>
+            </w:tcBorders>
+            <w:vAlign w:val="center"/>
+            <w:shd w:fill="EAF2F8"/>
+          </w:tcPr>
+          <w:p>
+            <w:pPr>
+              <w:spacing w:after="20" w:line="240" w:lineRule="auto"/>
+            </w:pPr>
+            <w:r>
+              <w:rPr>
+                <w:sz w:val="16"/>
+              </w:rPr>
+              <w:t>3.275 / 3.917 s</w:t>
+            </w:r>
+          </w:p>
+        </w:tc>
+        <w:tc>
+          <w:tcPr>
+            <w:tcW w:type="dxa" w:w="1872"/>
+            <w:tcBorders>
+              <w:top w:val="single" w:sz="4" w:color="D9D9D9"/>
+              <w:left w:val="single" w:sz="4" w:color="D9D9D9"/>
+              <w:bottom w:val="single" w:sz="4" w:color="D9D9D9"/>
+              <w:right w:val="single" w:sz="4" w:color="D9D9D9"/>
+              <w:insideH w:val="single" w:sz="4" w:color="D9D9D9"/>
+              <w:insideV w:val="single" w:sz="4" w:color="D9D9D9"/>
+            </w:tcBorders>
+            <w:vAlign w:val="center"/>
+            <w:shd w:fill="EAF2F8"/>
+          </w:tcPr>
+          <w:p>
+            <w:pPr>
+              <w:spacing w:after="20" w:line="240" w:lineRule="auto"/>
+            </w:pPr>
+            <w:r>
+              <w:rPr>
+                <w:sz w:val="16"/>
+              </w:rPr>
+              <w:t>3.435 / 4.106 s</w:t>
+            </w:r>
+          </w:p>
+        </w:tc>
+        <w:tc>
+          <w:tcPr>
+            <w:tcW w:type="dxa" w:w="936"/>
+            <w:tcBorders>
+              <w:top w:val="single" w:sz="4" w:color="D9D9D9"/>
+              <w:left w:val="single" w:sz="4" w:color="D9D9D9"/>
+              <w:bottom w:val="single" w:sz="4" w:color="D9D9D9"/>
+              <w:right w:val="single" w:sz="4" w:color="D9D9D9"/>
+              <w:insideH w:val="single" w:sz="4" w:color="D9D9D9"/>
+              <w:insideV w:val="single" w:sz="4" w:color="D9D9D9"/>
+            </w:tcBorders>
+            <w:vAlign w:val="center"/>
+            <w:shd w:fill="EAF2F8"/>
+          </w:tcPr>
+          <w:p>
+            <w:pPr>
+              <w:spacing w:after="20" w:line="240" w:lineRule="auto"/>
+            </w:pPr>
+            <w:r>
+              <w:rPr>
+                <w:sz w:val="16"/>
+              </w:rPr>
+              <w:t>3922</w:t>
+            </w:r>
+          </w:p>
+        </w:tc>
+      </w:tr>
+    </w:tbl>
+    <w:p>
+      <w:pPr>
+        <w:spacing w:after="120" w:line="269" w:lineRule="auto"/>
+      </w:pPr>
+      <w:r/>
+    </w:p>
+    <w:p>
+      <w:pPr>
+        <w:spacing w:after="120" w:line="269" w:lineRule="auto"/>
+      </w:pPr>
+      <w:r>
+        <w:t>Eliminating the two prescribed kinematic variables removes 362 NLP variables in this transcription. It reduced the MX hot median by 29.3 percent and the complete-iteration median by 28.3 percent. Over the 100 saved windows, maximum states-versus-prescribed differences were 8.33e-6 microseconds in pulse width, 3.95e-10 rad in reconstructed angle, 7.68e-12 rad/s in speed, 6.22e-9 J in energy, and 3.09e-11 in relative capacity. Both campaigns passed 100/100 isokinetic and mechanical audits; the state-kinematics maximum effective primal infeasibility was 9.09e-7. The evidence is therefore an exact equality elimination for these trajectories, not a change to the muscle or mechanical model.</w:t>
+      </w:r>
+    </w:p>
+    <w:tbl>
+      <w:tblPr>
+        <w:tblStyle w:val="TableGrid"/>
+        <w:tblW w:type="auto" w:w="0"/>
+        <w:jc w:val="center"/>
+        <w:tblLook w:firstColumn="1" w:firstRow="1" w:lastColumn="0" w:lastRow="0" w:noHBand="0" w:noVBand="1" w:val="04A0"/>
+      </w:tblPr>
+      <w:tblGrid>
+        <w:gridCol w:w="2498"/>
+        <w:gridCol w:w="2498"/>
+        <w:gridCol w:w="2498"/>
+        <w:gridCol w:w="2498"/>
+      </w:tblGrid>
+      <w:tr>
+        <w:tc>
+          <w:tcPr>
+            <w:tcW w:type="dxa" w:w="2498"/>
+            <w:shd w:fill="1F4E78"/>
+            <w:tcBorders>
+              <w:top w:val="single" w:sz="4" w:color="D9D9D9"/>
+              <w:left w:val="single" w:sz="4" w:color="D9D9D9"/>
+              <w:bottom w:val="single" w:sz="4" w:color="D9D9D9"/>
+              <w:right w:val="single" w:sz="4" w:color="D9D9D9"/>
+              <w:insideH w:val="single" w:sz="4" w:color="D9D9D9"/>
+              <w:insideV w:val="single" w:sz="4" w:color="D9D9D9"/>
+            </w:tcBorders>
+          </w:tcPr>
+          <w:p>
+            <w:r>
+              <w:rPr>
+                <w:b/>
+                <w:color w:val="FFFFFF"/>
+                <w:sz w:val="16"/>
+              </w:rPr>
+              <w:t>Measure</w:t>
+            </w:r>
+          </w:p>
+        </w:tc>
+        <w:tc>
+          <w:tcPr>
+            <w:tcW w:type="dxa" w:w="2498"/>
+            <w:shd w:fill="1F4E78"/>
+            <w:tcBorders>
+              <w:top w:val="single" w:sz="4" w:color="D9D9D9"/>
+              <w:left w:val="single" w:sz="4" w:color="D9D9D9"/>
+              <w:bottom w:val="single" w:sz="4" w:color="D9D9D9"/>
+              <w:right w:val="single" w:sz="4" w:color="D9D9D9"/>
+              <w:insideH w:val="single" w:sz="4" w:color="D9D9D9"/>
+              <w:insideV w:val="single" w:sz="4" w:color="D9D9D9"/>
+            </w:tcBorders>
+          </w:tcPr>
+          <w:p>
+            <w:r>
+              <w:rPr>
+                <w:b/>
+                <w:color w:val="FFFFFF"/>
+                <w:sz w:val="16"/>
+              </w:rPr>
+              <w:t>State kinematics</w:t>
+            </w:r>
+          </w:p>
+        </w:tc>
+        <w:tc>
+          <w:tcPr>
+            <w:tcW w:type="dxa" w:w="2498"/>
+            <w:shd w:fill="1F4E78"/>
+            <w:tcBorders>
+              <w:top w:val="single" w:sz="4" w:color="D9D9D9"/>
+              <w:left w:val="single" w:sz="4" w:color="D9D9D9"/>
+              <w:bottom w:val="single" w:sz="4" w:color="D9D9D9"/>
+              <w:right w:val="single" w:sz="4" w:color="D9D9D9"/>
+              <w:insideH w:val="single" w:sz="4" w:color="D9D9D9"/>
+              <w:insideV w:val="single" w:sz="4" w:color="D9D9D9"/>
+            </w:tcBorders>
+          </w:tcPr>
+          <w:p>
+            <w:r>
+              <w:rPr>
+                <w:b/>
+                <w:color w:val="FFFFFF"/>
+                <w:sz w:val="16"/>
+              </w:rPr>
+              <w:t>Prescribed kinematics</w:t>
+            </w:r>
+          </w:p>
+        </w:tc>
+        <w:tc>
+          <w:tcPr>
+            <w:tcW w:type="dxa" w:w="2498"/>
+            <w:shd w:fill="1F4E78"/>
+            <w:tcBorders>
+              <w:top w:val="single" w:sz="4" w:color="D9D9D9"/>
+              <w:left w:val="single" w:sz="4" w:color="D9D9D9"/>
+              <w:bottom w:val="single" w:sz="4" w:color="D9D9D9"/>
+              <w:right w:val="single" w:sz="4" w:color="D9D9D9"/>
+              <w:insideH w:val="single" w:sz="4" w:color="D9D9D9"/>
+              <w:insideV w:val="single" w:sz="4" w:color="D9D9D9"/>
+            </w:tcBorders>
+          </w:tcPr>
+          <w:p>
+            <w:r>
+              <w:rPr>
+                <w:b/>
+                <w:color w:val="FFFFFF"/>
+                <w:sz w:val="16"/>
+              </w:rPr>
+              <w:t>Interpretation</w:t>
+            </w:r>
+          </w:p>
+        </w:tc>
+      </w:tr>
+      <w:tr>
+        <w:tc>
+          <w:tcPr>
+            <w:tcW w:type="dxa" w:w="1656"/>
+            <w:tcBorders>
+              <w:top w:val="single" w:sz="4" w:color="D9D9D9"/>
+              <w:left w:val="single" w:sz="4" w:color="D9D9D9"/>
+              <w:bottom w:val="single" w:sz="4" w:color="D9D9D9"/>
+              <w:right w:val="single" w:sz="4" w:color="D9D9D9"/>
+              <w:insideH w:val="single" w:sz="4" w:color="D9D9D9"/>
+              <w:insideV w:val="single" w:sz="4" w:color="D9D9D9"/>
+            </w:tcBorders>
+            <w:vAlign w:val="center"/>
+          </w:tcPr>
+          <w:p>
+            <w:pPr>
+              <w:spacing w:after="20" w:line="240" w:lineRule="auto"/>
+            </w:pPr>
+            <w:r>
+              <w:rPr>
+                <w:sz w:val="16"/>
+              </w:rPr>
+              <w:t>NLP states, four muscles</w:t>
+            </w:r>
+          </w:p>
+        </w:tc>
+        <w:tc>
+          <w:tcPr>
+            <w:tcW w:type="dxa" w:w="1728"/>
+            <w:tcBorders>
+              <w:top w:val="single" w:sz="4" w:color="D9D9D9"/>
+              <w:left w:val="single" w:sz="4" w:color="D9D9D9"/>
+              <w:bottom w:val="single" w:sz="4" w:color="D9D9D9"/>
+              <w:right w:val="single" w:sz="4" w:color="D9D9D9"/>
+              <w:insideH w:val="single" w:sz="4" w:color="D9D9D9"/>
+              <w:insideV w:val="single" w:sz="4" w:color="D9D9D9"/>
+            </w:tcBorders>
+            <w:vAlign w:val="center"/>
+          </w:tcPr>
+          <w:p>
+            <w:pPr>
+              <w:spacing w:after="20" w:line="240" w:lineRule="auto"/>
+            </w:pPr>
+            <w:r>
+              <w:rPr>
+                <w:sz w:val="16"/>
+              </w:rPr>
+              <w:t>23</w:t>
+            </w:r>
+          </w:p>
+        </w:tc>
+        <w:tc>
+          <w:tcPr>
+            <w:tcW w:type="dxa" w:w="2520"/>
+            <w:tcBorders>
+              <w:top w:val="single" w:sz="4" w:color="D9D9D9"/>
+              <w:left w:val="single" w:sz="4" w:color="D9D9D9"/>
+              <w:bottom w:val="single" w:sz="4" w:color="D9D9D9"/>
+              <w:right w:val="single" w:sz="4" w:color="D9D9D9"/>
+              <w:insideH w:val="single" w:sz="4" w:color="D9D9D9"/>
+              <w:insideV w:val="single" w:sz="4" w:color="D9D9D9"/>
+            </w:tcBorders>
+            <w:vAlign w:val="center"/>
+          </w:tcPr>
+          <w:p>
+            <w:pPr>
+              <w:spacing w:after="20" w:line="240" w:lineRule="auto"/>
+            </w:pPr>
+            <w:r>
+              <w:rPr>
+                <w:sz w:val="16"/>
+              </w:rPr>
+              <w:t>21</w:t>
+            </w:r>
+          </w:p>
+        </w:tc>
+        <w:tc>
+          <w:tcPr>
+            <w:tcW w:type="dxa" w:w="3672"/>
+            <w:tcBorders>
+              <w:top w:val="single" w:sz="4" w:color="D9D9D9"/>
+              <w:left w:val="single" w:sz="4" w:color="D9D9D9"/>
+              <w:bottom w:val="single" w:sz="4" w:color="D9D9D9"/>
+              <w:right w:val="single" w:sz="4" w:color="D9D9D9"/>
+              <w:insideH w:val="single" w:sz="4" w:color="D9D9D9"/>
+              <w:insideV w:val="single" w:sz="4" w:color="D9D9D9"/>
+            </w:tcBorders>
+            <w:vAlign w:val="center"/>
+          </w:tcPr>
+          <w:p>
+            <w:pPr>
+              <w:spacing w:after="20" w:line="240" w:lineRule="auto"/>
+            </w:pPr>
+            <w:r>
+              <w:rPr>
+                <w:sz w:val="16"/>
+              </w:rPr>
+              <w:t>Ding states and Eprod retained</w:t>
+            </w:r>
+          </w:p>
+        </w:tc>
+      </w:tr>
+      <w:tr>
+        <w:tc>
+          <w:tcPr>
+            <w:tcW w:type="dxa" w:w="1656"/>
+            <w:tcBorders>
+              <w:top w:val="single" w:sz="4" w:color="D9D9D9"/>
+              <w:left w:val="single" w:sz="4" w:color="D9D9D9"/>
+              <w:bottom w:val="single" w:sz="4" w:color="D9D9D9"/>
+              <w:right w:val="single" w:sz="4" w:color="D9D9D9"/>
+              <w:insideH w:val="single" w:sz="4" w:color="D9D9D9"/>
+              <w:insideV w:val="single" w:sz="4" w:color="D9D9D9"/>
+            </w:tcBorders>
+            <w:vAlign w:val="center"/>
+            <w:shd w:fill="EAF2F8"/>
+          </w:tcPr>
+          <w:p>
+            <w:pPr>
+              <w:spacing w:after="20" w:line="240" w:lineRule="auto"/>
+            </w:pPr>
+            <w:r>
+              <w:rPr>
+                <w:sz w:val="16"/>
+              </w:rPr>
+              <w:t>IPOPT hot solve, median / P90</w:t>
+            </w:r>
+          </w:p>
+        </w:tc>
+        <w:tc>
+          <w:tcPr>
+            <w:tcW w:type="dxa" w:w="1728"/>
+            <w:tcBorders>
+              <w:top w:val="single" w:sz="4" w:color="D9D9D9"/>
+              <w:left w:val="single" w:sz="4" w:color="D9D9D9"/>
+              <w:bottom w:val="single" w:sz="4" w:color="D9D9D9"/>
+              <w:right w:val="single" w:sz="4" w:color="D9D9D9"/>
+              <w:insideH w:val="single" w:sz="4" w:color="D9D9D9"/>
+              <w:insideV w:val="single" w:sz="4" w:color="D9D9D9"/>
+            </w:tcBorders>
+            <w:vAlign w:val="center"/>
+            <w:shd w:fill="EAF2F8"/>
+          </w:tcPr>
+          <w:p>
+            <w:pPr>
+              <w:spacing w:after="20" w:line="240" w:lineRule="auto"/>
+            </w:pPr>
+            <w:r>
+              <w:rPr>
+                <w:sz w:val="16"/>
+              </w:rPr>
+              <w:t>0.707 / 0.808 s</w:t>
+            </w:r>
+          </w:p>
+        </w:tc>
+        <w:tc>
+          <w:tcPr>
+            <w:tcW w:type="dxa" w:w="2520"/>
+            <w:tcBorders>
+              <w:top w:val="single" w:sz="4" w:color="D9D9D9"/>
+              <w:left w:val="single" w:sz="4" w:color="D9D9D9"/>
+              <w:bottom w:val="single" w:sz="4" w:color="D9D9D9"/>
+              <w:right w:val="single" w:sz="4" w:color="D9D9D9"/>
+              <w:insideH w:val="single" w:sz="4" w:color="D9D9D9"/>
+              <w:insideV w:val="single" w:sz="4" w:color="D9D9D9"/>
+            </w:tcBorders>
+            <w:vAlign w:val="center"/>
+            <w:shd w:fill="EAF2F8"/>
+          </w:tcPr>
+          <w:p>
+            <w:pPr>
+              <w:spacing w:after="20" w:line="240" w:lineRule="auto"/>
+            </w:pPr>
+            <w:r>
+              <w:rPr>
+                <w:sz w:val="16"/>
+              </w:rPr>
+              <w:t>0.373 / 0.439 s</w:t>
+            </w:r>
+          </w:p>
+        </w:tc>
+        <w:tc>
+          <w:tcPr>
+            <w:tcW w:type="dxa" w:w="3672"/>
+            <w:tcBorders>
+              <w:top w:val="single" w:sz="4" w:color="D9D9D9"/>
+              <w:left w:val="single" w:sz="4" w:color="D9D9D9"/>
+              <w:bottom w:val="single" w:sz="4" w:color="D9D9D9"/>
+              <w:right w:val="single" w:sz="4" w:color="D9D9D9"/>
+              <w:insideH w:val="single" w:sz="4" w:color="D9D9D9"/>
+              <w:insideV w:val="single" w:sz="4" w:color="D9D9D9"/>
+            </w:tcBorders>
+            <w:vAlign w:val="center"/>
+            <w:shd w:fill="EAF2F8"/>
+          </w:tcPr>
+          <w:p>
+            <w:pPr>
+              <w:spacing w:after="20" w:line="240" w:lineRule="auto"/>
+            </w:pPr>
+            <w:r>
+              <w:rPr>
+                <w:sz w:val="16"/>
+              </w:rPr>
+              <w:t>100 windows, MA57 SX Radau-5</w:t>
+            </w:r>
+          </w:p>
+        </w:tc>
+      </w:tr>
+      <w:tr>
+        <w:tc>
+          <w:tcPr>
+            <w:tcW w:type="dxa" w:w="1656"/>
+            <w:tcBorders>
+              <w:top w:val="single" w:sz="4" w:color="D9D9D9"/>
+              <w:left w:val="single" w:sz="4" w:color="D9D9D9"/>
+              <w:bottom w:val="single" w:sz="4" w:color="D9D9D9"/>
+              <w:right w:val="single" w:sz="4" w:color="D9D9D9"/>
+              <w:insideH w:val="single" w:sz="4" w:color="D9D9D9"/>
+              <w:insideV w:val="single" w:sz="4" w:color="D9D9D9"/>
+            </w:tcBorders>
+            <w:vAlign w:val="center"/>
+          </w:tcPr>
+          <w:p>
+            <w:pPr>
+              <w:spacing w:after="20" w:line="240" w:lineRule="auto"/>
+            </w:pPr>
+            <w:r>
+              <w:rPr>
+                <w:sz w:val="16"/>
+              </w:rPr>
+              <w:t>Complete RHO iteration, median / P90</w:t>
+            </w:r>
+          </w:p>
+        </w:tc>
+        <w:tc>
+          <w:tcPr>
+            <w:tcW w:type="dxa" w:w="1728"/>
+            <w:tcBorders>
+              <w:top w:val="single" w:sz="4" w:color="D9D9D9"/>
+              <w:left w:val="single" w:sz="4" w:color="D9D9D9"/>
+              <w:bottom w:val="single" w:sz="4" w:color="D9D9D9"/>
+              <w:right w:val="single" w:sz="4" w:color="D9D9D9"/>
+              <w:insideH w:val="single" w:sz="4" w:color="D9D9D9"/>
+              <w:insideV w:val="single" w:sz="4" w:color="D9D9D9"/>
+            </w:tcBorders>
+            <w:vAlign w:val="center"/>
+          </w:tcPr>
+          <w:p>
+            <w:pPr>
+              <w:spacing w:after="20" w:line="240" w:lineRule="auto"/>
+            </w:pPr>
+            <w:r>
+              <w:rPr>
+                <w:sz w:val="16"/>
+              </w:rPr>
+              <w:t>0.797 / 0.899 s</w:t>
+            </w:r>
+          </w:p>
+        </w:tc>
+        <w:tc>
+          <w:tcPr>
+            <w:tcW w:type="dxa" w:w="2520"/>
+            <w:tcBorders>
+              <w:top w:val="single" w:sz="4" w:color="D9D9D9"/>
+              <w:left w:val="single" w:sz="4" w:color="D9D9D9"/>
+              <w:bottom w:val="single" w:sz="4" w:color="D9D9D9"/>
+              <w:right w:val="single" w:sz="4" w:color="D9D9D9"/>
+              <w:insideH w:val="single" w:sz="4" w:color="D9D9D9"/>
+              <w:insideV w:val="single" w:sz="4" w:color="D9D9D9"/>
+            </w:tcBorders>
+            <w:vAlign w:val="center"/>
+          </w:tcPr>
+          <w:p>
+            <w:pPr>
+              <w:spacing w:after="20" w:line="240" w:lineRule="auto"/>
+            </w:pPr>
+            <w:r>
+              <w:rPr>
+                <w:sz w:val="16"/>
+              </w:rPr>
+              <w:t>0.452 / 0.519 s</w:t>
+            </w:r>
+          </w:p>
+        </w:tc>
+        <w:tc>
+          <w:tcPr>
+            <w:tcW w:type="dxa" w:w="3672"/>
+            <w:tcBorders>
+              <w:top w:val="single" w:sz="4" w:color="D9D9D9"/>
+              <w:left w:val="single" w:sz="4" w:color="D9D9D9"/>
+              <w:bottom w:val="single" w:sz="4" w:color="D9D9D9"/>
+              <w:right w:val="single" w:sz="4" w:color="D9D9D9"/>
+              <w:insideH w:val="single" w:sz="4" w:color="D9D9D9"/>
+              <w:insideV w:val="single" w:sz="4" w:color="D9D9D9"/>
+            </w:tcBorders>
+            <w:vAlign w:val="center"/>
+          </w:tcPr>
+          <w:p>
+            <w:pPr>
+              <w:spacing w:after="20" w:line="240" w:lineRule="auto"/>
+            </w:pPr>
+            <w:r>
+              <w:rPr>
+                <w:sz w:val="16"/>
+              </w:rPr>
+              <w:t>Transfer, solver, certification</w:t>
+            </w:r>
+          </w:p>
+        </w:tc>
+      </w:tr>
+      <w:tr>
+        <w:tc>
+          <w:tcPr>
+            <w:tcW w:type="dxa" w:w="1656"/>
+            <w:tcBorders>
+              <w:top w:val="single" w:sz="4" w:color="D9D9D9"/>
+              <w:left w:val="single" w:sz="4" w:color="D9D9D9"/>
+              <w:bottom w:val="single" w:sz="4" w:color="D9D9D9"/>
+              <w:right w:val="single" w:sz="4" w:color="D9D9D9"/>
+              <w:insideH w:val="single" w:sz="4" w:color="D9D9D9"/>
+              <w:insideV w:val="single" w:sz="4" w:color="D9D9D9"/>
+            </w:tcBorders>
+            <w:vAlign w:val="center"/>
+            <w:shd w:fill="EAF2F8"/>
+          </w:tcPr>
+          <w:p>
+            <w:pPr>
+              <w:spacing w:after="20" w:line="240" w:lineRule="auto"/>
+            </w:pPr>
+            <w:r>
+              <w:rPr>
+                <w:sz w:val="16"/>
+              </w:rPr>
+              <w:t>IPOPT certification</w:t>
+            </w:r>
+          </w:p>
+        </w:tc>
+        <w:tc>
+          <w:tcPr>
+            <w:tcW w:type="dxa" w:w="1728"/>
+            <w:tcBorders>
+              <w:top w:val="single" w:sz="4" w:color="D9D9D9"/>
+              <w:left w:val="single" w:sz="4" w:color="D9D9D9"/>
+              <w:bottom w:val="single" w:sz="4" w:color="D9D9D9"/>
+              <w:right w:val="single" w:sz="4" w:color="D9D9D9"/>
+              <w:insideH w:val="single" w:sz="4" w:color="D9D9D9"/>
+              <w:insideV w:val="single" w:sz="4" w:color="D9D9D9"/>
+            </w:tcBorders>
+            <w:vAlign w:val="center"/>
+            <w:shd w:fill="EAF2F8"/>
+          </w:tcPr>
+          <w:p>
+            <w:pPr>
+              <w:spacing w:after="20" w:line="240" w:lineRule="auto"/>
+            </w:pPr>
+            <w:r>
+              <w:rPr>
+                <w:sz w:val="16"/>
+              </w:rPr>
+              <w:t>100 / 100</w:t>
+            </w:r>
+          </w:p>
+        </w:tc>
+        <w:tc>
+          <w:tcPr>
+            <w:tcW w:type="dxa" w:w="2520"/>
+            <w:tcBorders>
+              <w:top w:val="single" w:sz="4" w:color="D9D9D9"/>
+              <w:left w:val="single" w:sz="4" w:color="D9D9D9"/>
+              <w:bottom w:val="single" w:sz="4" w:color="D9D9D9"/>
+              <w:right w:val="single" w:sz="4" w:color="D9D9D9"/>
+              <w:insideH w:val="single" w:sz="4" w:color="D9D9D9"/>
+              <w:insideV w:val="single" w:sz="4" w:color="D9D9D9"/>
+            </w:tcBorders>
+            <w:vAlign w:val="center"/>
+            <w:shd w:fill="EAF2F8"/>
+          </w:tcPr>
+          <w:p>
+            <w:pPr>
+              <w:spacing w:after="20" w:line="240" w:lineRule="auto"/>
+            </w:pPr>
+            <w:r>
+              <w:rPr>
+                <w:sz w:val="16"/>
+              </w:rPr>
+              <w:t>100 / 100</w:t>
+            </w:r>
+          </w:p>
+        </w:tc>
+        <w:tc>
+          <w:tcPr>
+            <w:tcW w:type="dxa" w:w="3672"/>
+            <w:tcBorders>
+              <w:top w:val="single" w:sz="4" w:color="D9D9D9"/>
+              <w:left w:val="single" w:sz="4" w:color="D9D9D9"/>
+              <w:bottom w:val="single" w:sz="4" w:color="D9D9D9"/>
+              <w:right w:val="single" w:sz="4" w:color="D9D9D9"/>
+              <w:insideH w:val="single" w:sz="4" w:color="D9D9D9"/>
+              <w:insideV w:val="single" w:sz="4" w:color="D9D9D9"/>
+            </w:tcBorders>
+            <w:vAlign w:val="center"/>
+            <w:shd w:fill="EAF2F8"/>
+          </w:tcPr>
+          <w:p>
+            <w:pPr>
+              <w:spacing w:after="20" w:line="240" w:lineRule="auto"/>
+            </w:pPr>
+            <w:r>
+              <w:rPr>
+                <w:sz w:val="16"/>
+              </w:rPr>
+              <w:t>Isokinetic and mechanical audits passed</w:t>
+            </w:r>
+          </w:p>
+        </w:tc>
+      </w:tr>
+      <w:tr>
+        <w:tc>
+          <w:tcPr>
+            <w:tcW w:type="dxa" w:w="1656"/>
+            <w:tcBorders>
+              <w:top w:val="single" w:sz="4" w:color="D9D9D9"/>
+              <w:left w:val="single" w:sz="4" w:color="D9D9D9"/>
+              <w:bottom w:val="single" w:sz="4" w:color="D9D9D9"/>
+              <w:right w:val="single" w:sz="4" w:color="D9D9D9"/>
+              <w:insideH w:val="single" w:sz="4" w:color="D9D9D9"/>
+              <w:insideV w:val="single" w:sz="4" w:color="D9D9D9"/>
+            </w:tcBorders>
+            <w:vAlign w:val="center"/>
+          </w:tcPr>
+          <w:p>
+            <w:pPr>
+              <w:spacing w:after="20" w:line="240" w:lineRule="auto"/>
+            </w:pPr>
+            <w:r>
+              <w:rPr>
+                <w:sz w:val="16"/>
+              </w:rPr>
+              <w:t>Acados prescribed IRK 4x5</w:t>
+            </w:r>
+          </w:p>
+        </w:tc>
+        <w:tc>
+          <w:tcPr>
+            <w:tcW w:type="dxa" w:w="1728"/>
+            <w:tcBorders>
+              <w:top w:val="single" w:sz="4" w:color="D9D9D9"/>
+              <w:left w:val="single" w:sz="4" w:color="D9D9D9"/>
+              <w:bottom w:val="single" w:sz="4" w:color="D9D9D9"/>
+              <w:right w:val="single" w:sz="4" w:color="D9D9D9"/>
+              <w:insideH w:val="single" w:sz="4" w:color="D9D9D9"/>
+              <w:insideV w:val="single" w:sz="4" w:color="D9D9D9"/>
+            </w:tcBorders>
+            <w:vAlign w:val="center"/>
+          </w:tcPr>
+          <w:p>
+            <w:pPr>
+              <w:spacing w:after="20" w:line="240" w:lineRule="auto"/>
+            </w:pPr>
+            <w:r>
+              <w:rPr>
+                <w:sz w:val="16"/>
+              </w:rPr>
+              <w:t>--</w:t>
+            </w:r>
+          </w:p>
+        </w:tc>
+        <w:tc>
+          <w:tcPr>
+            <w:tcW w:type="dxa" w:w="2520"/>
+            <w:tcBorders>
+              <w:top w:val="single" w:sz="4" w:color="D9D9D9"/>
+              <w:left w:val="single" w:sz="4" w:color="D9D9D9"/>
+              <w:bottom w:val="single" w:sz="4" w:color="D9D9D9"/>
+              <w:right w:val="single" w:sz="4" w:color="D9D9D9"/>
+              <w:insideH w:val="single" w:sz="4" w:color="D9D9D9"/>
+              <w:insideV w:val="single" w:sz="4" w:color="D9D9D9"/>
+            </w:tcBorders>
+            <w:vAlign w:val="center"/>
+          </w:tcPr>
+          <w:p>
+            <w:pPr>
+              <w:spacing w:after="20" w:line="240" w:lineRule="auto"/>
+            </w:pPr>
+            <w:r>
+              <w:rPr>
+                <w:sz w:val="16"/>
+              </w:rPr>
+              <w:t>100 / 100; 0.202 / 0.207 s solve</w:t>
+            </w:r>
+          </w:p>
+        </w:tc>
+        <w:tc>
+          <w:tcPr>
+            <w:tcW w:type="dxa" w:w="3672"/>
+            <w:tcBorders>
+              <w:top w:val="single" w:sz="4" w:color="D9D9D9"/>
+              <w:left w:val="single" w:sz="4" w:color="D9D9D9"/>
+              <w:bottom w:val="single" w:sz="4" w:color="D9D9D9"/>
+              <w:right w:val="single" w:sz="4" w:color="D9D9D9"/>
+              <w:insideH w:val="single" w:sz="4" w:color="D9D9D9"/>
+              <w:insideV w:val="single" w:sz="4" w:color="D9D9D9"/>
+            </w:tcBorders>
+            <w:vAlign w:val="center"/>
+          </w:tcPr>
+          <w:p>
+            <w:pPr>
+              <w:spacing w:after="20" w:line="240" w:lineRule="auto"/>
+            </w:pPr>
+            <w:r>
+              <w:rPr>
+                <w:sz w:val="16"/>
+              </w:rPr>
+              <w:t>0.236 / 0.242 s iteration; four SQP iterations; IPOPT cycle-1 seed</w:t>
+            </w:r>
+          </w:p>
+        </w:tc>
+      </w:tr>
+    </w:tbl>
+    <w:p>
+      <w:pPr>
+        <w:spacing w:after="120" w:line="269" w:lineRule="auto"/>
+      </w:pPr>
+      <w:r/>
+    </w:p>
+    <w:p>
+      <w:pPr>
+        <w:spacing w:after="120" w:line="269" w:lineRule="auto"/>
+      </w:pPr>
+      <w:r>
+        <w:t>The SX production pair is the later K5-I0/K5-I1 continuation: in the matched 100-window IPOPT campaign, prescribed kinematics reduced hot solve time by 47.2 percent and complete RHO iteration time by 43.3 percent. Objective sums differed by 7.83e-8 and executed fatigue by 7.58e-8. The maximum saved-trace differences were 1.40e-11 microseconds in pulse width, 1.83e-8 J in energy, and 3.95e-10 rad in reconstructed angle. Historical K6–K9 records remain labelled state kinematics; they must be repeated from K5-I1 before being claimed as a cumulative prescribed sequence. Acados also certified 100/100 windows, but its internal objective and fatigue differed materially from IPOPT (986.147 / 953.999 versus 1552.602 / 1502.703). Its timing establishes robust feasibility and execution, not cross-solver optimality equivalence; a matched Acados state-kinematics run or common dense replay remains required.</w:t>
+      </w:r>
+    </w:p>
+    <w:p>
+      <w:pPr>
         <w:pStyle w:val="Heading1"/>
         <w:spacing w:after="120" w:line="269" w:lineRule="auto"/>
       </w:pPr>
@@ -4199,57 +5391,78 @@
     </w:p>
     <w:p>
       <w:pPr>
-        <w:spacing w:after="120" w:line="269" w:lineRule="auto"/>
+        <w:spacing w:after="20" w:line="269" w:lineRule="auto"/>
       </w:pPr>
       <w:r>
+        <w:rPr>
+          <w:sz w:val="17"/>
+        </w:rPr>
         <w:t>[1] Ding J, Wexler AS, Binder-Macleod SA. A predictive model of fatigue in human skeletal muscles. Journal of Applied Physiology. 2000;89(4):1322-1332. doi:10.1152/jappl.2000.89.4.1322.</w:t>
       </w:r>
     </w:p>
     <w:p>
       <w:pPr>
-        <w:spacing w:after="120" w:line="269" w:lineRule="auto"/>
+        <w:spacing w:after="20" w:line="269" w:lineRule="auto"/>
       </w:pPr>
       <w:r>
+        <w:rPr>
+          <w:sz w:val="17"/>
+        </w:rPr>
         <w:t>[2] Ding J, Wexler AS, Binder-Macleod SA. A mathematical model that predicts the force-frequency relationship of human skeletal muscle. Muscle &amp; Nerve. 2002;26(4):477-485. doi:10.1002/mus.10198.</w:t>
       </w:r>
     </w:p>
     <w:p>
       <w:pPr>
-        <w:spacing w:after="120" w:line="269" w:lineRule="auto"/>
+        <w:spacing w:after="20" w:line="269" w:lineRule="auto"/>
       </w:pPr>
       <w:r>
+        <w:rPr>
+          <w:sz w:val="17"/>
+        </w:rPr>
         <w:t>[3] Ding J, Wexler AS, Binder-Macleod SA. Mathematical models for fatigue minimization during functional electrical stimulation. Journal of Electromyography and Kinesiology. 2003;13(6):575-588. doi:10.1016/S1050-6411(03)00102-0.</w:t>
       </w:r>
     </w:p>
     <w:p>
       <w:pPr>
-        <w:spacing w:after="120" w:line="269" w:lineRule="auto"/>
+        <w:spacing w:after="20" w:line="269" w:lineRule="auto"/>
       </w:pPr>
       <w:r>
+        <w:rPr>
+          <w:sz w:val="17"/>
+        </w:rPr>
         <w:t>[4] Hairer E, Wanner G. Solving Ordinary Differential Equations II: Stiff and Differential-Algebraic Problems. 2nd ed. Springer; 1996. doi:10.1007/978-3-642-05221-7.</w:t>
       </w:r>
     </w:p>
     <w:p>
       <w:pPr>
-        <w:spacing w:after="120" w:line="269" w:lineRule="auto"/>
+        <w:spacing w:after="20" w:line="269" w:lineRule="auto"/>
       </w:pPr>
       <w:r>
+        <w:rPr>
+          <w:sz w:val="17"/>
+        </w:rPr>
         <w:t>[5] Hairer E, Wanner G. Stiff differential equations solved by Radau methods. Journal of Computational and Applied Mathematics. 1999;111(1-2):93-111. doi:10.1016/S0377-0427(99)00134-X.</w:t>
       </w:r>
     </w:p>
     <w:p>
       <w:pPr>
-        <w:spacing w:after="120" w:line="269" w:lineRule="auto"/>
+        <w:spacing w:after="20" w:line="269" w:lineRule="auto"/>
       </w:pPr>
       <w:r>
+        <w:rPr>
+          <w:sz w:val="17"/>
+        </w:rPr>
         <w:t>[6] De Groote F, Kinney AL, Rao AV, Fregly BJ. Evaluation of direct collocation optimal control problem formulations for solving the muscle redundancy problem. Annals of Biomedical Engineering. 2016;44(10):2922-2936. doi:10.1007/s10439-016-1591-9.</w:t>
       </w:r>
     </w:p>
     <w:p>
       <w:pPr>
-        <w:spacing w:after="120" w:line="269" w:lineRule="auto"/>
+        <w:spacing w:after="20" w:line="269" w:lineRule="auto"/>
       </w:pPr>
       <w:r>
+        <w:rPr>
+          <w:sz w:val="17"/>
+        </w:rPr>
         <w:t>[7] Co K, Puchaud P, Moissenet F, Begon M. Maximizing Task Endurance through Muscle Fatigue Minimization with Consideration of Muscle Fatigability and Task Contribution: an in-Silico FES Study of Handcycling. Manuscript. 2026.</w:t>
       </w:r>
     </w:p>

</xml_diff>

<commit_message>
docs: archive validated prescribed local Ding subbranch
</commit_message>
<xml_diff>
--- a/docs/scientific_appendix/appendix_acceleration_ding.docx
+++ b/docs/scientific_appendix/appendix_acceleration_ding.docx
@@ -5382,6 +5382,517 @@
     </w:p>
     <w:p>
       <w:pPr>
+        <w:pStyle w:val="Heading2"/>
+        <w:spacing w:after="120" w:line="269" w:lineRule="auto"/>
+      </w:pPr>
+      <w:r>
+        <w:t>6.6 Local Ding and post reduction compiled Hessian subbranch</w:t>
+      </w:r>
+    </w:p>
+    <w:p>
+      <w:pPr>
+        <w:spacing w:after="120" w:line="269" w:lineRule="auto"/>
+      </w:pPr>
+      <w:r>
+        <w:t>This subbranch is deliberately separate from the historical K6–K9 state-kinematics continuation. K5-I1-DL denotes exact discrete reconstruction of periodic calcium and the linear Ding states Cn, Tau1, and Km inside the prescribed-kinematics Radau-5 transcription; K6-I1-DL then compiles the exact Hessian after that reduction. It retains four muscles, unit fatigue, 30 stimulations per cycle, IPOPT MA57, and one numerical thread. It is a new prescribed-kinematics condition, not a multiplicative extension of a dynamic K6–K9 timing factor.</w:t>
+      </w:r>
+    </w:p>
+    <w:tbl>
+      <w:tblPr>
+        <w:tblStyle w:val="TableGrid"/>
+        <w:tblW w:type="auto" w:w="0"/>
+        <w:jc w:val="center"/>
+        <w:tblLook w:firstColumn="1" w:firstRow="1" w:lastColumn="0" w:lastRow="0" w:noHBand="0" w:noVBand="1" w:val="04A0"/>
+      </w:tblPr>
+      <w:tblGrid>
+        <w:gridCol w:w="1666"/>
+        <w:gridCol w:w="1666"/>
+        <w:gridCol w:w="1666"/>
+        <w:gridCol w:w="1666"/>
+        <w:gridCol w:w="1666"/>
+        <w:gridCol w:w="1666"/>
+      </w:tblGrid>
+      <w:tr>
+        <w:tc>
+          <w:tcPr>
+            <w:tcW w:type="dxa" w:w="1666"/>
+            <w:shd w:fill="1F4E78"/>
+            <w:tcBorders>
+              <w:top w:val="single" w:sz="4" w:color="D9D9D9"/>
+              <w:left w:val="single" w:sz="4" w:color="D9D9D9"/>
+              <w:bottom w:val="single" w:sz="4" w:color="D9D9D9"/>
+              <w:right w:val="single" w:sz="4" w:color="D9D9D9"/>
+              <w:insideH w:val="single" w:sz="4" w:color="D9D9D9"/>
+              <w:insideV w:val="single" w:sz="4" w:color="D9D9D9"/>
+            </w:tcBorders>
+          </w:tcPr>
+          <w:p>
+            <w:r>
+              <w:rPr>
+                <w:b/>
+                <w:color w:val="FFFFFF"/>
+                <w:sz w:val="16"/>
+              </w:rPr>
+              <w:t>Case</w:t>
+            </w:r>
+          </w:p>
+        </w:tc>
+        <w:tc>
+          <w:tcPr>
+            <w:tcW w:type="dxa" w:w="1666"/>
+            <w:shd w:fill="1F4E78"/>
+            <w:tcBorders>
+              <w:top w:val="single" w:sz="4" w:color="D9D9D9"/>
+              <w:left w:val="single" w:sz="4" w:color="D9D9D9"/>
+              <w:bottom w:val="single" w:sz="4" w:color="D9D9D9"/>
+              <w:right w:val="single" w:sz="4" w:color="D9D9D9"/>
+              <w:insideH w:val="single" w:sz="4" w:color="D9D9D9"/>
+              <w:insideV w:val="single" w:sz="4" w:color="D9D9D9"/>
+            </w:tcBorders>
+          </w:tcPr>
+          <w:p>
+            <w:r>
+              <w:rPr>
+                <w:b/>
+                <w:color w:val="FFFFFF"/>
+                <w:sz w:val="16"/>
+              </w:rPr>
+              <w:t>Change from K5-I1</w:t>
+            </w:r>
+          </w:p>
+        </w:tc>
+        <w:tc>
+          <w:tcPr>
+            <w:tcW w:type="dxa" w:w="1666"/>
+            <w:shd w:fill="1F4E78"/>
+            <w:tcBorders>
+              <w:top w:val="single" w:sz="4" w:color="D9D9D9"/>
+              <w:left w:val="single" w:sz="4" w:color="D9D9D9"/>
+              <w:bottom w:val="single" w:sz="4" w:color="D9D9D9"/>
+              <w:right w:val="single" w:sz="4" w:color="D9D9D9"/>
+              <w:insideH w:val="single" w:sz="4" w:color="D9D9D9"/>
+              <w:insideV w:val="single" w:sz="4" w:color="D9D9D9"/>
+            </w:tcBorders>
+          </w:tcPr>
+          <w:p>
+            <w:r>
+              <w:rPr>
+                <w:b/>
+                <w:color w:val="FFFFFF"/>
+                <w:sz w:val="16"/>
+              </w:rPr>
+              <w:t>Autonomous certified cycles</w:t>
+            </w:r>
+          </w:p>
+        </w:tc>
+        <w:tc>
+          <w:tcPr>
+            <w:tcW w:type="dxa" w:w="1666"/>
+            <w:shd w:fill="1F4E78"/>
+            <w:tcBorders>
+              <w:top w:val="single" w:sz="4" w:color="D9D9D9"/>
+              <w:left w:val="single" w:sz="4" w:color="D9D9D9"/>
+              <w:bottom w:val="single" w:sz="4" w:color="D9D9D9"/>
+              <w:right w:val="single" w:sz="4" w:color="D9D9D9"/>
+              <w:insideH w:val="single" w:sz="4" w:color="D9D9D9"/>
+              <w:insideV w:val="single" w:sz="4" w:color="D9D9D9"/>
+            </w:tcBorders>
+          </w:tcPr>
+          <w:p>
+            <w:r>
+              <w:rPr>
+                <w:b/>
+                <w:color w:val="FFFFFF"/>
+                <w:sz w:val="16"/>
+              </w:rPr>
+              <w:t>Hot IPOPT median</w:t>
+            </w:r>
+          </w:p>
+        </w:tc>
+        <w:tc>
+          <w:tcPr>
+            <w:tcW w:type="dxa" w:w="1666"/>
+            <w:shd w:fill="1F4E78"/>
+            <w:tcBorders>
+              <w:top w:val="single" w:sz="4" w:color="D9D9D9"/>
+              <w:left w:val="single" w:sz="4" w:color="D9D9D9"/>
+              <w:bottom w:val="single" w:sz="4" w:color="D9D9D9"/>
+              <w:right w:val="single" w:sz="4" w:color="D9D9D9"/>
+              <w:insideH w:val="single" w:sz="4" w:color="D9D9D9"/>
+              <w:insideV w:val="single" w:sz="4" w:color="D9D9D9"/>
+            </w:tcBorders>
+          </w:tcPr>
+          <w:p>
+            <w:r>
+              <w:rPr>
+                <w:b/>
+                <w:color w:val="FFFFFF"/>
+                <w:sz w:val="16"/>
+              </w:rPr>
+              <w:t>Complete RHO median</w:t>
+            </w:r>
+          </w:p>
+        </w:tc>
+        <w:tc>
+          <w:tcPr>
+            <w:tcW w:type="dxa" w:w="1666"/>
+            <w:shd w:fill="1F4E78"/>
+            <w:tcBorders>
+              <w:top w:val="single" w:sz="4" w:color="D9D9D9"/>
+              <w:left w:val="single" w:sz="4" w:color="D9D9D9"/>
+              <w:bottom w:val="single" w:sz="4" w:color="D9D9D9"/>
+              <w:right w:val="single" w:sz="4" w:color="D9D9D9"/>
+              <w:insideH w:val="single" w:sz="4" w:color="D9D9D9"/>
+              <w:insideV w:val="single" w:sz="4" w:color="D9D9D9"/>
+            </w:tcBorders>
+          </w:tcPr>
+          <w:p>
+            <w:r>
+              <w:rPr>
+                <w:b/>
+                <w:color w:val="FFFFFF"/>
+                <w:sz w:val="16"/>
+              </w:rPr>
+              <w:t>Interpretation</w:t>
+            </w:r>
+          </w:p>
+        </w:tc>
+      </w:tr>
+      <w:tr>
+        <w:tc>
+          <w:tcPr>
+            <w:tcW w:type="dxa" w:w="1152"/>
+            <w:tcBorders>
+              <w:top w:val="single" w:sz="4" w:color="D9D9D9"/>
+              <w:left w:val="single" w:sz="4" w:color="D9D9D9"/>
+              <w:bottom w:val="single" w:sz="4" w:color="D9D9D9"/>
+              <w:right w:val="single" w:sz="4" w:color="D9D9D9"/>
+              <w:insideH w:val="single" w:sz="4" w:color="D9D9D9"/>
+              <w:insideV w:val="single" w:sz="4" w:color="D9D9D9"/>
+            </w:tcBorders>
+            <w:vAlign w:val="center"/>
+          </w:tcPr>
+          <w:p>
+            <w:pPr>
+              <w:spacing w:after="20" w:line="240" w:lineRule="auto"/>
+            </w:pPr>
+            <w:r>
+              <w:rPr>
+                <w:sz w:val="16"/>
+              </w:rPr>
+              <w:t>K5-I1</w:t>
+            </w:r>
+          </w:p>
+        </w:tc>
+        <w:tc>
+          <w:tcPr>
+            <w:tcW w:type="dxa" w:w="2376"/>
+            <w:tcBorders>
+              <w:top w:val="single" w:sz="4" w:color="D9D9D9"/>
+              <w:left w:val="single" w:sz="4" w:color="D9D9D9"/>
+              <w:bottom w:val="single" w:sz="4" w:color="D9D9D9"/>
+              <w:right w:val="single" w:sz="4" w:color="D9D9D9"/>
+              <w:insideH w:val="single" w:sz="4" w:color="D9D9D9"/>
+              <w:insideV w:val="single" w:sz="4" w:color="D9D9D9"/>
+            </w:tcBorders>
+            <w:vAlign w:val="center"/>
+          </w:tcPr>
+          <w:p>
+            <w:pPr>
+              <w:spacing w:after="20" w:line="240" w:lineRule="auto"/>
+            </w:pPr>
+            <w:r>
+              <w:rPr>
+                <w:sz w:val="16"/>
+              </w:rPr>
+              <w:t>Full Ding SX reference</w:t>
+            </w:r>
+          </w:p>
+        </w:tc>
+        <w:tc>
+          <w:tcPr>
+            <w:tcW w:type="dxa" w:w="1440"/>
+            <w:tcBorders>
+              <w:top w:val="single" w:sz="4" w:color="D9D9D9"/>
+              <w:left w:val="single" w:sz="4" w:color="D9D9D9"/>
+              <w:bottom w:val="single" w:sz="4" w:color="D9D9D9"/>
+              <w:right w:val="single" w:sz="4" w:color="D9D9D9"/>
+              <w:insideH w:val="single" w:sz="4" w:color="D9D9D9"/>
+              <w:insideV w:val="single" w:sz="4" w:color="D9D9D9"/>
+            </w:tcBorders>
+            <w:vAlign w:val="center"/>
+          </w:tcPr>
+          <w:p>
+            <w:pPr>
+              <w:spacing w:after="20" w:line="240" w:lineRule="auto"/>
+            </w:pPr>
+            <w:r>
+              <w:rPr>
+                <w:sz w:val="16"/>
+              </w:rPr>
+              <w:t>100/100</w:t>
+            </w:r>
+          </w:p>
+        </w:tc>
+        <w:tc>
+          <w:tcPr>
+            <w:tcW w:type="dxa" w:w="1152"/>
+            <w:tcBorders>
+              <w:top w:val="single" w:sz="4" w:color="D9D9D9"/>
+              <w:left w:val="single" w:sz="4" w:color="D9D9D9"/>
+              <w:bottom w:val="single" w:sz="4" w:color="D9D9D9"/>
+              <w:right w:val="single" w:sz="4" w:color="D9D9D9"/>
+              <w:insideH w:val="single" w:sz="4" w:color="D9D9D9"/>
+              <w:insideV w:val="single" w:sz="4" w:color="D9D9D9"/>
+            </w:tcBorders>
+            <w:vAlign w:val="center"/>
+          </w:tcPr>
+          <w:p>
+            <w:pPr>
+              <w:spacing w:after="20" w:line="240" w:lineRule="auto"/>
+            </w:pPr>
+            <w:r>
+              <w:rPr>
+                <w:sz w:val="16"/>
+              </w:rPr>
+              <w:t>0.3797 s</w:t>
+            </w:r>
+          </w:p>
+        </w:tc>
+        <w:tc>
+          <w:tcPr>
+            <w:tcW w:type="dxa" w:w="1296"/>
+            <w:tcBorders>
+              <w:top w:val="single" w:sz="4" w:color="D9D9D9"/>
+              <w:left w:val="single" w:sz="4" w:color="D9D9D9"/>
+              <w:bottom w:val="single" w:sz="4" w:color="D9D9D9"/>
+              <w:right w:val="single" w:sz="4" w:color="D9D9D9"/>
+              <w:insideH w:val="single" w:sz="4" w:color="D9D9D9"/>
+              <w:insideV w:val="single" w:sz="4" w:color="D9D9D9"/>
+            </w:tcBorders>
+            <w:vAlign w:val="center"/>
+          </w:tcPr>
+          <w:p>
+            <w:pPr>
+              <w:spacing w:after="20" w:line="240" w:lineRule="auto"/>
+            </w:pPr>
+            <w:r>
+              <w:rPr>
+                <w:sz w:val="16"/>
+              </w:rPr>
+              <w:t>0.4662 s</w:t>
+            </w:r>
+          </w:p>
+        </w:tc>
+        <w:tc>
+          <w:tcPr>
+            <w:tcW w:type="dxa" w:w="2376"/>
+            <w:tcBorders>
+              <w:top w:val="single" w:sz="4" w:color="D9D9D9"/>
+              <w:left w:val="single" w:sz="4" w:color="D9D9D9"/>
+              <w:bottom w:val="single" w:sz="4" w:color="D9D9D9"/>
+              <w:right w:val="single" w:sz="4" w:color="D9D9D9"/>
+              <w:insideH w:val="single" w:sz="4" w:color="D9D9D9"/>
+              <w:insideV w:val="single" w:sz="4" w:color="D9D9D9"/>
+            </w:tcBorders>
+            <w:vAlign w:val="center"/>
+          </w:tcPr>
+          <w:p>
+            <w:pPr>
+              <w:spacing w:after="20" w:line="240" w:lineRule="auto"/>
+            </w:pPr>
+            <w:r>
+              <w:rPr>
+                <w:sz w:val="16"/>
+              </w:rPr>
+              <w:t>Controlled propagated reference</w:t>
+            </w:r>
+          </w:p>
+        </w:tc>
+      </w:tr>
+      <w:tr>
+        <w:tc>
+          <w:tcPr>
+            <w:tcW w:type="dxa" w:w="1152"/>
+            <w:tcBorders>
+              <w:top w:val="single" w:sz="4" w:color="D9D9D9"/>
+              <w:left w:val="single" w:sz="4" w:color="D9D9D9"/>
+              <w:bottom w:val="single" w:sz="4" w:color="D9D9D9"/>
+              <w:right w:val="single" w:sz="4" w:color="D9D9D9"/>
+              <w:insideH w:val="single" w:sz="4" w:color="D9D9D9"/>
+              <w:insideV w:val="single" w:sz="4" w:color="D9D9D9"/>
+            </w:tcBorders>
+            <w:vAlign w:val="center"/>
+            <w:shd w:fill="EAF2F8"/>
+          </w:tcPr>
+          <w:p>
+            <w:pPr>
+              <w:spacing w:after="20" w:line="240" w:lineRule="auto"/>
+            </w:pPr>
+            <w:r>
+              <w:rPr>
+                <w:sz w:val="16"/>
+              </w:rPr>
+              <w:t>K6-I1-DL</w:t>
+            </w:r>
+          </w:p>
+        </w:tc>
+        <w:tc>
+          <w:tcPr>
+            <w:tcW w:type="dxa" w:w="2376"/>
+            <w:tcBorders>
+              <w:top w:val="single" w:sz="4" w:color="D9D9D9"/>
+              <w:left w:val="single" w:sz="4" w:color="D9D9D9"/>
+              <w:bottom w:val="single" w:sz="4" w:color="D9D9D9"/>
+              <w:right w:val="single" w:sz="4" w:color="D9D9D9"/>
+              <w:insideH w:val="single" w:sz="4" w:color="D9D9D9"/>
+              <w:insideV w:val="single" w:sz="4" w:color="D9D9D9"/>
+            </w:tcBorders>
+            <w:vAlign w:val="center"/>
+            <w:shd w:fill="EAF2F8"/>
+          </w:tcPr>
+          <w:p>
+            <w:pPr>
+              <w:spacing w:after="20" w:line="240" w:lineRule="auto"/>
+            </w:pPr>
+            <w:r>
+              <w:rPr>
+                <w:sz w:val="16"/>
+              </w:rPr>
+              <w:t>Discrete local Ding plus Hessian compiled after reduction</w:t>
+            </w:r>
+          </w:p>
+        </w:tc>
+        <w:tc>
+          <w:tcPr>
+            <w:tcW w:type="dxa" w:w="1440"/>
+            <w:tcBorders>
+              <w:top w:val="single" w:sz="4" w:color="D9D9D9"/>
+              <w:left w:val="single" w:sz="4" w:color="D9D9D9"/>
+              <w:bottom w:val="single" w:sz="4" w:color="D9D9D9"/>
+              <w:right w:val="single" w:sz="4" w:color="D9D9D9"/>
+              <w:insideH w:val="single" w:sz="4" w:color="D9D9D9"/>
+              <w:insideV w:val="single" w:sz="4" w:color="D9D9D9"/>
+            </w:tcBorders>
+            <w:vAlign w:val="center"/>
+            <w:shd w:fill="EAF2F8"/>
+          </w:tcPr>
+          <w:p>
+            <w:pPr>
+              <w:spacing w:after="20" w:line="240" w:lineRule="auto"/>
+            </w:pPr>
+            <w:r>
+              <w:rPr>
+                <w:sz w:val="16"/>
+              </w:rPr>
+              <w:t>100/100</w:t>
+            </w:r>
+          </w:p>
+        </w:tc>
+        <w:tc>
+          <w:tcPr>
+            <w:tcW w:type="dxa" w:w="1152"/>
+            <w:tcBorders>
+              <w:top w:val="single" w:sz="4" w:color="D9D9D9"/>
+              <w:left w:val="single" w:sz="4" w:color="D9D9D9"/>
+              <w:bottom w:val="single" w:sz="4" w:color="D9D9D9"/>
+              <w:right w:val="single" w:sz="4" w:color="D9D9D9"/>
+              <w:insideH w:val="single" w:sz="4" w:color="D9D9D9"/>
+              <w:insideV w:val="single" w:sz="4" w:color="D9D9D9"/>
+            </w:tcBorders>
+            <w:vAlign w:val="center"/>
+            <w:shd w:fill="EAF2F8"/>
+          </w:tcPr>
+          <w:p>
+            <w:pPr>
+              <w:spacing w:after="20" w:line="240" w:lineRule="auto"/>
+            </w:pPr>
+            <w:r>
+              <w:rPr>
+                <w:sz w:val="16"/>
+              </w:rPr>
+              <w:t>0.0756 s</w:t>
+            </w:r>
+          </w:p>
+        </w:tc>
+        <w:tc>
+          <w:tcPr>
+            <w:tcW w:type="dxa" w:w="1296"/>
+            <w:tcBorders>
+              <w:top w:val="single" w:sz="4" w:color="D9D9D9"/>
+              <w:left w:val="single" w:sz="4" w:color="D9D9D9"/>
+              <w:bottom w:val="single" w:sz="4" w:color="D9D9D9"/>
+              <w:right w:val="single" w:sz="4" w:color="D9D9D9"/>
+              <w:insideH w:val="single" w:sz="4" w:color="D9D9D9"/>
+              <w:insideV w:val="single" w:sz="4" w:color="D9D9D9"/>
+            </w:tcBorders>
+            <w:vAlign w:val="center"/>
+            <w:shd w:fill="EAF2F8"/>
+          </w:tcPr>
+          <w:p>
+            <w:pPr>
+              <w:spacing w:after="20" w:line="240" w:lineRule="auto"/>
+            </w:pPr>
+            <w:r>
+              <w:rPr>
+                <w:sz w:val="16"/>
+              </w:rPr>
+              <w:t>0.1715 s</w:t>
+            </w:r>
+          </w:p>
+        </w:tc>
+        <w:tc>
+          <w:tcPr>
+            <w:tcW w:type="dxa" w:w="2376"/>
+            <w:tcBorders>
+              <w:top w:val="single" w:sz="4" w:color="D9D9D9"/>
+              <w:left w:val="single" w:sz="4" w:color="D9D9D9"/>
+              <w:bottom w:val="single" w:sz="4" w:color="D9D9D9"/>
+              <w:right w:val="single" w:sz="4" w:color="D9D9D9"/>
+              <w:insideH w:val="single" w:sz="4" w:color="D9D9D9"/>
+              <w:insideV w:val="single" w:sz="4" w:color="D9D9D9"/>
+            </w:tcBorders>
+            <w:vAlign w:val="center"/>
+            <w:shd w:fill="EAF2F8"/>
+          </w:tcPr>
+          <w:p>
+            <w:pPr>
+              <w:spacing w:after="20" w:line="240" w:lineRule="auto"/>
+            </w:pPr>
+            <w:r>
+              <w:rPr>
+                <w:sz w:val="16"/>
+              </w:rPr>
+              <w:t>Prescribed local subbranch</w:t>
+            </w:r>
+          </w:p>
+        </w:tc>
+      </w:tr>
+    </w:tbl>
+    <w:p>
+      <w:pPr>
+        <w:spacing w:after="120" w:line="269" w:lineRule="auto"/>
+      </w:pPr>
+      <w:r/>
+    </w:p>
+    <w:p>
+      <w:pPr>
+        <w:spacing w:after="120" w:line="269" w:lineRule="auto"/>
+      </w:pPr>
+      <w:r>
+        <w:t>Each formulation propagated its own solution for 100 cycles; no reference input or solution was frozen. The maximum complete reduced-NLP violation was 7.39e-7 and the discrete reconstruction certificate was 7.71e-15. The native work residual was at most 1.49e-13 J and the DOP853 work mismatch was at most 0.001219 J. The reduced and full candidates are not identical minima: the largest PW difference was 13.45 microseconds, while final accumulated fatigue differed by 0.059 percent. This is a certified autonomous performance condition, not an exact trajectory-equivalence claim. Compilation is a startup cost (about 4.50 s in the measured cold case); cached reload was about 0.118 s and is excluded from hot percentiles.</w:t>
+      </w:r>
+    </w:p>
+    <w:p>
+      <w:pPr>
+        <w:spacing w:after="120" w:line="269" w:lineRule="auto"/>
+      </w:pPr>
+      <w:r>
+        <w:t>Two persistent copies of K6-I1-DL on CPU 12 and CPU 13 also certified 100/100 cycles each. Their paired NLP-to-audit median latency was 0.0920 s, with P90 0.1047 s and a 0.563 ms median barrier skew. The copies used identical muscle parameters, so this establishes process contention, cache reuse, and synchronization only; it is not a bilateral physiological-asymmetry experiment. Dense DOP853 checks include calcium, force, capacity, work, and bounds. No solver outcome is interpreted here as an endurance or physiological-failure certificate.</w:t>
+      </w:r>
+    </w:p>
+    <w:p>
+      <w:pPr>
         <w:pStyle w:val="Heading1"/>
         <w:spacing w:after="120" w:line="269" w:lineRule="auto"/>
       </w:pPr>

</xml_diff>

<commit_message>
docs: update Ding appendix and cycling identification figures
</commit_message>
<xml_diff>
--- a/docs/scientific_appendix/appendix_acceleration_ding.docx
+++ b/docs/scientific_appendix/appendix_acceleration_ding.docx
@@ -5893,6 +5893,39 @@
     </w:p>
     <w:p>
       <w:pPr>
+        <w:pStyle w:val="Heading2"/>
+        <w:spacing w:after="120" w:line="269" w:lineRule="auto"/>
+      </w:pPr>
+      <w:r>
+        <w:t>6.7 Cached numeric layout and interpolation-index dispatch</w:t>
+      </w:r>
+    </w:p>
+    <w:p>
+      <w:pPr>
+        <w:spacing w:after="120" w:line="269" w:lineRule="auto"/>
+      </w:pPr>
+      <w:r>
+        <w:t>The fixed-structure RHO rebuilds numerical vectors of bounds and initial guesses at every window. A numeric-dispatch cache now retains only immutable geometry: variable indices, node blocks, and interpolation-point indices. It rereads live bound, initial-guess, and scaling values for every call. Consequently, a new initial state, terminal bound, or workload cannot be hidden by the cache. The vectorised path supports constant, first/interior/last, linear, frame-wise, and all-point conditions; spline and custom conditions retain the scalar implementation.</w:t>
+      </w:r>
+    </w:p>
+    <w:p>
+      <w:pPr>
+        <w:spacing w:after="120" w:line="269" w:lineRule="auto"/>
+      </w:pPr>
+      <w:r>
+        <w:t>In a strict sequential 10-window A/B on the prescribed K6-I1-DL condition, cached and scalar paths produced bit-identical archived primal variables, constraints, and bound/constraint multipliers at every window. The median complete hot RHO iteration changed from 0.1802 to 0.1124 s (-37.6%). IPOPT time itself did not decrease (0.0983 versus 0.0989 s median), as expected: the change removes Python dispatch overhead rather than modifying the NLP, Hessian, MA57 factorisation, or stopping rule.</w:t>
+      </w:r>
+    </w:p>
+    <w:p>
+      <w:pPr>
+        <w:spacing w:after="120" w:line="269" w:lineRule="auto"/>
+      </w:pPr>
+      <w:r>
+        <w:t>A separate 100-window cached confirmation on CPU 13 certified 100/100 windows. Its hot complete-iteration median/P90 was 0.1086/0.1223 s, while IPOPT-only median/P90 was 0.0841/0.0976 s. The solver loop took 12.40 s for 100 windows. The full process took 100.94 s because the final scientific summary alone took 83.43 s and the post-solve mechanical audit 4.16 s; neither operation delays the next RHO decision. This is validated online-overhead evidence for this prescribed condition, not evidence of a further physiological or endurance improvement. A scalar/cached 100-window pair remains desirable to characterize run-to-run timing variability, but is not required for the exactness claim established by the archived 10-window A/B.</w:t>
+      </w:r>
+    </w:p>
+    <w:p>
+      <w:pPr>
         <w:pStyle w:val="Heading1"/>
         <w:spacing w:after="120" w:line="269" w:lineRule="auto"/>
       </w:pPr>

</xml_diff>